<commit_message>
Report: regenerate household figure as lines+CI bands to match plot-level figure (Figure 2); drop bar version
</commit_message>
<xml_diff>
--- a/Report/consolidated_report.docx
+++ b/Report/consolidated_report.docx
@@ -9917,14 +9917,14 @@
       <w:r>
         <w:drawing>
           <wp:inline>
-            <wp:extent cx="5334000" cy="2725172"/>
+            <wp:extent cx="5334000" cy="2727460"/>
             <wp:effectExtent b="0" l="0" r="0" t="0"/>
-            <wp:docPr descr="Figure 2. Household-level shares (share of households with at least one plot of each type) over time, by country, shown as bars with 95% confidence intervals; the y-axis is scaled per country. Gaps mark items not collected that round." title="" id="1" name="Picture"/>
+            <wp:docPr descr="Figure 2. Household-level shares (share of households with at least one plot of each type) over time, by country, with 95% confidence bands. Y-axis is scaled per country, as in Figure 1." title="" id="1" name="Picture"/>
             <a:graphic>
               <a:graphicData uri="http://schemas.openxmlformats.org/drawingml/2006/picture">
                 <pic:pic>
                   <pic:nvPicPr>
-                    <pic:cNvPr descr="figure_trends_hh_bars.png" id="0" name="Picture"/>
+                    <pic:cNvPr descr="figure_trends_hh.png" id="0" name="Picture"/>
                     <pic:cNvPicPr>
                       <a:picLocks noChangeArrowheads="1" noChangeAspect="1"/>
                     </pic:cNvPicPr>
@@ -9938,7 +9938,7 @@
                   <pic:spPr bwMode="auto">
                     <a:xfrm>
                       <a:off x="0" y="0"/>
-                      <a:ext cx="5334000" cy="2725172"/>
+                      <a:ext cx="5334000" cy="2727460"/>
                     </a:xfrm>
                     <a:prstGeom prst="rect">
                       <a:avLst/>
@@ -9962,7 +9962,7 @@
         <w:pStyle w:val="ImageCaption"/>
       </w:pPr>
       <w:r>
-        <w:t xml:space="preserve">Figure 2. Household-level shares (share of households with at least one plot of each type) over time, by country, shown as bars with 95% confidence intervals; the y-axis is scaled per country. Gaps mark items not collected that round.</w:t>
+        <w:t xml:space="preserve">Figure 2. Household-level shares (share of households with at least one plot of each type) over time, by country, with 95% confidence bands. Y-axis is scaled per country, as in Figure 1.</w:t>
       </w:r>
     </w:p>
     <w:p>

</xml_diff>

<commit_message>
Report amendments: title->participation, subtitle, coverage years, Fig1/Fig2 refs, figures non-floating before sec7, GitHub+license paragraph, source-file/catalog table (ESS links); area-share '-' where rented-out parcels are unmeasured (ETH 2019/22)
</commit_message>
<xml_diff>
--- a/Report/consolidated_report.docx
+++ b/Report/consolidated_report.docx
@@ -25,7 +25,7 @@
         <w:t xml:space="preserve"> </w:t>
       </w:r>
       <w:r>
-        <w:t xml:space="preserve">Descriptives</w:t>
+        <w:t xml:space="preserve">Participation</w:t>
       </w:r>
       <w:r>
         <w:t xml:space="preserve"> </w:t>
@@ -51,13 +51,13 @@
         <w:pStyle w:val="Subtitle"/>
       </w:pPr>
       <w:r>
-        <w:t xml:space="preserve">Workflow</w:t>
-      </w:r>
-      <w:r>
-        <w:t xml:space="preserve"> </w:t>
-      </w:r>
-      <w:r>
-        <w:t xml:space="preserve">summary</w:t>
+        <w:t xml:space="preserve">Reproducible</w:t>
+      </w:r>
+      <w:r>
+        <w:t xml:space="preserve"> </w:t>
+      </w:r>
+      <w:r>
+        <w:t xml:space="preserve">workflow</w:t>
       </w:r>
       <w:r>
         <w:t xml:space="preserve"> </w:t>
@@ -75,7 +75,7 @@
         <w:t xml:space="preserve"> </w:t>
       </w:r>
       <w:r>
-        <w:t xml:space="preserve">statsitics</w:t>
+        <w:t xml:space="preserve">statistics</w:t>
       </w:r>
       <w:r>
         <w:t xml:space="preserve"> </w:t>
@@ -241,7 +241,7 @@
               <w:jc w:val="left"/>
             </w:pPr>
             <w:r>
-              <w:t xml:space="preserve">Waves (years)</w:t>
+              <w:t xml:space="preserve">Survey years</w:t>
             </w:r>
           </w:p>
         </w:tc>
@@ -293,7 +293,7 @@
               <w:jc w:val="left"/>
             </w:pPr>
             <w:r>
-              <w:t xml:space="preserve">1-5 (2012-2022)</w:t>
+              <w:t xml:space="preserve">2012, 2014, 2016, 2019, 2022</w:t>
             </w:r>
           </w:p>
         </w:tc>
@@ -339,7 +339,7 @@
               <w:jc w:val="left"/>
             </w:pPr>
             <w:r>
-              <w:t xml:space="preserve">1-4 (2010-2019)</w:t>
+              <w:t xml:space="preserve">2010, 2013, 2016, 2019</w:t>
             </w:r>
           </w:p>
         </w:tc>
@@ -477,7 +477,7 @@
               <w:jc w:val="left"/>
             </w:pPr>
             <w:r>
-              <w:t xml:space="preserve">1-5 (2011-2023)</w:t>
+              <w:t xml:space="preserve">2011, 2013, 2016, 2019, 2023</w:t>
             </w:r>
           </w:p>
         </w:tc>
@@ -523,7 +523,7 @@
               <w:jc w:val="left"/>
             </w:pPr>
             <w:r>
-              <w:t xml:space="preserve">1-5 (2009-2019)</w:t>
+              <w:t xml:space="preserve">2009, 2011, 2013, 2015, 2019</w:t>
             </w:r>
           </w:p>
         </w:tc>
@@ -569,7 +569,7 @@
               <w:jc w:val="left"/>
             </w:pPr>
             <w:r>
-              <w:t xml:space="preserve">1-5, 7, 8 (2009-2019)</w:t>
+              <w:t xml:space="preserve">2009, 2010, 2011, 2013, 2015, 2018, 2019</w:t>
             </w:r>
           </w:p>
         </w:tc>
@@ -7651,7 +7651,7 @@
         <w:t xml:space="preserve">-</w:t>
       </w:r>
       <w:r>
-        <w:t xml:space="preserve">) denotes an item not collected that round.</w:t>
+        <w:t xml:space="preserve">) denotes an item not collected that round; for rented-out it can also denote that the rented-out parcels carry no measured area (they are uncultivated, so no field area is recorded - e.g. Ethiopia 2019, 2022), making the area share undefined rather than zero.</w:t>
       </w:r>
     </w:p>
     <w:tbl>
@@ -7989,7 +7989,7 @@
               <w:jc w:val="left"/>
             </w:pPr>
             <w:r>
-              <w:t xml:space="preserve">0.000</w:t>
+              <w:t xml:space="preserve">-</w:t>
             </w:r>
           </w:p>
         </w:tc>
@@ -8049,7 +8049,7 @@
               <w:jc w:val="left"/>
             </w:pPr>
             <w:r>
-              <w:t xml:space="preserve">0.000</w:t>
+              <w:t xml:space="preserve">-</w:t>
             </w:r>
           </w:p>
         </w:tc>
@@ -9970,7 +9970,7 @@
         <w:pStyle w:val="BodyText"/>
       </w:pPr>
       <w:r>
-        <w:t xml:space="preserve">With the caveat that waves are not strictly comparable (due to instrument changes, panel attrition, and the sample redesign breaks flagged in Section 4 and the appendix), we may compare levels across time to see if any strong patterns are detectable. For the most part, the patterns are too noisy to ascribe much of a unified story to. Rented land is only increasing consistently over the period observed in Zambia, although at very low base levels. Tanzania shows growth between the first and last waves observed, but not consistently across intervening waves. Ethiopia and Malawi are essentially flat. Altogether, there is not much of a consistent growth story observable in these data.</w:t>
+        <w:t xml:space="preserve">Figures 1 and 2 present these shares over time at the plot and household levels, respectively. With the caveat that waves are not strictly comparable (due to instrument changes, panel attrition, and the sample redesign breaks flagged in Section 4 and the appendix), we may compare levels across time to see if any strong patterns are detectable. For the most part, the patterns are too noisy to ascribe much of a unified story to. Rented land is only increasing consistently over the period observed in Zambia, although at very low base levels. Tanzania shows growth between the first and last waves observed, but not consistently across intervening waves. Ethiopia and Malawi are essentially flat. Altogether, there is not much of a consistent growth story observable in these data.</w:t>
       </w:r>
     </w:p>
     <w:p>
@@ -10077,39 +10077,1756 @@
     </w:p>
     <w:p>
       <w:pPr>
-        <w:pStyle w:val="BlockText"/>
+        <w:pStyle w:val="BodyText"/>
       </w:pPr>
       <w:r>
-        <w:rPr>
-          <w:b/>
-        </w:rPr>
-        <w:t xml:space="preserve">[DRAFT - Jordan]</w:t>
-      </w:r>
-      <w:r>
-        <w:t xml:space="preserve"> </w:t>
-      </w:r>
-      <w:r>
-        <w:rPr>
-          <w:i/>
-        </w:rPr>
-        <w:t xml:space="preserve">Optional: a sentence pointing readers to the GitHub repo URL and the license.</w:t>
+        <w:t xml:space="preserve">All code, reference documentation, and the outputs reproduced here are available in</w:t>
+      </w:r>
+      <w:r>
+        <w:t xml:space="preserve"> </w:t>
+      </w:r>
+      <w:r>
+        <w:t xml:space="preserve">the project’s public GitHub repository,</w:t>
+      </w:r>
+      <w:r>
+        <w:t xml:space="preserve"> </w:t>
+      </w:r>
+      <w:hyperlink r:id="rId34">
+        <w:r>
+          <w:rPr>
+            <w:rStyle w:val="Hyperlink"/>
+          </w:rPr>
+          <w:t xml:space="preserve">https://github.com/chamb244/ssa-land-rental</w:t>
+        </w:r>
+      </w:hyperlink>
+      <w:r>
+        <w:t xml:space="preserve">.</w:t>
+      </w:r>
+      <w:r>
+        <w:t xml:space="preserve"> </w:t>
+      </w:r>
+      <w:r>
+        <w:t xml:space="preserve">The repository contains the country-by-country extractors, the pooled-dataset build</w:t>
+      </w:r>
+      <w:r>
+        <w:t xml:space="preserve"> </w:t>
+      </w:r>
+      <w:r>
+        <w:t xml:space="preserve">(</w:t>
+      </w:r>
+      <w:r>
+        <w:rPr>
+          <w:rStyle w:val="VerbatimChar"/>
+        </w:rPr>
+        <w:t xml:space="preserve">MASTER.do</w:t>
+      </w:r>
+      <w:r>
+        <w:t xml:space="preserve">), the table and figure generators, this report and its build script, and</w:t>
+      </w:r>
+      <w:r>
+        <w:t xml:space="preserve"> </w:t>
+      </w:r>
+      <w:r>
+        <w:t xml:space="preserve">the full variable-provenance reference. Code is released under the MIT License and the</w:t>
+      </w:r>
+      <w:r>
+        <w:t xml:space="preserve"> </w:t>
+      </w:r>
+      <w:r>
+        <w:t xml:space="preserve">accompanying documentation under CC-BY-4.0; the survey microdata themselves are not</w:t>
+      </w:r>
+      <w:r>
+        <w:t xml:space="preserve"> </w:t>
+      </w:r>
+      <w:r>
+        <w:t xml:space="preserve">redistributed and must be obtained from the providers below.</w:t>
       </w:r>
     </w:p>
     <w:p>
       <w:pPr>
-        <w:pStyle w:val="Heading1"/>
+        <w:pStyle w:val="Heading2"/>
       </w:pPr>
-      <w:bookmarkStart w:id="34" w:name="Xa67191bf5e36bc64804d7ea38af21a2ea39cd14"/>
-      <w:r>
-        <w:t xml:space="preserve">Appendix A. Per-country variable provenance</w:t>
-      </w:r>
-      <w:bookmarkEnd w:id="34"/>
+      <w:bookmarkStart w:id="35" w:name="Xab397406ce7396feb7832789a7687e4b3e97f94"/>
+      <w:r>
+        <w:t xml:space="preserve">Main source file and catalog link, by survey wave</w:t>
+      </w:r>
+      <w:bookmarkEnd w:id="35"/>
     </w:p>
     <w:p>
       <w:pPr>
         <w:pStyle w:val="FirstParagraph"/>
       </w:pPr>
       <w:r>
+        <w:t xml:space="preserve">The table gives, for each survey wave, the primary land/tenure roster file the workflow</w:t>
+      </w:r>
+      <w:r>
+        <w:t xml:space="preserve"> </w:t>
+      </w:r>
+      <w:r>
+        <w:t xml:space="preserve">reads (the complete per-wave file list is in Appendix A). Catalog links are shown where a</w:t>
+      </w:r>
+      <w:r>
+        <w:t xml:space="preserve"> </w:t>
+      </w:r>
+      <w:r>
+        <w:t xml:space="preserve">stable URL is available; entries marked</w:t>
+      </w:r>
+      <w:r>
+        <w:t xml:space="preserve"> </w:t>
+      </w:r>
+      <w:r>
+        <w:rPr>
+          <w:i/>
+        </w:rPr>
+        <w:t xml:space="preserve">(pending)</w:t>
+      </w:r>
+      <w:r>
+        <w:t xml:space="preserve"> </w:t>
+      </w:r>
+      <w:r>
+        <w:t xml:space="preserve">can be located in the World Bank</w:t>
+      </w:r>
+      <w:r>
+        <w:t xml:space="preserve"> </w:t>
+      </w:r>
+      <w:r>
+        <w:t xml:space="preserve">Microdata Library (LSMS-ISA) or, for Zambia, obtained from IAPRI.</w:t>
+      </w:r>
+    </w:p>
+    <w:tbl>
+      <w:tblPr>
+        <w:tblStyle w:val="Table"/>
+        <w:tblW w:type="pct" w:w="0.0"/>
+        <w:tblLook w:firstRow="1"/>
+      </w:tblPr>
+      <w:tblGrid/>
+      <w:tr>
+        <w:trPr>
+          <w:cnfStyle w:firstRow="1"/>
+        </w:trPr>
+        <w:tc>
+          <w:tcPr>
+            <w:tcBorders>
+              <w:bottom w:val="single"/>
+            </w:tcBorders>
+            <w:vAlign w:val="bottom"/>
+          </w:tcPr>
+          <w:p>
+            <w:pPr>
+              <w:pStyle w:val="Compact"/>
+              <w:jc w:val="left"/>
+            </w:pPr>
+            <w:r>
+              <w:t xml:space="preserve">Country</w:t>
+            </w:r>
+          </w:p>
+        </w:tc>
+        <w:tc>
+          <w:tcPr>
+            <w:tcBorders>
+              <w:bottom w:val="single"/>
+            </w:tcBorders>
+            <w:vAlign w:val="bottom"/>
+          </w:tcPr>
+          <w:p>
+            <w:pPr>
+              <w:pStyle w:val="Compact"/>
+              <w:jc w:val="left"/>
+            </w:pPr>
+            <w:r>
+              <w:t xml:space="preserve">Year</w:t>
+            </w:r>
+          </w:p>
+        </w:tc>
+        <w:tc>
+          <w:tcPr>
+            <w:tcBorders>
+              <w:bottom w:val="single"/>
+            </w:tcBorders>
+            <w:vAlign w:val="bottom"/>
+          </w:tcPr>
+          <w:p>
+            <w:pPr>
+              <w:pStyle w:val="Compact"/>
+              <w:jc w:val="left"/>
+            </w:pPr>
+            <w:r>
+              <w:t xml:space="preserve">Main source file</w:t>
+            </w:r>
+          </w:p>
+        </w:tc>
+        <w:tc>
+          <w:tcPr>
+            <w:tcBorders>
+              <w:bottom w:val="single"/>
+            </w:tcBorders>
+            <w:vAlign w:val="bottom"/>
+          </w:tcPr>
+          <w:p>
+            <w:pPr>
+              <w:pStyle w:val="Compact"/>
+              <w:jc w:val="left"/>
+            </w:pPr>
+            <w:r>
+              <w:t xml:space="preserve">Data catalog</w:t>
+            </w:r>
+          </w:p>
+        </w:tc>
+      </w:tr>
+      <w:tr>
+        <w:tc>
+          <w:p>
+            <w:pPr>
+              <w:pStyle w:val="Compact"/>
+              <w:jc w:val="left"/>
+            </w:pPr>
+            <w:r>
+              <w:t xml:space="preserve">Ethiopia</w:t>
+            </w:r>
+          </w:p>
+        </w:tc>
+        <w:tc>
+          <w:p>
+            <w:pPr>
+              <w:pStyle w:val="Compact"/>
+              <w:jc w:val="left"/>
+            </w:pPr>
+            <w:r>
+              <w:t xml:space="preserve">2012</w:t>
+            </w:r>
+          </w:p>
+        </w:tc>
+        <w:tc>
+          <w:p>
+            <w:pPr>
+              <w:pStyle w:val="Compact"/>
+              <w:jc w:val="left"/>
+            </w:pPr>
+            <w:r>
+              <w:rPr>
+                <w:rStyle w:val="VerbatimChar"/>
+              </w:rPr>
+              <w:t xml:space="preserve">sect2_pp_w1.dta</w:t>
+            </w:r>
+          </w:p>
+        </w:tc>
+        <w:tc>
+          <w:p>
+            <w:pPr>
+              <w:pStyle w:val="Compact"/>
+              <w:jc w:val="left"/>
+            </w:pPr>
+            <w:hyperlink r:id="rId36">
+              <w:r>
+                <w:rPr>
+                  <w:rStyle w:val="Hyperlink"/>
+                </w:rPr>
+                <w:t xml:space="preserve">ESS 2011/12</w:t>
+              </w:r>
+            </w:hyperlink>
+          </w:p>
+        </w:tc>
+      </w:tr>
+      <w:tr>
+        <w:tc>
+          <w:p/>
+        </w:tc>
+        <w:tc>
+          <w:p>
+            <w:pPr>
+              <w:pStyle w:val="Compact"/>
+              <w:jc w:val="left"/>
+            </w:pPr>
+            <w:r>
+              <w:t xml:space="preserve">2014</w:t>
+            </w:r>
+          </w:p>
+        </w:tc>
+        <w:tc>
+          <w:p>
+            <w:pPr>
+              <w:pStyle w:val="Compact"/>
+              <w:jc w:val="left"/>
+            </w:pPr>
+            <w:r>
+              <w:rPr>
+                <w:rStyle w:val="VerbatimChar"/>
+              </w:rPr>
+              <w:t xml:space="preserve">sect2_pp_w2.dta</w:t>
+            </w:r>
+          </w:p>
+        </w:tc>
+        <w:tc>
+          <w:p>
+            <w:pPr>
+              <w:pStyle w:val="Compact"/>
+              <w:jc w:val="left"/>
+            </w:pPr>
+            <w:hyperlink r:id="rId37">
+              <w:r>
+                <w:rPr>
+                  <w:rStyle w:val="Hyperlink"/>
+                </w:rPr>
+                <w:t xml:space="preserve">ESS 2013/14</w:t>
+              </w:r>
+            </w:hyperlink>
+          </w:p>
+        </w:tc>
+      </w:tr>
+      <w:tr>
+        <w:tc>
+          <w:p/>
+        </w:tc>
+        <w:tc>
+          <w:p>
+            <w:pPr>
+              <w:pStyle w:val="Compact"/>
+              <w:jc w:val="left"/>
+            </w:pPr>
+            <w:r>
+              <w:t xml:space="preserve">2016</w:t>
+            </w:r>
+          </w:p>
+        </w:tc>
+        <w:tc>
+          <w:p>
+            <w:pPr>
+              <w:pStyle w:val="Compact"/>
+              <w:jc w:val="left"/>
+            </w:pPr>
+            <w:r>
+              <w:rPr>
+                <w:rStyle w:val="VerbatimChar"/>
+              </w:rPr>
+              <w:t xml:space="preserve">sect2_pp_w3.dta</w:t>
+            </w:r>
+          </w:p>
+        </w:tc>
+        <w:tc>
+          <w:p>
+            <w:pPr>
+              <w:pStyle w:val="Compact"/>
+              <w:jc w:val="left"/>
+            </w:pPr>
+            <w:hyperlink r:id="rId38">
+              <w:r>
+                <w:rPr>
+                  <w:rStyle w:val="Hyperlink"/>
+                </w:rPr>
+                <w:t xml:space="preserve">ESS 2015/16</w:t>
+              </w:r>
+            </w:hyperlink>
+          </w:p>
+        </w:tc>
+      </w:tr>
+      <w:tr>
+        <w:tc>
+          <w:p/>
+        </w:tc>
+        <w:tc>
+          <w:p>
+            <w:pPr>
+              <w:pStyle w:val="Compact"/>
+              <w:jc w:val="left"/>
+            </w:pPr>
+            <w:r>
+              <w:t xml:space="preserve">2019</w:t>
+            </w:r>
+          </w:p>
+        </w:tc>
+        <w:tc>
+          <w:p>
+            <w:pPr>
+              <w:pStyle w:val="Compact"/>
+              <w:jc w:val="left"/>
+            </w:pPr>
+            <w:r>
+              <w:rPr>
+                <w:rStyle w:val="VerbatimChar"/>
+              </w:rPr>
+              <w:t xml:space="preserve">sect2_pp_w4.dta</w:t>
+            </w:r>
+          </w:p>
+        </w:tc>
+        <w:tc>
+          <w:p>
+            <w:pPr>
+              <w:pStyle w:val="Compact"/>
+              <w:jc w:val="left"/>
+            </w:pPr>
+            <w:hyperlink r:id="rId39">
+              <w:r>
+                <w:rPr>
+                  <w:rStyle w:val="Hyperlink"/>
+                </w:rPr>
+                <w:t xml:space="preserve">ESS 2018/19</w:t>
+              </w:r>
+            </w:hyperlink>
+          </w:p>
+        </w:tc>
+      </w:tr>
+      <w:tr>
+        <w:tc>
+          <w:p/>
+        </w:tc>
+        <w:tc>
+          <w:p>
+            <w:pPr>
+              <w:pStyle w:val="Compact"/>
+              <w:jc w:val="left"/>
+            </w:pPr>
+            <w:r>
+              <w:t xml:space="preserve">2022</w:t>
+            </w:r>
+          </w:p>
+        </w:tc>
+        <w:tc>
+          <w:p>
+            <w:pPr>
+              <w:pStyle w:val="Compact"/>
+              <w:jc w:val="left"/>
+            </w:pPr>
+            <w:r>
+              <w:rPr>
+                <w:rStyle w:val="VerbatimChar"/>
+              </w:rPr>
+              <w:t xml:space="preserve">sect2_pp_w5.dta</w:t>
+            </w:r>
+          </w:p>
+        </w:tc>
+        <w:tc>
+          <w:p>
+            <w:pPr>
+              <w:pStyle w:val="Compact"/>
+              <w:jc w:val="left"/>
+            </w:pPr>
+            <w:hyperlink r:id="rId40">
+              <w:r>
+                <w:rPr>
+                  <w:rStyle w:val="Hyperlink"/>
+                </w:rPr>
+                <w:t xml:space="preserve">ESS 2021/22</w:t>
+              </w:r>
+            </w:hyperlink>
+          </w:p>
+        </w:tc>
+      </w:tr>
+      <w:tr>
+        <w:tc>
+          <w:p>
+            <w:pPr>
+              <w:pStyle w:val="Compact"/>
+              <w:jc w:val="left"/>
+            </w:pPr>
+            <w:r>
+              <w:t xml:space="preserve">Malawi</w:t>
+            </w:r>
+          </w:p>
+        </w:tc>
+        <w:tc>
+          <w:p>
+            <w:pPr>
+              <w:pStyle w:val="Compact"/>
+              <w:jc w:val="left"/>
+            </w:pPr>
+            <w:r>
+              <w:t xml:space="preserve">2010</w:t>
+            </w:r>
+          </w:p>
+        </w:tc>
+        <w:tc>
+          <w:p>
+            <w:pPr>
+              <w:pStyle w:val="Compact"/>
+              <w:jc w:val="left"/>
+            </w:pPr>
+            <w:r>
+              <w:rPr>
+                <w:rStyle w:val="VerbatimChar"/>
+              </w:rPr>
+              <w:t xml:space="preserve">ag_mod_d_10.dta</w:t>
+            </w:r>
+          </w:p>
+        </w:tc>
+        <w:tc>
+          <w:p>
+            <w:pPr>
+              <w:pStyle w:val="Compact"/>
+              <w:jc w:val="left"/>
+            </w:pPr>
+            <w:r>
+              <w:rPr>
+                <w:i/>
+              </w:rPr>
+              <w:t xml:space="preserve">(pending)</w:t>
+            </w:r>
+          </w:p>
+        </w:tc>
+      </w:tr>
+      <w:tr>
+        <w:tc>
+          <w:p/>
+        </w:tc>
+        <w:tc>
+          <w:p>
+            <w:pPr>
+              <w:pStyle w:val="Compact"/>
+              <w:jc w:val="left"/>
+            </w:pPr>
+            <w:r>
+              <w:t xml:space="preserve">2013</w:t>
+            </w:r>
+          </w:p>
+        </w:tc>
+        <w:tc>
+          <w:p>
+            <w:pPr>
+              <w:pStyle w:val="Compact"/>
+              <w:jc w:val="left"/>
+            </w:pPr>
+            <w:r>
+              <w:rPr>
+                <w:rStyle w:val="VerbatimChar"/>
+              </w:rPr>
+              <w:t xml:space="preserve">ag_mod_d_13.dta</w:t>
+            </w:r>
+          </w:p>
+        </w:tc>
+        <w:tc>
+          <w:p>
+            <w:pPr>
+              <w:pStyle w:val="Compact"/>
+              <w:jc w:val="left"/>
+            </w:pPr>
+            <w:r>
+              <w:rPr>
+                <w:i/>
+              </w:rPr>
+              <w:t xml:space="preserve">(pending)</w:t>
+            </w:r>
+          </w:p>
+        </w:tc>
+      </w:tr>
+      <w:tr>
+        <w:tc>
+          <w:p/>
+        </w:tc>
+        <w:tc>
+          <w:p>
+            <w:pPr>
+              <w:pStyle w:val="Compact"/>
+              <w:jc w:val="left"/>
+            </w:pPr>
+            <w:r>
+              <w:t xml:space="preserve">2016</w:t>
+            </w:r>
+          </w:p>
+        </w:tc>
+        <w:tc>
+          <w:p>
+            <w:pPr>
+              <w:pStyle w:val="Compact"/>
+              <w:jc w:val="left"/>
+            </w:pPr>
+            <w:r>
+              <w:rPr>
+                <w:rStyle w:val="VerbatimChar"/>
+              </w:rPr>
+              <w:t xml:space="preserve">ag_mod_b2_16.dta</w:t>
+            </w:r>
+          </w:p>
+        </w:tc>
+        <w:tc>
+          <w:p>
+            <w:pPr>
+              <w:pStyle w:val="Compact"/>
+              <w:jc w:val="left"/>
+            </w:pPr>
+            <w:r>
+              <w:rPr>
+                <w:i/>
+              </w:rPr>
+              <w:t xml:space="preserve">(pending)</w:t>
+            </w:r>
+          </w:p>
+        </w:tc>
+      </w:tr>
+      <w:tr>
+        <w:tc>
+          <w:p/>
+        </w:tc>
+        <w:tc>
+          <w:p>
+            <w:pPr>
+              <w:pStyle w:val="Compact"/>
+              <w:jc w:val="left"/>
+            </w:pPr>
+            <w:r>
+              <w:t xml:space="preserve">2019</w:t>
+            </w:r>
+          </w:p>
+        </w:tc>
+        <w:tc>
+          <w:p>
+            <w:pPr>
+              <w:pStyle w:val="Compact"/>
+              <w:jc w:val="left"/>
+            </w:pPr>
+            <w:r>
+              <w:rPr>
+                <w:rStyle w:val="VerbatimChar"/>
+              </w:rPr>
+              <w:t xml:space="preserve">ag_mod_b2_19.dta</w:t>
+            </w:r>
+          </w:p>
+        </w:tc>
+        <w:tc>
+          <w:p>
+            <w:pPr>
+              <w:pStyle w:val="Compact"/>
+              <w:jc w:val="left"/>
+            </w:pPr>
+            <w:r>
+              <w:rPr>
+                <w:i/>
+              </w:rPr>
+              <w:t xml:space="preserve">(pending)</w:t>
+            </w:r>
+          </w:p>
+        </w:tc>
+      </w:tr>
+      <w:tr>
+        <w:tc>
+          <w:p>
+            <w:pPr>
+              <w:pStyle w:val="Compact"/>
+              <w:jc w:val="left"/>
+            </w:pPr>
+            <w:r>
+              <w:t xml:space="preserve">Mali</w:t>
+            </w:r>
+          </w:p>
+        </w:tc>
+        <w:tc>
+          <w:p>
+            <w:pPr>
+              <w:pStyle w:val="Compact"/>
+              <w:jc w:val="left"/>
+            </w:pPr>
+            <w:r>
+              <w:t xml:space="preserve">2014</w:t>
+            </w:r>
+          </w:p>
+        </w:tc>
+        <w:tc>
+          <w:p>
+            <w:pPr>
+              <w:pStyle w:val="Compact"/>
+              <w:jc w:val="left"/>
+            </w:pPr>
+            <w:r>
+              <w:rPr>
+                <w:rStyle w:val="VerbatimChar"/>
+              </w:rPr>
+              <w:t xml:space="preserve">EACIEXPLOI_p1.dta</w:t>
+            </w:r>
+          </w:p>
+        </w:tc>
+        <w:tc>
+          <w:p>
+            <w:pPr>
+              <w:pStyle w:val="Compact"/>
+              <w:jc w:val="left"/>
+            </w:pPr>
+            <w:r>
+              <w:rPr>
+                <w:i/>
+              </w:rPr>
+              <w:t xml:space="preserve">(pending)</w:t>
+            </w:r>
+          </w:p>
+        </w:tc>
+      </w:tr>
+      <w:tr>
+        <w:tc>
+          <w:p/>
+        </w:tc>
+        <w:tc>
+          <w:p>
+            <w:pPr>
+              <w:pStyle w:val="Compact"/>
+              <w:jc w:val="left"/>
+            </w:pPr>
+            <w:r>
+              <w:t xml:space="preserve">2017</w:t>
+            </w:r>
+          </w:p>
+        </w:tc>
+        <w:tc>
+          <w:p>
+            <w:pPr>
+              <w:pStyle w:val="Compact"/>
+              <w:jc w:val="left"/>
+            </w:pPr>
+            <w:r>
+              <w:rPr>
+                <w:rStyle w:val="VerbatimChar"/>
+              </w:rPr>
+              <w:t xml:space="preserve">eaci17_s11bp1.dta</w:t>
+            </w:r>
+          </w:p>
+        </w:tc>
+        <w:tc>
+          <w:p>
+            <w:pPr>
+              <w:pStyle w:val="Compact"/>
+              <w:jc w:val="left"/>
+            </w:pPr>
+            <w:r>
+              <w:rPr>
+                <w:i/>
+              </w:rPr>
+              <w:t xml:space="preserve">(pending)</w:t>
+            </w:r>
+          </w:p>
+        </w:tc>
+      </w:tr>
+      <w:tr>
+        <w:tc>
+          <w:p>
+            <w:pPr>
+              <w:pStyle w:val="Compact"/>
+              <w:jc w:val="left"/>
+            </w:pPr>
+            <w:r>
+              <w:t xml:space="preserve">Niger</w:t>
+            </w:r>
+          </w:p>
+        </w:tc>
+        <w:tc>
+          <w:p>
+            <w:pPr>
+              <w:pStyle w:val="Compact"/>
+              <w:jc w:val="left"/>
+            </w:pPr>
+            <w:r>
+              <w:t xml:space="preserve">2011</w:t>
+            </w:r>
+          </w:p>
+        </w:tc>
+        <w:tc>
+          <w:p>
+            <w:pPr>
+              <w:pStyle w:val="Compact"/>
+              <w:jc w:val="left"/>
+            </w:pPr>
+            <w:r>
+              <w:rPr>
+                <w:rStyle w:val="VerbatimChar"/>
+              </w:rPr>
+              <w:t xml:space="preserve">ecvmaas1_p1.dta</w:t>
+            </w:r>
+          </w:p>
+        </w:tc>
+        <w:tc>
+          <w:p>
+            <w:pPr>
+              <w:pStyle w:val="Compact"/>
+              <w:jc w:val="left"/>
+            </w:pPr>
+            <w:r>
+              <w:rPr>
+                <w:i/>
+              </w:rPr>
+              <w:t xml:space="preserve">(pending)</w:t>
+            </w:r>
+          </w:p>
+        </w:tc>
+      </w:tr>
+      <w:tr>
+        <w:tc>
+          <w:p/>
+        </w:tc>
+        <w:tc>
+          <w:p>
+            <w:pPr>
+              <w:pStyle w:val="Compact"/>
+              <w:jc w:val="left"/>
+            </w:pPr>
+            <w:r>
+              <w:t xml:space="preserve">2014</w:t>
+            </w:r>
+          </w:p>
+        </w:tc>
+        <w:tc>
+          <w:p>
+            <w:pPr>
+              <w:pStyle w:val="Compact"/>
+              <w:jc w:val="left"/>
+            </w:pPr>
+            <w:r>
+              <w:rPr>
+                <w:rStyle w:val="VerbatimChar"/>
+              </w:rPr>
+              <w:t xml:space="preserve">ECVMA2_AS1P1.dta</w:t>
+            </w:r>
+          </w:p>
+        </w:tc>
+        <w:tc>
+          <w:p>
+            <w:pPr>
+              <w:pStyle w:val="Compact"/>
+              <w:jc w:val="left"/>
+            </w:pPr>
+            <w:r>
+              <w:rPr>
+                <w:i/>
+              </w:rPr>
+              <w:t xml:space="preserve">(pending)</w:t>
+            </w:r>
+          </w:p>
+        </w:tc>
+      </w:tr>
+      <w:tr>
+        <w:tc>
+          <w:p>
+            <w:pPr>
+              <w:pStyle w:val="Compact"/>
+              <w:jc w:val="left"/>
+            </w:pPr>
+            <w:r>
+              <w:t xml:space="preserve">Nigeria</w:t>
+            </w:r>
+          </w:p>
+        </w:tc>
+        <w:tc>
+          <w:p>
+            <w:pPr>
+              <w:pStyle w:val="Compact"/>
+              <w:jc w:val="left"/>
+            </w:pPr>
+            <w:r>
+              <w:t xml:space="preserve">2011</w:t>
+            </w:r>
+          </w:p>
+        </w:tc>
+        <w:tc>
+          <w:p>
+            <w:pPr>
+              <w:pStyle w:val="Compact"/>
+              <w:jc w:val="left"/>
+            </w:pPr>
+            <w:r>
+              <w:rPr>
+                <w:rStyle w:val="VerbatimChar"/>
+              </w:rPr>
+              <w:t xml:space="preserve">sect11b_plantingw1.dta</w:t>
+            </w:r>
+          </w:p>
+        </w:tc>
+        <w:tc>
+          <w:p>
+            <w:pPr>
+              <w:pStyle w:val="Compact"/>
+              <w:jc w:val="left"/>
+            </w:pPr>
+            <w:r>
+              <w:rPr>
+                <w:i/>
+              </w:rPr>
+              <w:t xml:space="preserve">(pending)</w:t>
+            </w:r>
+          </w:p>
+        </w:tc>
+      </w:tr>
+      <w:tr>
+        <w:tc>
+          <w:p/>
+        </w:tc>
+        <w:tc>
+          <w:p>
+            <w:pPr>
+              <w:pStyle w:val="Compact"/>
+              <w:jc w:val="left"/>
+            </w:pPr>
+            <w:r>
+              <w:t xml:space="preserve">2013</w:t>
+            </w:r>
+          </w:p>
+        </w:tc>
+        <w:tc>
+          <w:p>
+            <w:pPr>
+              <w:pStyle w:val="Compact"/>
+              <w:jc w:val="left"/>
+            </w:pPr>
+            <w:r>
+              <w:rPr>
+                <w:rStyle w:val="VerbatimChar"/>
+              </w:rPr>
+              <w:t xml:space="preserve">sect11b1_plantingw2.dta</w:t>
+            </w:r>
+          </w:p>
+        </w:tc>
+        <w:tc>
+          <w:p>
+            <w:pPr>
+              <w:pStyle w:val="Compact"/>
+              <w:jc w:val="left"/>
+            </w:pPr>
+            <w:r>
+              <w:rPr>
+                <w:i/>
+              </w:rPr>
+              <w:t xml:space="preserve">(pending)</w:t>
+            </w:r>
+          </w:p>
+        </w:tc>
+      </w:tr>
+      <w:tr>
+        <w:tc>
+          <w:p/>
+        </w:tc>
+        <w:tc>
+          <w:p>
+            <w:pPr>
+              <w:pStyle w:val="Compact"/>
+              <w:jc w:val="left"/>
+            </w:pPr>
+            <w:r>
+              <w:t xml:space="preserve">2016</w:t>
+            </w:r>
+          </w:p>
+        </w:tc>
+        <w:tc>
+          <w:p>
+            <w:pPr>
+              <w:pStyle w:val="Compact"/>
+              <w:jc w:val="left"/>
+            </w:pPr>
+            <w:r>
+              <w:rPr>
+                <w:rStyle w:val="VerbatimChar"/>
+              </w:rPr>
+              <w:t xml:space="preserve">sect11b1_plantingw3.dta</w:t>
+            </w:r>
+          </w:p>
+        </w:tc>
+        <w:tc>
+          <w:p>
+            <w:pPr>
+              <w:pStyle w:val="Compact"/>
+              <w:jc w:val="left"/>
+            </w:pPr>
+            <w:r>
+              <w:rPr>
+                <w:i/>
+              </w:rPr>
+              <w:t xml:space="preserve">(pending)</w:t>
+            </w:r>
+          </w:p>
+        </w:tc>
+      </w:tr>
+      <w:tr>
+        <w:tc>
+          <w:p/>
+        </w:tc>
+        <w:tc>
+          <w:p>
+            <w:pPr>
+              <w:pStyle w:val="Compact"/>
+              <w:jc w:val="left"/>
+            </w:pPr>
+            <w:r>
+              <w:t xml:space="preserve">2019</w:t>
+            </w:r>
+          </w:p>
+        </w:tc>
+        <w:tc>
+          <w:p>
+            <w:pPr>
+              <w:pStyle w:val="Compact"/>
+              <w:jc w:val="left"/>
+            </w:pPr>
+            <w:r>
+              <w:rPr>
+                <w:rStyle w:val="VerbatimChar"/>
+              </w:rPr>
+              <w:t xml:space="preserve">sect11b1_plantingw4.dta</w:t>
+            </w:r>
+          </w:p>
+        </w:tc>
+        <w:tc>
+          <w:p>
+            <w:pPr>
+              <w:pStyle w:val="Compact"/>
+              <w:jc w:val="left"/>
+            </w:pPr>
+            <w:r>
+              <w:rPr>
+                <w:i/>
+              </w:rPr>
+              <w:t xml:space="preserve">(pending)</w:t>
+            </w:r>
+          </w:p>
+        </w:tc>
+      </w:tr>
+      <w:tr>
+        <w:tc>
+          <w:p/>
+        </w:tc>
+        <w:tc>
+          <w:p>
+            <w:pPr>
+              <w:pStyle w:val="Compact"/>
+              <w:jc w:val="left"/>
+            </w:pPr>
+            <w:r>
+              <w:t xml:space="preserve">2023</w:t>
+            </w:r>
+          </w:p>
+        </w:tc>
+        <w:tc>
+          <w:p>
+            <w:pPr>
+              <w:pStyle w:val="Compact"/>
+              <w:jc w:val="left"/>
+            </w:pPr>
+            <w:r>
+              <w:rPr>
+                <w:rStyle w:val="VerbatimChar"/>
+              </w:rPr>
+              <w:t xml:space="preserve">sect11b1_plantingw5.dta</w:t>
+            </w:r>
+          </w:p>
+        </w:tc>
+        <w:tc>
+          <w:p>
+            <w:pPr>
+              <w:pStyle w:val="Compact"/>
+              <w:jc w:val="left"/>
+            </w:pPr>
+            <w:r>
+              <w:rPr>
+                <w:i/>
+              </w:rPr>
+              <w:t xml:space="preserve">(pending)</w:t>
+            </w:r>
+          </w:p>
+        </w:tc>
+      </w:tr>
+      <w:tr>
+        <w:tc>
+          <w:p>
+            <w:pPr>
+              <w:pStyle w:val="Compact"/>
+              <w:jc w:val="left"/>
+            </w:pPr>
+            <w:r>
+              <w:t xml:space="preserve">Tanzania</w:t>
+            </w:r>
+          </w:p>
+        </w:tc>
+        <w:tc>
+          <w:p>
+            <w:pPr>
+              <w:pStyle w:val="Compact"/>
+              <w:jc w:val="left"/>
+            </w:pPr>
+            <w:r>
+              <w:t xml:space="preserve">2009</w:t>
+            </w:r>
+          </w:p>
+        </w:tc>
+        <w:tc>
+          <w:p>
+            <w:pPr>
+              <w:pStyle w:val="Compact"/>
+              <w:jc w:val="left"/>
+            </w:pPr>
+            <w:r>
+              <w:rPr>
+                <w:rStyle w:val="VerbatimChar"/>
+              </w:rPr>
+              <w:t xml:space="preserve">SEC_3A.dta</w:t>
+            </w:r>
+          </w:p>
+        </w:tc>
+        <w:tc>
+          <w:p>
+            <w:pPr>
+              <w:pStyle w:val="Compact"/>
+              <w:jc w:val="left"/>
+            </w:pPr>
+            <w:r>
+              <w:rPr>
+                <w:i/>
+              </w:rPr>
+              <w:t xml:space="preserve">(pending)</w:t>
+            </w:r>
+          </w:p>
+        </w:tc>
+      </w:tr>
+      <w:tr>
+        <w:tc>
+          <w:p/>
+        </w:tc>
+        <w:tc>
+          <w:p>
+            <w:pPr>
+              <w:pStyle w:val="Compact"/>
+              <w:jc w:val="left"/>
+            </w:pPr>
+            <w:r>
+              <w:t xml:space="preserve">2011</w:t>
+            </w:r>
+          </w:p>
+        </w:tc>
+        <w:tc>
+          <w:p>
+            <w:pPr>
+              <w:pStyle w:val="Compact"/>
+              <w:jc w:val="left"/>
+            </w:pPr>
+            <w:r>
+              <w:rPr>
+                <w:rStyle w:val="VerbatimChar"/>
+              </w:rPr>
+              <w:t xml:space="preserve">AG_SEC3A.dta</w:t>
+            </w:r>
+          </w:p>
+        </w:tc>
+        <w:tc>
+          <w:p>
+            <w:pPr>
+              <w:pStyle w:val="Compact"/>
+              <w:jc w:val="left"/>
+            </w:pPr>
+            <w:r>
+              <w:rPr>
+                <w:i/>
+              </w:rPr>
+              <w:t xml:space="preserve">(pending)</w:t>
+            </w:r>
+          </w:p>
+        </w:tc>
+      </w:tr>
+      <w:tr>
+        <w:tc>
+          <w:p/>
+        </w:tc>
+        <w:tc>
+          <w:p>
+            <w:pPr>
+              <w:pStyle w:val="Compact"/>
+              <w:jc w:val="left"/>
+            </w:pPr>
+            <w:r>
+              <w:t xml:space="preserve">2013</w:t>
+            </w:r>
+          </w:p>
+        </w:tc>
+        <w:tc>
+          <w:p>
+            <w:pPr>
+              <w:pStyle w:val="Compact"/>
+              <w:jc w:val="left"/>
+            </w:pPr>
+            <w:r>
+              <w:rPr>
+                <w:rStyle w:val="VerbatimChar"/>
+              </w:rPr>
+              <w:t xml:space="preserve">AG_SEC_3A.dta</w:t>
+            </w:r>
+          </w:p>
+        </w:tc>
+        <w:tc>
+          <w:p>
+            <w:pPr>
+              <w:pStyle w:val="Compact"/>
+              <w:jc w:val="left"/>
+            </w:pPr>
+            <w:r>
+              <w:rPr>
+                <w:i/>
+              </w:rPr>
+              <w:t xml:space="preserve">(pending)</w:t>
+            </w:r>
+          </w:p>
+        </w:tc>
+      </w:tr>
+      <w:tr>
+        <w:tc>
+          <w:p/>
+        </w:tc>
+        <w:tc>
+          <w:p>
+            <w:pPr>
+              <w:pStyle w:val="Compact"/>
+              <w:jc w:val="left"/>
+            </w:pPr>
+            <w:r>
+              <w:t xml:space="preserve">2015</w:t>
+            </w:r>
+          </w:p>
+        </w:tc>
+        <w:tc>
+          <w:p>
+            <w:pPr>
+              <w:pStyle w:val="Compact"/>
+              <w:jc w:val="left"/>
+            </w:pPr>
+            <w:r>
+              <w:rPr>
+                <w:rStyle w:val="VerbatimChar"/>
+              </w:rPr>
+              <w:t xml:space="preserve">AG_SEC_3A.dta</w:t>
+            </w:r>
+            <w:r>
+              <w:t xml:space="preserve"> </w:t>
+            </w:r>
+            <w:r>
+              <w:t xml:space="preserve">(extended + refresh)</w:t>
+            </w:r>
+          </w:p>
+        </w:tc>
+        <w:tc>
+          <w:p>
+            <w:pPr>
+              <w:pStyle w:val="Compact"/>
+              <w:jc w:val="left"/>
+            </w:pPr>
+            <w:r>
+              <w:rPr>
+                <w:i/>
+              </w:rPr>
+              <w:t xml:space="preserve">(pending)</w:t>
+            </w:r>
+          </w:p>
+        </w:tc>
+      </w:tr>
+      <w:tr>
+        <w:tc>
+          <w:p/>
+        </w:tc>
+        <w:tc>
+          <w:p>
+            <w:pPr>
+              <w:pStyle w:val="Compact"/>
+              <w:jc w:val="left"/>
+            </w:pPr>
+            <w:r>
+              <w:t xml:space="preserve">2019</w:t>
+            </w:r>
+          </w:p>
+        </w:tc>
+        <w:tc>
+          <w:p>
+            <w:pPr>
+              <w:pStyle w:val="Compact"/>
+              <w:jc w:val="left"/>
+            </w:pPr>
+            <w:r>
+              <w:rPr>
+                <w:rStyle w:val="VerbatimChar"/>
+              </w:rPr>
+              <w:t xml:space="preserve">AG_SEC_3A.dta</w:t>
+            </w:r>
+            <w:r>
+              <w:t xml:space="preserve"> </w:t>
+            </w:r>
+            <w:r>
+              <w:t xml:space="preserve">(extended + refresh)</w:t>
+            </w:r>
+          </w:p>
+        </w:tc>
+        <w:tc>
+          <w:p>
+            <w:pPr>
+              <w:pStyle w:val="Compact"/>
+              <w:jc w:val="left"/>
+            </w:pPr>
+            <w:r>
+              <w:rPr>
+                <w:i/>
+              </w:rPr>
+              <w:t xml:space="preserve">(pending)</w:t>
+            </w:r>
+          </w:p>
+        </w:tc>
+      </w:tr>
+      <w:tr>
+        <w:tc>
+          <w:p>
+            <w:pPr>
+              <w:pStyle w:val="Compact"/>
+              <w:jc w:val="left"/>
+            </w:pPr>
+            <w:r>
+              <w:t xml:space="preserve">Uganda</w:t>
+            </w:r>
+          </w:p>
+        </w:tc>
+        <w:tc>
+          <w:p>
+            <w:pPr>
+              <w:pStyle w:val="Compact"/>
+              <w:jc w:val="left"/>
+            </w:pPr>
+            <w:r>
+              <w:t xml:space="preserve">2009</w:t>
+            </w:r>
+          </w:p>
+        </w:tc>
+        <w:tc>
+          <w:p>
+            <w:pPr>
+              <w:pStyle w:val="Compact"/>
+              <w:jc w:val="left"/>
+            </w:pPr>
+            <w:r>
+              <w:rPr>
+                <w:rStyle w:val="VerbatimChar"/>
+              </w:rPr>
+              <w:t xml:space="preserve">2009_AGSEC2A.dta</w:t>
+            </w:r>
+          </w:p>
+        </w:tc>
+        <w:tc>
+          <w:p>
+            <w:pPr>
+              <w:pStyle w:val="Compact"/>
+              <w:jc w:val="left"/>
+            </w:pPr>
+            <w:r>
+              <w:rPr>
+                <w:i/>
+              </w:rPr>
+              <w:t xml:space="preserve">(pending)</w:t>
+            </w:r>
+          </w:p>
+        </w:tc>
+      </w:tr>
+      <w:tr>
+        <w:tc>
+          <w:p/>
+        </w:tc>
+        <w:tc>
+          <w:p>
+            <w:pPr>
+              <w:pStyle w:val="Compact"/>
+              <w:jc w:val="left"/>
+            </w:pPr>
+            <w:r>
+              <w:t xml:space="preserve">2010</w:t>
+            </w:r>
+          </w:p>
+        </w:tc>
+        <w:tc>
+          <w:p>
+            <w:pPr>
+              <w:pStyle w:val="Compact"/>
+              <w:jc w:val="left"/>
+            </w:pPr>
+            <w:r>
+              <w:rPr>
+                <w:rStyle w:val="VerbatimChar"/>
+              </w:rPr>
+              <w:t xml:space="preserve">AGSEC2A.dta</w:t>
+            </w:r>
+          </w:p>
+        </w:tc>
+        <w:tc>
+          <w:p>
+            <w:pPr>
+              <w:pStyle w:val="Compact"/>
+              <w:jc w:val="left"/>
+            </w:pPr>
+            <w:r>
+              <w:rPr>
+                <w:i/>
+              </w:rPr>
+              <w:t xml:space="preserve">(pending)</w:t>
+            </w:r>
+          </w:p>
+        </w:tc>
+      </w:tr>
+      <w:tr>
+        <w:tc>
+          <w:p/>
+        </w:tc>
+        <w:tc>
+          <w:p>
+            <w:pPr>
+              <w:pStyle w:val="Compact"/>
+              <w:jc w:val="left"/>
+            </w:pPr>
+            <w:r>
+              <w:t xml:space="preserve">2011</w:t>
+            </w:r>
+          </w:p>
+        </w:tc>
+        <w:tc>
+          <w:p>
+            <w:pPr>
+              <w:pStyle w:val="Compact"/>
+              <w:jc w:val="left"/>
+            </w:pPr>
+            <w:r>
+              <w:rPr>
+                <w:rStyle w:val="VerbatimChar"/>
+              </w:rPr>
+              <w:t xml:space="preserve">AGSEC2A.dta</w:t>
+            </w:r>
+          </w:p>
+        </w:tc>
+        <w:tc>
+          <w:p>
+            <w:pPr>
+              <w:pStyle w:val="Compact"/>
+              <w:jc w:val="left"/>
+            </w:pPr>
+            <w:r>
+              <w:rPr>
+                <w:i/>
+              </w:rPr>
+              <w:t xml:space="preserve">(pending)</w:t>
+            </w:r>
+          </w:p>
+        </w:tc>
+      </w:tr>
+      <w:tr>
+        <w:tc>
+          <w:p/>
+        </w:tc>
+        <w:tc>
+          <w:p>
+            <w:pPr>
+              <w:pStyle w:val="Compact"/>
+              <w:jc w:val="left"/>
+            </w:pPr>
+            <w:r>
+              <w:t xml:space="preserve">2013</w:t>
+            </w:r>
+          </w:p>
+        </w:tc>
+        <w:tc>
+          <w:p>
+            <w:pPr>
+              <w:pStyle w:val="Compact"/>
+              <w:jc w:val="left"/>
+            </w:pPr>
+            <w:r>
+              <w:rPr>
+                <w:rStyle w:val="VerbatimChar"/>
+              </w:rPr>
+              <w:t xml:space="preserve">AGSEC2A.dta</w:t>
+            </w:r>
+          </w:p>
+        </w:tc>
+        <w:tc>
+          <w:p>
+            <w:pPr>
+              <w:pStyle w:val="Compact"/>
+              <w:jc w:val="left"/>
+            </w:pPr>
+            <w:r>
+              <w:rPr>
+                <w:i/>
+              </w:rPr>
+              <w:t xml:space="preserve">(pending)</w:t>
+            </w:r>
+          </w:p>
+        </w:tc>
+      </w:tr>
+      <w:tr>
+        <w:tc>
+          <w:p/>
+        </w:tc>
+        <w:tc>
+          <w:p>
+            <w:pPr>
+              <w:pStyle w:val="Compact"/>
+              <w:jc w:val="left"/>
+            </w:pPr>
+            <w:r>
+              <w:t xml:space="preserve">2015</w:t>
+            </w:r>
+          </w:p>
+        </w:tc>
+        <w:tc>
+          <w:p>
+            <w:pPr>
+              <w:pStyle w:val="Compact"/>
+              <w:jc w:val="left"/>
+            </w:pPr>
+            <w:r>
+              <w:rPr>
+                <w:rStyle w:val="VerbatimChar"/>
+              </w:rPr>
+              <w:t xml:space="preserve">AGSEC2A.dta</w:t>
+            </w:r>
+          </w:p>
+        </w:tc>
+        <w:tc>
+          <w:p>
+            <w:pPr>
+              <w:pStyle w:val="Compact"/>
+              <w:jc w:val="left"/>
+            </w:pPr>
+            <w:r>
+              <w:rPr>
+                <w:i/>
+              </w:rPr>
+              <w:t xml:space="preserve">(pending)</w:t>
+            </w:r>
+          </w:p>
+        </w:tc>
+      </w:tr>
+      <w:tr>
+        <w:tc>
+          <w:p/>
+        </w:tc>
+        <w:tc>
+          <w:p>
+            <w:pPr>
+              <w:pStyle w:val="Compact"/>
+              <w:jc w:val="left"/>
+            </w:pPr>
+            <w:r>
+              <w:t xml:space="preserve">2018</w:t>
+            </w:r>
+          </w:p>
+        </w:tc>
+        <w:tc>
+          <w:p>
+            <w:pPr>
+              <w:pStyle w:val="Compact"/>
+              <w:jc w:val="left"/>
+            </w:pPr>
+            <w:r>
+              <w:rPr>
+                <w:rStyle w:val="VerbatimChar"/>
+              </w:rPr>
+              <w:t xml:space="preserve">AGSEC2A.dta</w:t>
+            </w:r>
+          </w:p>
+        </w:tc>
+        <w:tc>
+          <w:p>
+            <w:pPr>
+              <w:pStyle w:val="Compact"/>
+              <w:jc w:val="left"/>
+            </w:pPr>
+            <w:r>
+              <w:rPr>
+                <w:i/>
+              </w:rPr>
+              <w:t xml:space="preserve">(pending)</w:t>
+            </w:r>
+          </w:p>
+        </w:tc>
+      </w:tr>
+      <w:tr>
+        <w:tc>
+          <w:p/>
+        </w:tc>
+        <w:tc>
+          <w:p>
+            <w:pPr>
+              <w:pStyle w:val="Compact"/>
+              <w:jc w:val="left"/>
+            </w:pPr>
+            <w:r>
+              <w:t xml:space="preserve">2019</w:t>
+            </w:r>
+          </w:p>
+        </w:tc>
+        <w:tc>
+          <w:p>
+            <w:pPr>
+              <w:pStyle w:val="Compact"/>
+              <w:jc w:val="left"/>
+            </w:pPr>
+            <w:r>
+              <w:rPr>
+                <w:rStyle w:val="VerbatimChar"/>
+              </w:rPr>
+              <w:t xml:space="preserve">agsec2a.dta</w:t>
+            </w:r>
+          </w:p>
+        </w:tc>
+        <w:tc>
+          <w:p>
+            <w:pPr>
+              <w:pStyle w:val="Compact"/>
+              <w:jc w:val="left"/>
+            </w:pPr>
+            <w:r>
+              <w:rPr>
+                <w:i/>
+              </w:rPr>
+              <w:t xml:space="preserve">(pending)</w:t>
+            </w:r>
+          </w:p>
+        </w:tc>
+      </w:tr>
+      <w:tr>
+        <w:tc>
+          <w:p>
+            <w:pPr>
+              <w:pStyle w:val="Compact"/>
+              <w:jc w:val="left"/>
+            </w:pPr>
+            <w:r>
+              <w:t xml:space="preserve">Zambia</w:t>
+            </w:r>
+          </w:p>
+        </w:tc>
+        <w:tc>
+          <w:p>
+            <w:pPr>
+              <w:pStyle w:val="Compact"/>
+              <w:jc w:val="left"/>
+            </w:pPr>
+            <w:r>
+              <w:t xml:space="preserve">2012</w:t>
+            </w:r>
+          </w:p>
+        </w:tc>
+        <w:tc>
+          <w:p>
+            <w:pPr>
+              <w:pStyle w:val="Compact"/>
+              <w:jc w:val="left"/>
+            </w:pPr>
+            <w:r>
+              <w:rPr>
+                <w:rStyle w:val="VerbatimChar"/>
+              </w:rPr>
+              <w:t xml:space="preserve">field.dta</w:t>
+            </w:r>
+          </w:p>
+        </w:tc>
+        <w:tc>
+          <w:p>
+            <w:pPr>
+              <w:pStyle w:val="Compact"/>
+              <w:jc w:val="left"/>
+            </w:pPr>
+            <w:r>
+              <w:rPr>
+                <w:i/>
+              </w:rPr>
+              <w:t xml:space="preserve">(pending; IAPRI)</w:t>
+            </w:r>
+          </w:p>
+        </w:tc>
+      </w:tr>
+      <w:tr>
+        <w:tc>
+          <w:p/>
+        </w:tc>
+        <w:tc>
+          <w:p>
+            <w:pPr>
+              <w:pStyle w:val="Compact"/>
+              <w:jc w:val="left"/>
+            </w:pPr>
+            <w:r>
+              <w:t xml:space="preserve">2015</w:t>
+            </w:r>
+          </w:p>
+        </w:tc>
+        <w:tc>
+          <w:p>
+            <w:pPr>
+              <w:pStyle w:val="Compact"/>
+              <w:jc w:val="left"/>
+            </w:pPr>
+            <w:r>
+              <w:rPr>
+                <w:rStyle w:val="VerbatimChar"/>
+              </w:rPr>
+              <w:t xml:space="preserve">field.dta</w:t>
+            </w:r>
+          </w:p>
+        </w:tc>
+        <w:tc>
+          <w:p>
+            <w:pPr>
+              <w:pStyle w:val="Compact"/>
+              <w:jc w:val="left"/>
+            </w:pPr>
+            <w:r>
+              <w:rPr>
+                <w:i/>
+              </w:rPr>
+              <w:t xml:space="preserve">(pending; IAPRI)</w:t>
+            </w:r>
+          </w:p>
+        </w:tc>
+      </w:tr>
+      <w:tr>
+        <w:tc>
+          <w:p/>
+        </w:tc>
+        <w:tc>
+          <w:p>
+            <w:pPr>
+              <w:pStyle w:val="Compact"/>
+              <w:jc w:val="left"/>
+            </w:pPr>
+            <w:r>
+              <w:t xml:space="preserve">2019</w:t>
+            </w:r>
+          </w:p>
+        </w:tc>
+        <w:tc>
+          <w:p>
+            <w:pPr>
+              <w:pStyle w:val="Compact"/>
+              <w:jc w:val="left"/>
+            </w:pPr>
+            <w:r>
+              <w:rPr>
+                <w:rStyle w:val="VerbatimChar"/>
+              </w:rPr>
+              <w:t xml:space="preserve">field.dta</w:t>
+            </w:r>
+          </w:p>
+        </w:tc>
+        <w:tc>
+          <w:p>
+            <w:pPr>
+              <w:pStyle w:val="Compact"/>
+              <w:jc w:val="left"/>
+            </w:pPr>
+            <w:r>
+              <w:rPr>
+                <w:i/>
+              </w:rPr>
+              <w:t xml:space="preserve">(pending; IAPRI)</w:t>
+            </w:r>
+          </w:p>
+        </w:tc>
+      </w:tr>
+    </w:tbl>
+    <w:p>
+      <w:pPr>
+        <w:pStyle w:val="Heading1"/>
+      </w:pPr>
+      <w:bookmarkStart w:id="41" w:name="Xa67191bf5e36bc64804d7ea38af21a2ea39cd14"/>
+      <w:r>
+        <w:t xml:space="preserve">Appendix A. Per-country variable provenance</w:t>
+      </w:r>
+      <w:bookmarkEnd w:id="41"/>
+    </w:p>
+    <w:p>
+      <w:pPr>
+        <w:pStyle w:val="FirstParagraph"/>
+      </w:pPr>
+      <w:r>
         <w:t xml:space="preserve">For every final variable, the exact source file, source variable(s), value-label</w:t>
       </w:r>
       <w:r>
@@ -10123,21 +11840,21 @@
       <w:pPr>
         <w:pStyle w:val="Heading2"/>
       </w:pPr>
-      <w:bookmarkStart w:id="35" w:name="X00728ba8d2160b74857f05f98b30c703885711f"/>
+      <w:bookmarkStart w:id="42" w:name="X00728ba8d2160b74857f05f98b30c703885711f"/>
       <w:r>
         <w:t xml:space="preserve">ETHIOPIA — Ethiopia Socioeconomic Survey (ESS)</w:t>
       </w:r>
-      <w:bookmarkEnd w:id="35"/>
+      <w:bookmarkEnd w:id="42"/>
     </w:p>
     <w:p>
       <w:pPr>
         <w:pStyle w:val="Heading3"/>
       </w:pPr>
-      <w:bookmarkStart w:id="36" w:name="survey-wave-key"/>
+      <w:bookmarkStart w:id="43" w:name="survey-wave-key"/>
       <w:r>
         <w:t xml:space="preserve">1. Survey &amp; wave key</w:t>
       </w:r>
-      <w:bookmarkEnd w:id="36"/>
+      <w:bookmarkEnd w:id="43"/>
     </w:p>
     <w:tbl>
       <w:tblPr>
@@ -10779,11 +12496,11 @@
       <w:pPr>
         <w:pStyle w:val="Heading3"/>
       </w:pPr>
-      <w:bookmarkStart w:id="37" w:name="tenure-indicators"/>
+      <w:bookmarkStart w:id="44" w:name="tenure-indicators"/>
       <w:r>
         <w:t xml:space="preserve">2. Tenure indicators</w:t>
       </w:r>
-      <w:bookmarkEnd w:id="37"/>
+      <w:bookmarkEnd w:id="44"/>
     </w:p>
     <w:p>
       <w:pPr>
@@ -12500,7 +14217,7 @@
       <w:pPr>
         <w:pStyle w:val="Heading3"/>
       </w:pPr>
-      <w:bookmarkStart w:id="38" w:name="parcel-area-parcel_area_ha"/>
+      <w:bookmarkStart w:id="45" w:name="parcel-area-parcel_area_ha"/>
       <w:r>
         <w:t xml:space="preserve">3. Parcel area (</w:t>
       </w:r>
@@ -12513,7 +14230,7 @@
       <w:r>
         <w:t xml:space="preserve">)</w:t>
       </w:r>
-      <w:bookmarkEnd w:id="38"/>
+      <w:bookmarkEnd w:id="45"/>
     </w:p>
     <w:p>
       <w:pPr>
@@ -13270,11 +14987,11 @@
       <w:pPr>
         <w:pStyle w:val="Heading3"/>
       </w:pPr>
-      <w:bookmarkStart w:id="39" w:name="design-variables-identifiers"/>
+      <w:bookmarkStart w:id="46" w:name="design-variables-identifiers"/>
       <w:r>
         <w:t xml:space="preserve">4. Design variables &amp; identifiers</w:t>
       </w:r>
-      <w:bookmarkEnd w:id="39"/>
+      <w:bookmarkEnd w:id="46"/>
     </w:p>
     <w:tbl>
       <w:tblPr>
@@ -14593,11 +16310,11 @@
       <w:pPr>
         <w:pStyle w:val="Heading3"/>
       </w:pPr>
-      <w:bookmarkStart w:id="40" w:name="Xd42d4af8211bb53ced3c89549c738c863b0b1f0"/>
+      <w:bookmarkStart w:id="47" w:name="Xd42d4af8211bb53ced3c89549c738c863b0b1f0"/>
       <w:r>
         <w:t xml:space="preserve">5. Value labels of key source variables (verified against the raw rosters)</w:t>
       </w:r>
-      <w:bookmarkEnd w:id="40"/>
+      <w:bookmarkEnd w:id="47"/>
     </w:p>
     <w:p>
       <w:pPr>
@@ -15732,11 +17449,11 @@
       <w:pPr>
         <w:pStyle w:val="Heading3"/>
       </w:pPr>
-      <w:bookmarkStart w:id="41" w:name="harmonization-decisions-caveats-ethiopia"/>
+      <w:bookmarkStart w:id="48" w:name="harmonization-decisions-caveats-ethiopia"/>
       <w:r>
         <w:t xml:space="preserve">6. Harmonization decisions &amp; caveats (Ethiopia)</w:t>
       </w:r>
-      <w:bookmarkEnd w:id="41"/>
+      <w:bookmarkEnd w:id="48"/>
     </w:p>
     <w:p>
       <w:pPr>
@@ -16344,11 +18061,11 @@
       <w:pPr>
         <w:pStyle w:val="Heading2"/>
       </w:pPr>
-      <w:bookmarkStart w:id="42" w:name="X58e7c7fc58aa400ad0a6aeef83d98534c48a47f"/>
+      <w:bookmarkStart w:id="49" w:name="X58e7c7fc58aa400ad0a6aeef83d98534c48a47f"/>
       <w:r>
         <w:t xml:space="preserve">MALAWI — Integrated Household Panel Survey (IHPS)</w:t>
       </w:r>
-      <w:bookmarkEnd w:id="42"/>
+      <w:bookmarkEnd w:id="49"/>
     </w:p>
     <w:p>
       <w:pPr>
@@ -16499,11 +18216,11 @@
       <w:pPr>
         <w:pStyle w:val="Heading3"/>
       </w:pPr>
-      <w:bookmarkStart w:id="43" w:name="survey-wave-key-1"/>
+      <w:bookmarkStart w:id="50" w:name="survey-wave-key-1"/>
       <w:r>
         <w:t xml:space="preserve">1. Survey &amp; wave key</w:t>
       </w:r>
-      <w:bookmarkEnd w:id="43"/>
+      <w:bookmarkEnd w:id="50"/>
     </w:p>
     <w:tbl>
       <w:tblPr>
@@ -17033,11 +18750,11 @@
       <w:pPr>
         <w:pStyle w:val="Heading3"/>
       </w:pPr>
-      <w:bookmarkStart w:id="44" w:name="tenure-indicators-1"/>
+      <w:bookmarkStart w:id="51" w:name="tenure-indicators-1"/>
       <w:r>
         <w:t xml:space="preserve">2. Tenure indicators</w:t>
       </w:r>
-      <w:bookmarkEnd w:id="44"/>
+      <w:bookmarkEnd w:id="51"/>
     </w:p>
     <w:tbl>
       <w:tblPr>
@@ -18197,7 +19914,7 @@
       <w:pPr>
         <w:pStyle w:val="Heading3"/>
       </w:pPr>
-      <w:bookmarkStart w:id="45" w:name="parcel-area-parcel_area_ha-1"/>
+      <w:bookmarkStart w:id="52" w:name="parcel-area-parcel_area_ha-1"/>
       <w:r>
         <w:t xml:space="preserve">3. Parcel area (</w:t>
       </w:r>
@@ -18210,7 +19927,7 @@
       <w:r>
         <w:t xml:space="preserve">)</w:t>
       </w:r>
-      <w:bookmarkEnd w:id="45"/>
+      <w:bookmarkEnd w:id="52"/>
     </w:p>
     <w:p>
       <w:pPr>
@@ -18329,11 +20046,11 @@
       <w:pPr>
         <w:pStyle w:val="Heading3"/>
       </w:pPr>
-      <w:bookmarkStart w:id="46" w:name="design-variables-identifiers-1"/>
+      <w:bookmarkStart w:id="53" w:name="design-variables-identifiers-1"/>
       <w:r>
         <w:t xml:space="preserve">4. Design variables &amp; identifiers</w:t>
       </w:r>
-      <w:bookmarkEnd w:id="46"/>
+      <w:bookmarkEnd w:id="53"/>
     </w:p>
     <w:tbl>
       <w:tblPr>
@@ -19157,11 +20874,11 @@
       <w:pPr>
         <w:pStyle w:val="Heading3"/>
       </w:pPr>
-      <w:bookmarkStart w:id="47" w:name="X3c195f35add181f24126d1dac89a38fd1df1287"/>
+      <w:bookmarkStart w:id="54" w:name="X3c195f35add181f24126d1dac89a38fd1df1287"/>
       <w:r>
         <w:t xml:space="preserve">5. Value labels of key source variables (verified)</w:t>
       </w:r>
-      <w:bookmarkEnd w:id="47"/>
+      <w:bookmarkEnd w:id="54"/>
     </w:p>
     <w:p>
       <w:pPr>
@@ -20088,11 +21805,11 @@
       <w:pPr>
         <w:pStyle w:val="Heading3"/>
       </w:pPr>
-      <w:bookmarkStart w:id="48" w:name="harmonization-decisions-caveats-malawi"/>
+      <w:bookmarkStart w:id="55" w:name="harmonization-decisions-caveats-malawi"/>
       <w:r>
         <w:t xml:space="preserve">6. Harmonization decisions &amp; caveats (Malawi)</w:t>
       </w:r>
-      <w:bookmarkEnd w:id="48"/>
+      <w:bookmarkEnd w:id="55"/>
     </w:p>
     <w:p>
       <w:pPr>
@@ -20516,11 +22233,11 @@
       <w:pPr>
         <w:pStyle w:val="Heading2"/>
       </w:pPr>
-      <w:bookmarkStart w:id="49" w:name="X3efb4428047162bb7c872e735728bee0a77b27e"/>
+      <w:bookmarkStart w:id="56" w:name="X3efb4428047162bb7c872e735728bee0a77b27e"/>
       <w:r>
         <w:t xml:space="preserve">MALI — Enquete Agricole de Conjoncture Integree (EACI)</w:t>
       </w:r>
-      <w:bookmarkEnd w:id="49"/>
+      <w:bookmarkEnd w:id="56"/>
     </w:p>
     <w:p>
       <w:pPr>
@@ -20629,11 +22346,11 @@
       <w:pPr>
         <w:pStyle w:val="Heading3"/>
       </w:pPr>
-      <w:bookmarkStart w:id="50" w:name="survey-wave-key-2"/>
+      <w:bookmarkStart w:id="57" w:name="survey-wave-key-2"/>
       <w:r>
         <w:t xml:space="preserve">1. Survey &amp; wave key</w:t>
       </w:r>
-      <w:bookmarkEnd w:id="50"/>
+      <w:bookmarkEnd w:id="57"/>
     </w:p>
     <w:tbl>
       <w:tblPr>
@@ -20997,11 +22714,11 @@
       <w:pPr>
         <w:pStyle w:val="Heading3"/>
       </w:pPr>
-      <w:bookmarkStart w:id="51" w:name="tenure-indicators-2"/>
+      <w:bookmarkStart w:id="58" w:name="tenure-indicators-2"/>
       <w:r>
         <w:t xml:space="preserve">2. Tenure indicators</w:t>
       </w:r>
-      <w:bookmarkEnd w:id="51"/>
+      <w:bookmarkEnd w:id="58"/>
     </w:p>
     <w:tbl>
       <w:tblPr>
@@ -21512,7 +23229,7 @@
       <w:pPr>
         <w:pStyle w:val="Heading3"/>
       </w:pPr>
-      <w:bookmarkStart w:id="52" w:name="parcel-area-parcel_area_ha-2"/>
+      <w:bookmarkStart w:id="59" w:name="parcel-area-parcel_area_ha-2"/>
       <w:r>
         <w:t xml:space="preserve">3. Parcel area (</w:t>
       </w:r>
@@ -21525,7 +23242,7 @@
       <w:r>
         <w:t xml:space="preserve">)</w:t>
       </w:r>
-      <w:bookmarkEnd w:id="52"/>
+      <w:bookmarkEnd w:id="59"/>
     </w:p>
     <w:p>
       <w:pPr>
@@ -21626,11 +23343,11 @@
       <w:pPr>
         <w:pStyle w:val="Heading3"/>
       </w:pPr>
-      <w:bookmarkStart w:id="53" w:name="design-variables-identifiers-2"/>
+      <w:bookmarkStart w:id="60" w:name="design-variables-identifiers-2"/>
       <w:r>
         <w:t xml:space="preserve">4. Design variables &amp; identifiers</w:t>
       </w:r>
-      <w:bookmarkEnd w:id="53"/>
+      <w:bookmarkEnd w:id="60"/>
     </w:p>
     <w:tbl>
       <w:tblPr>
@@ -22160,11 +23877,11 @@
       <w:pPr>
         <w:pStyle w:val="Heading3"/>
       </w:pPr>
-      <w:bookmarkStart w:id="54" w:name="Xd7b0f06d6741a457572b51c32edd9b036aaa263"/>
+      <w:bookmarkStart w:id="61" w:name="Xd7b0f06d6741a457572b51c32edd9b036aaa263"/>
       <w:r>
         <w:t xml:space="preserve">5. Value labels of key source variables (verified)</w:t>
       </w:r>
-      <w:bookmarkEnd w:id="54"/>
+      <w:bookmarkEnd w:id="61"/>
     </w:p>
     <w:p>
       <w:pPr>
@@ -22422,11 +24139,11 @@
       <w:pPr>
         <w:pStyle w:val="Heading3"/>
       </w:pPr>
-      <w:bookmarkStart w:id="55" w:name="harmonization-decisions-caveats-mali"/>
+      <w:bookmarkStart w:id="62" w:name="harmonization-decisions-caveats-mali"/>
       <w:r>
         <w:t xml:space="preserve">6. Harmonization decisions &amp; caveats (Mali)</w:t>
       </w:r>
-      <w:bookmarkEnd w:id="55"/>
+      <w:bookmarkEnd w:id="62"/>
     </w:p>
     <w:p>
       <w:pPr>
@@ -22934,11 +24651,11 @@
       <w:pPr>
         <w:pStyle w:val="Heading2"/>
       </w:pPr>
-      <w:bookmarkStart w:id="56" w:name="X14eb90961d7c4eda69428154c7d8401e18ed92a"/>
+      <w:bookmarkStart w:id="63" w:name="X14eb90961d7c4eda69428154c7d8401e18ed92a"/>
       <w:r>
         <w:t xml:space="preserve">NIGER — Enquete Nationale sur les Conditions de Vie (ECVMA)</w:t>
       </w:r>
-      <w:bookmarkEnd w:id="56"/>
+      <w:bookmarkEnd w:id="63"/>
     </w:p>
     <w:p>
       <w:pPr>
@@ -23041,11 +24758,11 @@
       <w:pPr>
         <w:pStyle w:val="Heading3"/>
       </w:pPr>
-      <w:bookmarkStart w:id="57" w:name="survey-wave-key-3"/>
+      <w:bookmarkStart w:id="64" w:name="survey-wave-key-3"/>
       <w:r>
         <w:t xml:space="preserve">1. Survey &amp; wave key</w:t>
       </w:r>
-      <w:bookmarkEnd w:id="57"/>
+      <w:bookmarkEnd w:id="64"/>
     </w:p>
     <w:tbl>
       <w:tblPr>
@@ -23433,11 +25150,11 @@
       <w:pPr>
         <w:pStyle w:val="Heading3"/>
       </w:pPr>
-      <w:bookmarkStart w:id="58" w:name="tenure-indicators-3"/>
+      <w:bookmarkStart w:id="65" w:name="tenure-indicators-3"/>
       <w:r>
         <w:t xml:space="preserve">2. Tenure indicators</w:t>
       </w:r>
-      <w:bookmarkEnd w:id="58"/>
+      <w:bookmarkEnd w:id="65"/>
     </w:p>
     <w:tbl>
       <w:tblPr>
@@ -24053,7 +25770,7 @@
       <w:pPr>
         <w:pStyle w:val="Heading3"/>
       </w:pPr>
-      <w:bookmarkStart w:id="59" w:name="parcel-area-parcel_area_ha-3"/>
+      <w:bookmarkStart w:id="66" w:name="parcel-area-parcel_area_ha-3"/>
       <w:r>
         <w:t xml:space="preserve">3. Parcel area (</w:t>
       </w:r>
@@ -24066,7 +25783,7 @@
       <w:r>
         <w:t xml:space="preserve">)</w:t>
       </w:r>
-      <w:bookmarkEnd w:id="59"/>
+      <w:bookmarkEnd w:id="66"/>
     </w:p>
     <w:p>
       <w:pPr>
@@ -24134,11 +25851,11 @@
       <w:pPr>
         <w:pStyle w:val="Heading3"/>
       </w:pPr>
-      <w:bookmarkStart w:id="60" w:name="design-variables-identifiers-3"/>
+      <w:bookmarkStart w:id="67" w:name="design-variables-identifiers-3"/>
       <w:r>
         <w:t xml:space="preserve">4. Design variables &amp; identifiers</w:t>
       </w:r>
-      <w:bookmarkEnd w:id="60"/>
+      <w:bookmarkEnd w:id="67"/>
     </w:p>
     <w:tbl>
       <w:tblPr>
@@ -24738,11 +26455,11 @@
       <w:pPr>
         <w:pStyle w:val="Heading3"/>
       </w:pPr>
-      <w:bookmarkStart w:id="61" w:name="X646e8461e11ea76f2f34efa79915905fa78ad77"/>
+      <w:bookmarkStart w:id="68" w:name="X646e8461e11ea76f2f34efa79915905fa78ad77"/>
       <w:r>
         <w:t xml:space="preserve">5. Value labels of key source variables (verified)</w:t>
       </w:r>
-      <w:bookmarkEnd w:id="61"/>
+      <w:bookmarkEnd w:id="68"/>
     </w:p>
     <w:p>
       <w:pPr>
@@ -25050,11 +26767,11 @@
       <w:pPr>
         <w:pStyle w:val="Heading3"/>
       </w:pPr>
-      <w:bookmarkStart w:id="62" w:name="harmonization-decisions-caveats-niger"/>
+      <w:bookmarkStart w:id="69" w:name="harmonization-decisions-caveats-niger"/>
       <w:r>
         <w:t xml:space="preserve">6. Harmonization decisions &amp; caveats (Niger)</w:t>
       </w:r>
-      <w:bookmarkEnd w:id="62"/>
+      <w:bookmarkEnd w:id="69"/>
     </w:p>
     <w:p>
       <w:pPr>
@@ -25385,11 +27102,11 @@
       <w:pPr>
         <w:pStyle w:val="Heading2"/>
       </w:pPr>
-      <w:bookmarkStart w:id="63" w:name="X4370d6f7e22f04e7f2986bdcf7fe062ac53545f"/>
+      <w:bookmarkStart w:id="70" w:name="X4370d6f7e22f04e7f2986bdcf7fe062ac53545f"/>
       <w:r>
         <w:t xml:space="preserve">NIGERIA — General Household Survey-Panel (GHS)</w:t>
       </w:r>
-      <w:bookmarkEnd w:id="63"/>
+      <w:bookmarkEnd w:id="70"/>
     </w:p>
     <w:p>
       <w:pPr>
@@ -25495,11 +27212,11 @@
       <w:pPr>
         <w:pStyle w:val="Heading3"/>
       </w:pPr>
-      <w:bookmarkStart w:id="64" w:name="survey-wave-key-4"/>
+      <w:bookmarkStart w:id="71" w:name="survey-wave-key-4"/>
       <w:r>
         <w:t xml:space="preserve">1. Survey &amp; wave key</w:t>
       </w:r>
-      <w:bookmarkEnd w:id="64"/>
+      <w:bookmarkEnd w:id="71"/>
     </w:p>
     <w:tbl>
       <w:tblPr>
@@ -25963,11 +27680,11 @@
       <w:pPr>
         <w:pStyle w:val="Heading3"/>
       </w:pPr>
-      <w:bookmarkStart w:id="65" w:name="tenure-indicators-4"/>
+      <w:bookmarkStart w:id="72" w:name="tenure-indicators-4"/>
       <w:r>
         <w:t xml:space="preserve">2. Tenure indicators</w:t>
       </w:r>
-      <w:bookmarkEnd w:id="65"/>
+      <w:bookmarkEnd w:id="72"/>
     </w:p>
     <w:tbl>
       <w:tblPr>
@@ -26698,7 +28415,7 @@
       <w:pPr>
         <w:pStyle w:val="Heading3"/>
       </w:pPr>
-      <w:bookmarkStart w:id="66" w:name="parcel-area-parcel_area_ha-4"/>
+      <w:bookmarkStart w:id="73" w:name="parcel-area-parcel_area_ha-4"/>
       <w:r>
         <w:t xml:space="preserve">3. Parcel area (</w:t>
       </w:r>
@@ -26711,7 +28428,7 @@
       <w:r>
         <w:t xml:space="preserve">)</w:t>
       </w:r>
-      <w:bookmarkEnd w:id="66"/>
+      <w:bookmarkEnd w:id="73"/>
     </w:p>
     <w:p>
       <w:pPr>
@@ -26965,11 +28682,11 @@
       <w:pPr>
         <w:pStyle w:val="Heading3"/>
       </w:pPr>
-      <w:bookmarkStart w:id="67" w:name="design-variables-identifiers-4"/>
+      <w:bookmarkStart w:id="74" w:name="design-variables-identifiers-4"/>
       <w:r>
         <w:t xml:space="preserve">4. Design variables &amp; identifiers</w:t>
       </w:r>
-      <w:bookmarkEnd w:id="67"/>
+      <w:bookmarkEnd w:id="74"/>
     </w:p>
     <w:tbl>
       <w:tblPr>
@@ -27444,11 +29161,11 @@
       <w:pPr>
         <w:pStyle w:val="Heading3"/>
       </w:pPr>
-      <w:bookmarkStart w:id="68" w:name="Xb4d582268a3ea5115cbf391ae4ab1d6685f948d"/>
+      <w:bookmarkStart w:id="75" w:name="Xb4d582268a3ea5115cbf391ae4ab1d6685f948d"/>
       <w:r>
         <w:t xml:space="preserve">5. Value labels of key source variables (verified for GHS10; consistent instrument)</w:t>
       </w:r>
-      <w:bookmarkEnd w:id="68"/>
+      <w:bookmarkEnd w:id="75"/>
     </w:p>
     <w:p>
       <w:pPr>
@@ -27694,11 +29411,11 @@
       <w:pPr>
         <w:pStyle w:val="Heading3"/>
       </w:pPr>
-      <w:bookmarkStart w:id="69" w:name="harmonization-decisions-caveats-nigeria"/>
+      <w:bookmarkStart w:id="76" w:name="harmonization-decisions-caveats-nigeria"/>
       <w:r>
         <w:t xml:space="preserve">6. Harmonization decisions &amp; caveats (Nigeria)</w:t>
       </w:r>
-      <w:bookmarkEnd w:id="69"/>
+      <w:bookmarkEnd w:id="76"/>
     </w:p>
     <w:p>
       <w:pPr>
@@ -28008,11 +29725,11 @@
       <w:pPr>
         <w:pStyle w:val="Heading2"/>
       </w:pPr>
-      <w:bookmarkStart w:id="70" w:name="tanzania-national-panel-survey-nps"/>
+      <w:bookmarkStart w:id="77" w:name="tanzania-national-panel-survey-nps"/>
       <w:r>
         <w:t xml:space="preserve">TANZANIA — National Panel Survey (NPS)</w:t>
       </w:r>
-      <w:bookmarkEnd w:id="70"/>
+      <w:bookmarkEnd w:id="77"/>
     </w:p>
     <w:p>
       <w:pPr>
@@ -28187,11 +29904,11 @@
       <w:pPr>
         <w:pStyle w:val="Heading3"/>
       </w:pPr>
-      <w:bookmarkStart w:id="71" w:name="survey-wave-key-5"/>
+      <w:bookmarkStart w:id="78" w:name="survey-wave-key-5"/>
       <w:r>
         <w:t xml:space="preserve">1. Survey &amp; wave key</w:t>
       </w:r>
-      <w:bookmarkEnd w:id="71"/>
+      <w:bookmarkEnd w:id="78"/>
     </w:p>
     <w:tbl>
       <w:tblPr>
@@ -28819,11 +30536,11 @@
       <w:pPr>
         <w:pStyle w:val="Heading3"/>
       </w:pPr>
-      <w:bookmarkStart w:id="72" w:name="tenure-indicators-5"/>
+      <w:bookmarkStart w:id="79" w:name="tenure-indicators-5"/>
       <w:r>
         <w:t xml:space="preserve">2. Tenure indicators</w:t>
       </w:r>
-      <w:bookmarkEnd w:id="72"/>
+      <w:bookmarkEnd w:id="79"/>
     </w:p>
     <w:tbl>
       <w:tblPr>
@@ -29517,7 +31234,7 @@
       <w:pPr>
         <w:pStyle w:val="Heading3"/>
       </w:pPr>
-      <w:bookmarkStart w:id="73" w:name="parcel-area-parcel_area_ha-5"/>
+      <w:bookmarkStart w:id="80" w:name="parcel-area-parcel_area_ha-5"/>
       <w:r>
         <w:t xml:space="preserve">3. Parcel area (</w:t>
       </w:r>
@@ -29530,7 +31247,7 @@
       <w:r>
         <w:t xml:space="preserve">)</w:t>
       </w:r>
-      <w:bookmarkEnd w:id="73"/>
+      <w:bookmarkEnd w:id="80"/>
     </w:p>
     <w:p>
       <w:pPr>
@@ -29622,11 +31339,11 @@
       <w:pPr>
         <w:pStyle w:val="Heading3"/>
       </w:pPr>
-      <w:bookmarkStart w:id="74" w:name="design-variables-identifiers-5"/>
+      <w:bookmarkStart w:id="81" w:name="design-variables-identifiers-5"/>
       <w:r>
         <w:t xml:space="preserve">4. Design variables &amp; identifiers</w:t>
       </w:r>
-      <w:bookmarkEnd w:id="74"/>
+      <w:bookmarkEnd w:id="81"/>
     </w:p>
     <w:tbl>
       <w:tblPr>
@@ -29993,11 +31710,11 @@
       <w:pPr>
         <w:pStyle w:val="Heading3"/>
       </w:pPr>
-      <w:bookmarkStart w:id="75" w:name="X8b517451fc0444510e3f71dace152c3da4f1fbf"/>
+      <w:bookmarkStart w:id="82" w:name="X8b517451fc0444510e3f71dace152c3da4f1fbf"/>
       <w:r>
         <w:t xml:space="preserve">5. Value labels of key source variables (verified)</w:t>
       </w:r>
-      <w:bookmarkEnd w:id="75"/>
+      <w:bookmarkEnd w:id="82"/>
     </w:p>
     <w:p>
       <w:pPr>
@@ -30258,11 +31975,11 @@
       <w:pPr>
         <w:pStyle w:val="Heading3"/>
       </w:pPr>
-      <w:bookmarkStart w:id="76" w:name="harmonization-decisions-caveats-tanzania"/>
+      <w:bookmarkStart w:id="83" w:name="harmonization-decisions-caveats-tanzania"/>
       <w:r>
         <w:t xml:space="preserve">6. Harmonization decisions &amp; caveats (Tanzania)</w:t>
       </w:r>
-      <w:bookmarkEnd w:id="76"/>
+      <w:bookmarkEnd w:id="83"/>
     </w:p>
     <w:p>
       <w:pPr>
@@ -30545,11 +32262,11 @@
       <w:pPr>
         <w:pStyle w:val="Heading2"/>
       </w:pPr>
-      <w:bookmarkStart w:id="77" w:name="uganda-national-panel-survey-unps"/>
+      <w:bookmarkStart w:id="84" w:name="uganda-national-panel-survey-unps"/>
       <w:r>
         <w:t xml:space="preserve">UGANDA — National Panel Survey (UNPS)</w:t>
       </w:r>
-      <w:bookmarkEnd w:id="77"/>
+      <w:bookmarkEnd w:id="84"/>
     </w:p>
     <w:p>
       <w:pPr>
@@ -31105,11 +32822,11 @@
       <w:pPr>
         <w:pStyle w:val="Heading3"/>
       </w:pPr>
-      <w:bookmarkStart w:id="78" w:name="survey-wave-key-6"/>
+      <w:bookmarkStart w:id="85" w:name="survey-wave-key-6"/>
       <w:r>
         <w:t xml:space="preserve">1. Survey &amp; wave key</w:t>
       </w:r>
-      <w:bookmarkEnd w:id="78"/>
+      <w:bookmarkEnd w:id="85"/>
     </w:p>
     <w:tbl>
       <w:tblPr>
@@ -31872,11 +33589,11 @@
       <w:pPr>
         <w:pStyle w:val="Heading3"/>
       </w:pPr>
-      <w:bookmarkStart w:id="79" w:name="tenure-indicators-6"/>
+      <w:bookmarkStart w:id="86" w:name="tenure-indicators-6"/>
       <w:r>
         <w:t xml:space="preserve">2. Tenure indicators</w:t>
       </w:r>
-      <w:bookmarkEnd w:id="79"/>
+      <w:bookmarkEnd w:id="86"/>
     </w:p>
     <w:tbl>
       <w:tblPr>
@@ -32536,7 +34253,7 @@
       <w:pPr>
         <w:pStyle w:val="Heading3"/>
       </w:pPr>
-      <w:bookmarkStart w:id="80" w:name="parcel-area-parcel_area_ha-6"/>
+      <w:bookmarkStart w:id="87" w:name="parcel-area-parcel_area_ha-6"/>
       <w:r>
         <w:t xml:space="preserve">3. Parcel area (</w:t>
       </w:r>
@@ -32549,7 +34266,7 @@
       <w:r>
         <w:t xml:space="preserve">)</w:t>
       </w:r>
-      <w:bookmarkEnd w:id="80"/>
+      <w:bookmarkEnd w:id="87"/>
     </w:p>
     <w:p>
       <w:pPr>
@@ -32692,11 +34409,11 @@
       <w:pPr>
         <w:pStyle w:val="Heading3"/>
       </w:pPr>
-      <w:bookmarkStart w:id="81" w:name="design-variables-identifiers-6"/>
+      <w:bookmarkStart w:id="88" w:name="design-variables-identifiers-6"/>
       <w:r>
         <w:t xml:space="preserve">4. Design variables &amp; identifiers</w:t>
       </w:r>
-      <w:bookmarkEnd w:id="81"/>
+      <w:bookmarkEnd w:id="88"/>
     </w:p>
     <w:tbl>
       <w:tblPr>
@@ -33071,11 +34788,11 @@
       <w:pPr>
         <w:pStyle w:val="Heading3"/>
       </w:pPr>
-      <w:bookmarkStart w:id="82" w:name="X41b3da375b96f03c8be77259d3c225da7481aa7"/>
+      <w:bookmarkStart w:id="89" w:name="X41b3da375b96f03c8be77259d3c225da7481aa7"/>
       <w:r>
         <w:t xml:space="preserve">5. Value labels of key source variables (verified against the raw rosters)</w:t>
       </w:r>
-      <w:bookmarkEnd w:id="82"/>
+      <w:bookmarkEnd w:id="89"/>
     </w:p>
     <w:p>
       <w:pPr>
@@ -33326,11 +35043,11 @@
       <w:pPr>
         <w:pStyle w:val="Heading3"/>
       </w:pPr>
-      <w:bookmarkStart w:id="83" w:name="harmonization-decisions-caveats-uganda"/>
+      <w:bookmarkStart w:id="90" w:name="harmonization-decisions-caveats-uganda"/>
       <w:r>
         <w:t xml:space="preserve">6. Harmonization decisions &amp; caveats (Uganda)</w:t>
       </w:r>
-      <w:bookmarkEnd w:id="83"/>
+      <w:bookmarkEnd w:id="90"/>
     </w:p>
     <w:p>
       <w:pPr>
@@ -33934,7 +35651,7 @@
       <w:pPr>
         <w:pStyle w:val="Heading2"/>
       </w:pPr>
-      <w:bookmarkStart w:id="84" w:name="X0b2950cf25400957611bc3f965c1c43185957b6"/>
+      <w:bookmarkStart w:id="91" w:name="X0b2950cf25400957611bc3f965c1c43185957b6"/>
       <w:r>
         <w:t xml:space="preserve">ZAMBIA — Rural Agricultural Livelihoods Survey (RALS)</w:t>
       </w:r>
@@ -33947,7 +35664,7 @@
         </w:rPr>
         <w:t xml:space="preserve">(non-LSMS-ISA)</w:t>
       </w:r>
-      <w:bookmarkEnd w:id="84"/>
+      <w:bookmarkEnd w:id="91"/>
     </w:p>
     <w:p>
       <w:pPr>
@@ -34134,11 +35851,11 @@
       <w:pPr>
         <w:pStyle w:val="Heading3"/>
       </w:pPr>
-      <w:bookmarkStart w:id="85" w:name="survey-wave-key-7"/>
+      <w:bookmarkStart w:id="92" w:name="survey-wave-key-7"/>
       <w:r>
         <w:t xml:space="preserve">1. Survey &amp; wave key</w:t>
       </w:r>
-      <w:bookmarkEnd w:id="85"/>
+      <w:bookmarkEnd w:id="92"/>
     </w:p>
     <w:tbl>
       <w:tblPr>
@@ -34679,11 +36396,11 @@
       <w:pPr>
         <w:pStyle w:val="Heading3"/>
       </w:pPr>
-      <w:bookmarkStart w:id="86" w:name="tenure-indicators-7"/>
+      <w:bookmarkStart w:id="93" w:name="tenure-indicators-7"/>
       <w:r>
         <w:t xml:space="preserve">2. Tenure indicators</w:t>
       </w:r>
-      <w:bookmarkEnd w:id="86"/>
+      <w:bookmarkEnd w:id="93"/>
     </w:p>
     <w:tbl>
       <w:tblPr>
@@ -35055,7 +36772,7 @@
       <w:pPr>
         <w:pStyle w:val="Heading3"/>
       </w:pPr>
-      <w:bookmarkStart w:id="87" w:name="parcel-area-parcel_area_ha-7"/>
+      <w:bookmarkStart w:id="94" w:name="parcel-area-parcel_area_ha-7"/>
       <w:r>
         <w:t xml:space="preserve">3. Parcel area (</w:t>
       </w:r>
@@ -35068,7 +36785,7 @@
       <w:r>
         <w:t xml:space="preserve">)</w:t>
       </w:r>
-      <w:bookmarkEnd w:id="87"/>
+      <w:bookmarkEnd w:id="94"/>
     </w:p>
     <w:p>
       <w:pPr>
@@ -35151,11 +36868,11 @@
       <w:pPr>
         <w:pStyle w:val="Heading3"/>
       </w:pPr>
-      <w:bookmarkStart w:id="88" w:name="design-variables-identifiers-7"/>
+      <w:bookmarkStart w:id="95" w:name="design-variables-identifiers-7"/>
       <w:r>
         <w:t xml:space="preserve">4. Design variables &amp; identifiers</w:t>
       </w:r>
-      <w:bookmarkEnd w:id="88"/>
+      <w:bookmarkEnd w:id="95"/>
     </w:p>
     <w:tbl>
       <w:tblPr>
@@ -35509,7 +37226,7 @@
       <w:pPr>
         <w:pStyle w:val="Heading3"/>
       </w:pPr>
-      <w:bookmarkStart w:id="89" w:name="X5ba80d23c7ef9fd2e661850521d15998b8e8ba0"/>
+      <w:bookmarkStart w:id="96" w:name="X5ba80d23c7ef9fd2e661850521d15998b8e8ba0"/>
       <w:r>
         <w:t xml:space="preserve">5.</w:t>
       </w:r>
@@ -35528,7 +37245,7 @@
       <w:r>
         <w:t xml:space="preserve">tenure status - per-wave title map (the categories expand)</w:t>
       </w:r>
-      <w:bookmarkEnd w:id="89"/>
+      <w:bookmarkEnd w:id="96"/>
     </w:p>
     <w:p>
       <w:pPr>
@@ -35891,11 +37608,11 @@
       <w:pPr>
         <w:pStyle w:val="Heading3"/>
       </w:pPr>
-      <w:bookmarkStart w:id="90" w:name="harmonization-decisions-caveats-zambia"/>
+      <w:bookmarkStart w:id="97" w:name="harmonization-decisions-caveats-zambia"/>
       <w:r>
         <w:t xml:space="preserve">6. Harmonization decisions &amp; caveats (Zambia)</w:t>
       </w:r>
-      <w:bookmarkEnd w:id="90"/>
+      <w:bookmarkEnd w:id="97"/>
     </w:p>
     <w:p>
       <w:pPr>

</xml_diff>

<commit_message>
Add Tanzania ASC (smallholder, 2009/2019) extractor + MASTER wiring; Section 7 Uganda catalog links; ASC rows in coverage + source tables
</commit_message>
<xml_diff>
--- a/Report/consolidated_report.docx
+++ b/Report/consolidated_report.docx
@@ -627,6 +627,52 @@
             </w:pPr>
             <w:r>
               <w:t xml:space="preserve">field</w:t>
+            </w:r>
+          </w:p>
+        </w:tc>
+      </w:tr>
+      <w:tr>
+        <w:tc>
+          <w:p>
+            <w:pPr>
+              <w:pStyle w:val="Compact"/>
+              <w:jc w:val="left"/>
+            </w:pPr>
+            <w:r>
+              <w:t xml:space="preserve">Tanzania (ASC)</w:t>
+            </w:r>
+          </w:p>
+        </w:tc>
+        <w:tc>
+          <w:p>
+            <w:pPr>
+              <w:pStyle w:val="Compact"/>
+              <w:jc w:val="left"/>
+            </w:pPr>
+            <w:r>
+              <w:t xml:space="preserve">Agric. Sample Census (NBS)</w:t>
+            </w:r>
+          </w:p>
+        </w:tc>
+        <w:tc>
+          <w:p>
+            <w:pPr>
+              <w:pStyle w:val="Compact"/>
+              <w:jc w:val="left"/>
+            </w:pPr>
+            <w:r>
+              <w:t xml:space="preserve">2009, 2019</w:t>
+            </w:r>
+          </w:p>
+        </w:tc>
+        <w:tc>
+          <w:p>
+            <w:pPr>
+              <w:pStyle w:val="Compact"/>
+              <w:jc w:val="left"/>
+            </w:pPr>
+            <w:r>
+              <w:t xml:space="preserve">household (land by tenure category)</w:t>
             </w:r>
           </w:p>
         </w:tc>
@@ -11398,11 +11444,341 @@
               <w:pStyle w:val="Compact"/>
               <w:jc w:val="left"/>
             </w:pPr>
+            <w:hyperlink r:id="rId41">
+              <w:r>
+                <w:rPr>
+                  <w:rStyle w:val="Hyperlink"/>
+                </w:rPr>
+                <w:t xml:space="preserve">UNPS 2009/10</w:t>
+              </w:r>
+            </w:hyperlink>
+          </w:p>
+        </w:tc>
+      </w:tr>
+      <w:tr>
+        <w:tc>
+          <w:p/>
+        </w:tc>
+        <w:tc>
+          <w:p>
+            <w:pPr>
+              <w:pStyle w:val="Compact"/>
+              <w:jc w:val="left"/>
+            </w:pPr>
+            <w:r>
+              <w:t xml:space="preserve">2010</w:t>
+            </w:r>
+          </w:p>
+        </w:tc>
+        <w:tc>
+          <w:p>
+            <w:pPr>
+              <w:pStyle w:val="Compact"/>
+              <w:jc w:val="left"/>
+            </w:pPr>
+            <w:r>
+              <w:rPr>
+                <w:rStyle w:val="VerbatimChar"/>
+              </w:rPr>
+              <w:t xml:space="preserve">AGSEC2A.dta</w:t>
+            </w:r>
+          </w:p>
+        </w:tc>
+        <w:tc>
+          <w:p>
+            <w:pPr>
+              <w:pStyle w:val="Compact"/>
+              <w:jc w:val="left"/>
+            </w:pPr>
+            <w:hyperlink r:id="rId42">
+              <w:r>
+                <w:rPr>
+                  <w:rStyle w:val="Hyperlink"/>
+                </w:rPr>
+                <w:t xml:space="preserve">UNPS 2010/11</w:t>
+              </w:r>
+            </w:hyperlink>
+          </w:p>
+        </w:tc>
+      </w:tr>
+      <w:tr>
+        <w:tc>
+          <w:p/>
+        </w:tc>
+        <w:tc>
+          <w:p>
+            <w:pPr>
+              <w:pStyle w:val="Compact"/>
+              <w:jc w:val="left"/>
+            </w:pPr>
+            <w:r>
+              <w:t xml:space="preserve">2011</w:t>
+            </w:r>
+          </w:p>
+        </w:tc>
+        <w:tc>
+          <w:p>
+            <w:pPr>
+              <w:pStyle w:val="Compact"/>
+              <w:jc w:val="left"/>
+            </w:pPr>
+            <w:r>
+              <w:rPr>
+                <w:rStyle w:val="VerbatimChar"/>
+              </w:rPr>
+              <w:t xml:space="preserve">AGSEC2A.dta</w:t>
+            </w:r>
+          </w:p>
+        </w:tc>
+        <w:tc>
+          <w:p>
+            <w:pPr>
+              <w:pStyle w:val="Compact"/>
+              <w:jc w:val="left"/>
+            </w:pPr>
+            <w:hyperlink r:id="rId43">
+              <w:r>
+                <w:rPr>
+                  <w:rStyle w:val="Hyperlink"/>
+                </w:rPr>
+                <w:t xml:space="preserve">UNPS 2011/12</w:t>
+              </w:r>
+            </w:hyperlink>
+          </w:p>
+        </w:tc>
+      </w:tr>
+      <w:tr>
+        <w:tc>
+          <w:p/>
+        </w:tc>
+        <w:tc>
+          <w:p>
+            <w:pPr>
+              <w:pStyle w:val="Compact"/>
+              <w:jc w:val="left"/>
+            </w:pPr>
+            <w:r>
+              <w:t xml:space="preserve">2013</w:t>
+            </w:r>
+          </w:p>
+        </w:tc>
+        <w:tc>
+          <w:p>
+            <w:pPr>
+              <w:pStyle w:val="Compact"/>
+              <w:jc w:val="left"/>
+            </w:pPr>
+            <w:r>
+              <w:rPr>
+                <w:rStyle w:val="VerbatimChar"/>
+              </w:rPr>
+              <w:t xml:space="preserve">AGSEC2A.dta</w:t>
+            </w:r>
+          </w:p>
+        </w:tc>
+        <w:tc>
+          <w:p>
+            <w:pPr>
+              <w:pStyle w:val="Compact"/>
+              <w:jc w:val="left"/>
+            </w:pPr>
+            <w:hyperlink r:id="rId44">
+              <w:r>
+                <w:rPr>
+                  <w:rStyle w:val="Hyperlink"/>
+                </w:rPr>
+                <w:t xml:space="preserve">UNPS 2013/14</w:t>
+              </w:r>
+            </w:hyperlink>
+          </w:p>
+        </w:tc>
+      </w:tr>
+      <w:tr>
+        <w:tc>
+          <w:p/>
+        </w:tc>
+        <w:tc>
+          <w:p>
+            <w:pPr>
+              <w:pStyle w:val="Compact"/>
+              <w:jc w:val="left"/>
+            </w:pPr>
+            <w:r>
+              <w:t xml:space="preserve">2015</w:t>
+            </w:r>
+          </w:p>
+        </w:tc>
+        <w:tc>
+          <w:p>
+            <w:pPr>
+              <w:pStyle w:val="Compact"/>
+              <w:jc w:val="left"/>
+            </w:pPr>
+            <w:r>
+              <w:rPr>
+                <w:rStyle w:val="VerbatimChar"/>
+              </w:rPr>
+              <w:t xml:space="preserve">AGSEC2A.dta</w:t>
+            </w:r>
+          </w:p>
+        </w:tc>
+        <w:tc>
+          <w:p>
+            <w:pPr>
+              <w:pStyle w:val="Compact"/>
+              <w:jc w:val="left"/>
+            </w:pPr>
+            <w:hyperlink r:id="rId45">
+              <w:r>
+                <w:rPr>
+                  <w:rStyle w:val="Hyperlink"/>
+                </w:rPr>
+                <w:t xml:space="preserve">UNPS 2015/16</w:t>
+              </w:r>
+            </w:hyperlink>
+          </w:p>
+        </w:tc>
+      </w:tr>
+      <w:tr>
+        <w:tc>
+          <w:p/>
+        </w:tc>
+        <w:tc>
+          <w:p>
+            <w:pPr>
+              <w:pStyle w:val="Compact"/>
+              <w:jc w:val="left"/>
+            </w:pPr>
+            <w:r>
+              <w:t xml:space="preserve">2018</w:t>
+            </w:r>
+          </w:p>
+        </w:tc>
+        <w:tc>
+          <w:p>
+            <w:pPr>
+              <w:pStyle w:val="Compact"/>
+              <w:jc w:val="left"/>
+            </w:pPr>
+            <w:r>
+              <w:rPr>
+                <w:rStyle w:val="VerbatimChar"/>
+              </w:rPr>
+              <w:t xml:space="preserve">AGSEC2A.dta</w:t>
+            </w:r>
+          </w:p>
+        </w:tc>
+        <w:tc>
+          <w:p>
+            <w:pPr>
+              <w:pStyle w:val="Compact"/>
+              <w:jc w:val="left"/>
+            </w:pPr>
+            <w:hyperlink r:id="rId46">
+              <w:r>
+                <w:rPr>
+                  <w:rStyle w:val="Hyperlink"/>
+                </w:rPr>
+                <w:t xml:space="preserve">UNPS 2018/19</w:t>
+              </w:r>
+            </w:hyperlink>
+          </w:p>
+        </w:tc>
+      </w:tr>
+      <w:tr>
+        <w:tc>
+          <w:p/>
+        </w:tc>
+        <w:tc>
+          <w:p>
+            <w:pPr>
+              <w:pStyle w:val="Compact"/>
+              <w:jc w:val="left"/>
+            </w:pPr>
+            <w:r>
+              <w:t xml:space="preserve">2019</w:t>
+            </w:r>
+          </w:p>
+        </w:tc>
+        <w:tc>
+          <w:p>
+            <w:pPr>
+              <w:pStyle w:val="Compact"/>
+              <w:jc w:val="left"/>
+            </w:pPr>
+            <w:r>
+              <w:rPr>
+                <w:rStyle w:val="VerbatimChar"/>
+              </w:rPr>
+              <w:t xml:space="preserve">agsec2a.dta</w:t>
+            </w:r>
+          </w:p>
+        </w:tc>
+        <w:tc>
+          <w:p>
+            <w:pPr>
+              <w:pStyle w:val="Compact"/>
+              <w:jc w:val="left"/>
+            </w:pPr>
+            <w:hyperlink r:id="rId47">
+              <w:r>
+                <w:rPr>
+                  <w:rStyle w:val="Hyperlink"/>
+                </w:rPr>
+                <w:t xml:space="preserve">UNPS 2019/20</w:t>
+              </w:r>
+            </w:hyperlink>
+          </w:p>
+        </w:tc>
+      </w:tr>
+      <w:tr>
+        <w:tc>
+          <w:p>
+            <w:pPr>
+              <w:pStyle w:val="Compact"/>
+              <w:jc w:val="left"/>
+            </w:pPr>
+            <w:r>
+              <w:t xml:space="preserve">Zambia</w:t>
+            </w:r>
+          </w:p>
+        </w:tc>
+        <w:tc>
+          <w:p>
+            <w:pPr>
+              <w:pStyle w:val="Compact"/>
+              <w:jc w:val="left"/>
+            </w:pPr>
+            <w:r>
+              <w:t xml:space="preserve">2012</w:t>
+            </w:r>
+          </w:p>
+        </w:tc>
+        <w:tc>
+          <w:p>
+            <w:pPr>
+              <w:pStyle w:val="Compact"/>
+              <w:jc w:val="left"/>
+            </w:pPr>
+            <w:r>
+              <w:rPr>
+                <w:rStyle w:val="VerbatimChar"/>
+              </w:rPr>
+              <w:t xml:space="preserve">field.dta</w:t>
+            </w:r>
+          </w:p>
+        </w:tc>
+        <w:tc>
+          <w:p>
+            <w:pPr>
+              <w:pStyle w:val="Compact"/>
+              <w:jc w:val="left"/>
+            </w:pPr>
             <w:r>
               <w:rPr>
                 <w:i/>
               </w:rPr>
-              <w:t xml:space="preserve">(pending)</w:t>
+              <w:t xml:space="preserve">(pending; IAPRI)</w:t>
             </w:r>
           </w:p>
         </w:tc>
@@ -11418,21 +11794,21 @@
               <w:jc w:val="left"/>
             </w:pPr>
             <w:r>
-              <w:t xml:space="preserve">2010</w:t>
-            </w:r>
-          </w:p>
-        </w:tc>
-        <w:tc>
-          <w:p>
-            <w:pPr>
-              <w:pStyle w:val="Compact"/>
-              <w:jc w:val="left"/>
-            </w:pPr>
-            <w:r>
-              <w:rPr>
-                <w:rStyle w:val="VerbatimChar"/>
-              </w:rPr>
-              <w:t xml:space="preserve">AGSEC2A.dta</w:t>
+              <w:t xml:space="preserve">2015</w:t>
+            </w:r>
+          </w:p>
+        </w:tc>
+        <w:tc>
+          <w:p>
+            <w:pPr>
+              <w:pStyle w:val="Compact"/>
+              <w:jc w:val="left"/>
+            </w:pPr>
+            <w:r>
+              <w:rPr>
+                <w:rStyle w:val="VerbatimChar"/>
+              </w:rPr>
+              <w:t xml:space="preserve">field.dta</w:t>
             </w:r>
           </w:p>
         </w:tc>
@@ -11446,7 +11822,7 @@
               <w:rPr>
                 <w:i/>
               </w:rPr>
-              <w:t xml:space="preserve">(pending)</w:t>
+              <w:t xml:space="preserve">(pending; IAPRI)</w:t>
             </w:r>
           </w:p>
         </w:tc>
@@ -11462,21 +11838,21 @@
               <w:jc w:val="left"/>
             </w:pPr>
             <w:r>
-              <w:t xml:space="preserve">2011</w:t>
-            </w:r>
-          </w:p>
-        </w:tc>
-        <w:tc>
-          <w:p>
-            <w:pPr>
-              <w:pStyle w:val="Compact"/>
-              <w:jc w:val="left"/>
-            </w:pPr>
-            <w:r>
-              <w:rPr>
-                <w:rStyle w:val="VerbatimChar"/>
-              </w:rPr>
-              <w:t xml:space="preserve">AGSEC2A.dta</w:t>
+              <w:t xml:space="preserve">2019</w:t>
+            </w:r>
+          </w:p>
+        </w:tc>
+        <w:tc>
+          <w:p>
+            <w:pPr>
+              <w:pStyle w:val="Compact"/>
+              <w:jc w:val="left"/>
+            </w:pPr>
+            <w:r>
+              <w:rPr>
+                <w:rStyle w:val="VerbatimChar"/>
+              </w:rPr>
+              <w:t xml:space="preserve">field.dta</w:t>
             </w:r>
           </w:p>
         </w:tc>
@@ -11490,7 +11866,65 @@
               <w:rPr>
                 <w:i/>
               </w:rPr>
-              <w:t xml:space="preserve">(pending)</w:t>
+              <w:t xml:space="preserve">(pending; IAPRI)</w:t>
+            </w:r>
+          </w:p>
+        </w:tc>
+      </w:tr>
+      <w:tr>
+        <w:tc>
+          <w:p>
+            <w:pPr>
+              <w:pStyle w:val="Compact"/>
+              <w:jc w:val="left"/>
+            </w:pPr>
+            <w:r>
+              <w:t xml:space="preserve">Tanzania (ASC)</w:t>
+            </w:r>
+          </w:p>
+        </w:tc>
+        <w:tc>
+          <w:p>
+            <w:pPr>
+              <w:pStyle w:val="Compact"/>
+              <w:jc w:val="left"/>
+            </w:pPr>
+            <w:r>
+              <w:t xml:space="preserve">2009</w:t>
+            </w:r>
+          </w:p>
+        </w:tc>
+        <w:tc>
+          <w:p>
+            <w:pPr>
+              <w:pStyle w:val="Compact"/>
+              <w:jc w:val="left"/>
+            </w:pPr>
+            <w:r>
+              <w:rPr>
+                <w:rStyle w:val="VerbatimChar"/>
+              </w:rPr>
+              <w:t xml:space="preserve">R041.DTA</w:t>
+            </w:r>
+            <w:r>
+              <w:t xml:space="preserve"> </w:t>
+            </w:r>
+            <w:r>
+              <w:t xml:space="preserve">(smallholder)</w:t>
+            </w:r>
+          </w:p>
+        </w:tc>
+        <w:tc>
+          <w:p>
+            <w:pPr>
+              <w:pStyle w:val="Compact"/>
+              <w:jc w:val="left"/>
+            </w:pPr>
+            <w:r>
+              <w:rPr>
+                <w:i/>
+              </w:rPr>
+              <w:t xml:space="preserve">(NBS Tanzania; pending)</w:t>
             </w:r>
           </w:p>
         </w:tc>
@@ -11506,21 +11940,21 @@
               <w:jc w:val="left"/>
             </w:pPr>
             <w:r>
-              <w:t xml:space="preserve">2013</w:t>
-            </w:r>
-          </w:p>
-        </w:tc>
-        <w:tc>
-          <w:p>
-            <w:pPr>
-              <w:pStyle w:val="Compact"/>
-              <w:jc w:val="left"/>
-            </w:pPr>
-            <w:r>
-              <w:rPr>
-                <w:rStyle w:val="VerbatimChar"/>
-              </w:rPr>
-              <w:t xml:space="preserve">AGSEC2A.dta</w:t>
+              <w:t xml:space="preserve">2019</w:t>
+            </w:r>
+          </w:p>
+        </w:tc>
+        <w:tc>
+          <w:p>
+            <w:pPr>
+              <w:pStyle w:val="Compact"/>
+              <w:jc w:val="left"/>
+            </w:pPr>
+            <w:r>
+              <w:rPr>
+                <w:rStyle w:val="VerbatimChar"/>
+              </w:rPr>
+              <w:t xml:space="preserve">R041_LAND_OWNERSHIP.dta</w:t>
             </w:r>
           </w:p>
         </w:tc>
@@ -11534,279 +11968,7 @@
               <w:rPr>
                 <w:i/>
               </w:rPr>
-              <w:t xml:space="preserve">(pending)</w:t>
-            </w:r>
-          </w:p>
-        </w:tc>
-      </w:tr>
-      <w:tr>
-        <w:tc>
-          <w:p/>
-        </w:tc>
-        <w:tc>
-          <w:p>
-            <w:pPr>
-              <w:pStyle w:val="Compact"/>
-              <w:jc w:val="left"/>
-            </w:pPr>
-            <w:r>
-              <w:t xml:space="preserve">2015</w:t>
-            </w:r>
-          </w:p>
-        </w:tc>
-        <w:tc>
-          <w:p>
-            <w:pPr>
-              <w:pStyle w:val="Compact"/>
-              <w:jc w:val="left"/>
-            </w:pPr>
-            <w:r>
-              <w:rPr>
-                <w:rStyle w:val="VerbatimChar"/>
-              </w:rPr>
-              <w:t xml:space="preserve">AGSEC2A.dta</w:t>
-            </w:r>
-          </w:p>
-        </w:tc>
-        <w:tc>
-          <w:p>
-            <w:pPr>
-              <w:pStyle w:val="Compact"/>
-              <w:jc w:val="left"/>
-            </w:pPr>
-            <w:r>
-              <w:rPr>
-                <w:i/>
-              </w:rPr>
-              <w:t xml:space="preserve">(pending)</w:t>
-            </w:r>
-          </w:p>
-        </w:tc>
-      </w:tr>
-      <w:tr>
-        <w:tc>
-          <w:p/>
-        </w:tc>
-        <w:tc>
-          <w:p>
-            <w:pPr>
-              <w:pStyle w:val="Compact"/>
-              <w:jc w:val="left"/>
-            </w:pPr>
-            <w:r>
-              <w:t xml:space="preserve">2018</w:t>
-            </w:r>
-          </w:p>
-        </w:tc>
-        <w:tc>
-          <w:p>
-            <w:pPr>
-              <w:pStyle w:val="Compact"/>
-              <w:jc w:val="left"/>
-            </w:pPr>
-            <w:r>
-              <w:rPr>
-                <w:rStyle w:val="VerbatimChar"/>
-              </w:rPr>
-              <w:t xml:space="preserve">AGSEC2A.dta</w:t>
-            </w:r>
-          </w:p>
-        </w:tc>
-        <w:tc>
-          <w:p>
-            <w:pPr>
-              <w:pStyle w:val="Compact"/>
-              <w:jc w:val="left"/>
-            </w:pPr>
-            <w:r>
-              <w:rPr>
-                <w:i/>
-              </w:rPr>
-              <w:t xml:space="preserve">(pending)</w:t>
-            </w:r>
-          </w:p>
-        </w:tc>
-      </w:tr>
-      <w:tr>
-        <w:tc>
-          <w:p/>
-        </w:tc>
-        <w:tc>
-          <w:p>
-            <w:pPr>
-              <w:pStyle w:val="Compact"/>
-              <w:jc w:val="left"/>
-            </w:pPr>
-            <w:r>
-              <w:t xml:space="preserve">2019</w:t>
-            </w:r>
-          </w:p>
-        </w:tc>
-        <w:tc>
-          <w:p>
-            <w:pPr>
-              <w:pStyle w:val="Compact"/>
-              <w:jc w:val="left"/>
-            </w:pPr>
-            <w:r>
-              <w:rPr>
-                <w:rStyle w:val="VerbatimChar"/>
-              </w:rPr>
-              <w:t xml:space="preserve">agsec2a.dta</w:t>
-            </w:r>
-          </w:p>
-        </w:tc>
-        <w:tc>
-          <w:p>
-            <w:pPr>
-              <w:pStyle w:val="Compact"/>
-              <w:jc w:val="left"/>
-            </w:pPr>
-            <w:r>
-              <w:rPr>
-                <w:i/>
-              </w:rPr>
-              <w:t xml:space="preserve">(pending)</w:t>
-            </w:r>
-          </w:p>
-        </w:tc>
-      </w:tr>
-      <w:tr>
-        <w:tc>
-          <w:p>
-            <w:pPr>
-              <w:pStyle w:val="Compact"/>
-              <w:jc w:val="left"/>
-            </w:pPr>
-            <w:r>
-              <w:t xml:space="preserve">Zambia</w:t>
-            </w:r>
-          </w:p>
-        </w:tc>
-        <w:tc>
-          <w:p>
-            <w:pPr>
-              <w:pStyle w:val="Compact"/>
-              <w:jc w:val="left"/>
-            </w:pPr>
-            <w:r>
-              <w:t xml:space="preserve">2012</w:t>
-            </w:r>
-          </w:p>
-        </w:tc>
-        <w:tc>
-          <w:p>
-            <w:pPr>
-              <w:pStyle w:val="Compact"/>
-              <w:jc w:val="left"/>
-            </w:pPr>
-            <w:r>
-              <w:rPr>
-                <w:rStyle w:val="VerbatimChar"/>
-              </w:rPr>
-              <w:t xml:space="preserve">field.dta</w:t>
-            </w:r>
-          </w:p>
-        </w:tc>
-        <w:tc>
-          <w:p>
-            <w:pPr>
-              <w:pStyle w:val="Compact"/>
-              <w:jc w:val="left"/>
-            </w:pPr>
-            <w:r>
-              <w:rPr>
-                <w:i/>
-              </w:rPr>
-              <w:t xml:space="preserve">(pending; IAPRI)</w:t>
-            </w:r>
-          </w:p>
-        </w:tc>
-      </w:tr>
-      <w:tr>
-        <w:tc>
-          <w:p/>
-        </w:tc>
-        <w:tc>
-          <w:p>
-            <w:pPr>
-              <w:pStyle w:val="Compact"/>
-              <w:jc w:val="left"/>
-            </w:pPr>
-            <w:r>
-              <w:t xml:space="preserve">2015</w:t>
-            </w:r>
-          </w:p>
-        </w:tc>
-        <w:tc>
-          <w:p>
-            <w:pPr>
-              <w:pStyle w:val="Compact"/>
-              <w:jc w:val="left"/>
-            </w:pPr>
-            <w:r>
-              <w:rPr>
-                <w:rStyle w:val="VerbatimChar"/>
-              </w:rPr>
-              <w:t xml:space="preserve">field.dta</w:t>
-            </w:r>
-          </w:p>
-        </w:tc>
-        <w:tc>
-          <w:p>
-            <w:pPr>
-              <w:pStyle w:val="Compact"/>
-              <w:jc w:val="left"/>
-            </w:pPr>
-            <w:r>
-              <w:rPr>
-                <w:i/>
-              </w:rPr>
-              <w:t xml:space="preserve">(pending; IAPRI)</w:t>
-            </w:r>
-          </w:p>
-        </w:tc>
-      </w:tr>
-      <w:tr>
-        <w:tc>
-          <w:p/>
-        </w:tc>
-        <w:tc>
-          <w:p>
-            <w:pPr>
-              <w:pStyle w:val="Compact"/>
-              <w:jc w:val="left"/>
-            </w:pPr>
-            <w:r>
-              <w:t xml:space="preserve">2019</w:t>
-            </w:r>
-          </w:p>
-        </w:tc>
-        <w:tc>
-          <w:p>
-            <w:pPr>
-              <w:pStyle w:val="Compact"/>
-              <w:jc w:val="left"/>
-            </w:pPr>
-            <w:r>
-              <w:rPr>
-                <w:rStyle w:val="VerbatimChar"/>
-              </w:rPr>
-              <w:t xml:space="preserve">field.dta</w:t>
-            </w:r>
-          </w:p>
-        </w:tc>
-        <w:tc>
-          <w:p>
-            <w:pPr>
-              <w:pStyle w:val="Compact"/>
-              <w:jc w:val="left"/>
-            </w:pPr>
-            <w:r>
-              <w:rPr>
-                <w:i/>
-              </w:rPr>
-              <w:t xml:space="preserve">(pending; IAPRI)</w:t>
+              <w:t xml:space="preserve">(NBS Tanzania; pending)</w:t>
             </w:r>
           </w:p>
         </w:tc>
@@ -11816,11 +11978,11 @@
       <w:pPr>
         <w:pStyle w:val="Heading1"/>
       </w:pPr>
-      <w:bookmarkStart w:id="41" w:name="Xa67191bf5e36bc64804d7ea38af21a2ea39cd14"/>
+      <w:bookmarkStart w:id="48" w:name="Xa67191bf5e36bc64804d7ea38af21a2ea39cd14"/>
       <w:r>
         <w:t xml:space="preserve">Appendix A. Per-country variable provenance</w:t>
       </w:r>
-      <w:bookmarkEnd w:id="41"/>
+      <w:bookmarkEnd w:id="48"/>
     </w:p>
     <w:p>
       <w:pPr>
@@ -11840,21 +12002,21 @@
       <w:pPr>
         <w:pStyle w:val="Heading2"/>
       </w:pPr>
-      <w:bookmarkStart w:id="42" w:name="X00728ba8d2160b74857f05f98b30c703885711f"/>
+      <w:bookmarkStart w:id="49" w:name="X00728ba8d2160b74857f05f98b30c703885711f"/>
       <w:r>
         <w:t xml:space="preserve">ETHIOPIA — Ethiopia Socioeconomic Survey (ESS)</w:t>
       </w:r>
-      <w:bookmarkEnd w:id="42"/>
+      <w:bookmarkEnd w:id="49"/>
     </w:p>
     <w:p>
       <w:pPr>
         <w:pStyle w:val="Heading3"/>
       </w:pPr>
-      <w:bookmarkStart w:id="43" w:name="survey-wave-key"/>
+      <w:bookmarkStart w:id="50" w:name="survey-wave-key"/>
       <w:r>
         <w:t xml:space="preserve">1. Survey &amp; wave key</w:t>
       </w:r>
-      <w:bookmarkEnd w:id="43"/>
+      <w:bookmarkEnd w:id="50"/>
     </w:p>
     <w:tbl>
       <w:tblPr>
@@ -12496,11 +12658,11 @@
       <w:pPr>
         <w:pStyle w:val="Heading3"/>
       </w:pPr>
-      <w:bookmarkStart w:id="44" w:name="tenure-indicators"/>
+      <w:bookmarkStart w:id="51" w:name="tenure-indicators"/>
       <w:r>
         <w:t xml:space="preserve">2. Tenure indicators</w:t>
       </w:r>
-      <w:bookmarkEnd w:id="44"/>
+      <w:bookmarkEnd w:id="51"/>
     </w:p>
     <w:p>
       <w:pPr>
@@ -14217,7 +14379,7 @@
       <w:pPr>
         <w:pStyle w:val="Heading3"/>
       </w:pPr>
-      <w:bookmarkStart w:id="45" w:name="parcel-area-parcel_area_ha"/>
+      <w:bookmarkStart w:id="52" w:name="parcel-area-parcel_area_ha"/>
       <w:r>
         <w:t xml:space="preserve">3. Parcel area (</w:t>
       </w:r>
@@ -14230,7 +14392,7 @@
       <w:r>
         <w:t xml:space="preserve">)</w:t>
       </w:r>
-      <w:bookmarkEnd w:id="45"/>
+      <w:bookmarkEnd w:id="52"/>
     </w:p>
     <w:p>
       <w:pPr>
@@ -14987,11 +15149,11 @@
       <w:pPr>
         <w:pStyle w:val="Heading3"/>
       </w:pPr>
-      <w:bookmarkStart w:id="46" w:name="design-variables-identifiers"/>
+      <w:bookmarkStart w:id="53" w:name="design-variables-identifiers"/>
       <w:r>
         <w:t xml:space="preserve">4. Design variables &amp; identifiers</w:t>
       </w:r>
-      <w:bookmarkEnd w:id="46"/>
+      <w:bookmarkEnd w:id="53"/>
     </w:p>
     <w:tbl>
       <w:tblPr>
@@ -16310,11 +16472,11 @@
       <w:pPr>
         <w:pStyle w:val="Heading3"/>
       </w:pPr>
-      <w:bookmarkStart w:id="47" w:name="Xd42d4af8211bb53ced3c89549c738c863b0b1f0"/>
+      <w:bookmarkStart w:id="54" w:name="Xd42d4af8211bb53ced3c89549c738c863b0b1f0"/>
       <w:r>
         <w:t xml:space="preserve">5. Value labels of key source variables (verified against the raw rosters)</w:t>
       </w:r>
-      <w:bookmarkEnd w:id="47"/>
+      <w:bookmarkEnd w:id="54"/>
     </w:p>
     <w:p>
       <w:pPr>
@@ -17449,11 +17611,11 @@
       <w:pPr>
         <w:pStyle w:val="Heading3"/>
       </w:pPr>
-      <w:bookmarkStart w:id="48" w:name="harmonization-decisions-caveats-ethiopia"/>
+      <w:bookmarkStart w:id="55" w:name="harmonization-decisions-caveats-ethiopia"/>
       <w:r>
         <w:t xml:space="preserve">6. Harmonization decisions &amp; caveats (Ethiopia)</w:t>
       </w:r>
-      <w:bookmarkEnd w:id="48"/>
+      <w:bookmarkEnd w:id="55"/>
     </w:p>
     <w:p>
       <w:pPr>
@@ -18061,11 +18223,11 @@
       <w:pPr>
         <w:pStyle w:val="Heading2"/>
       </w:pPr>
-      <w:bookmarkStart w:id="49" w:name="X58e7c7fc58aa400ad0a6aeef83d98534c48a47f"/>
+      <w:bookmarkStart w:id="56" w:name="X58e7c7fc58aa400ad0a6aeef83d98534c48a47f"/>
       <w:r>
         <w:t xml:space="preserve">MALAWI — Integrated Household Panel Survey (IHPS)</w:t>
       </w:r>
-      <w:bookmarkEnd w:id="49"/>
+      <w:bookmarkEnd w:id="56"/>
     </w:p>
     <w:p>
       <w:pPr>
@@ -18216,11 +18378,11 @@
       <w:pPr>
         <w:pStyle w:val="Heading3"/>
       </w:pPr>
-      <w:bookmarkStart w:id="50" w:name="survey-wave-key-1"/>
+      <w:bookmarkStart w:id="57" w:name="survey-wave-key-1"/>
       <w:r>
         <w:t xml:space="preserve">1. Survey &amp; wave key</w:t>
       </w:r>
-      <w:bookmarkEnd w:id="50"/>
+      <w:bookmarkEnd w:id="57"/>
     </w:p>
     <w:tbl>
       <w:tblPr>
@@ -18750,11 +18912,11 @@
       <w:pPr>
         <w:pStyle w:val="Heading3"/>
       </w:pPr>
-      <w:bookmarkStart w:id="51" w:name="tenure-indicators-1"/>
+      <w:bookmarkStart w:id="58" w:name="tenure-indicators-1"/>
       <w:r>
         <w:t xml:space="preserve">2. Tenure indicators</w:t>
       </w:r>
-      <w:bookmarkEnd w:id="51"/>
+      <w:bookmarkEnd w:id="58"/>
     </w:p>
     <w:tbl>
       <w:tblPr>
@@ -19914,7 +20076,7 @@
       <w:pPr>
         <w:pStyle w:val="Heading3"/>
       </w:pPr>
-      <w:bookmarkStart w:id="52" w:name="parcel-area-parcel_area_ha-1"/>
+      <w:bookmarkStart w:id="59" w:name="parcel-area-parcel_area_ha-1"/>
       <w:r>
         <w:t xml:space="preserve">3. Parcel area (</w:t>
       </w:r>
@@ -19927,7 +20089,7 @@
       <w:r>
         <w:t xml:space="preserve">)</w:t>
       </w:r>
-      <w:bookmarkEnd w:id="52"/>
+      <w:bookmarkEnd w:id="59"/>
     </w:p>
     <w:p>
       <w:pPr>
@@ -20046,11 +20208,11 @@
       <w:pPr>
         <w:pStyle w:val="Heading3"/>
       </w:pPr>
-      <w:bookmarkStart w:id="53" w:name="design-variables-identifiers-1"/>
+      <w:bookmarkStart w:id="60" w:name="design-variables-identifiers-1"/>
       <w:r>
         <w:t xml:space="preserve">4. Design variables &amp; identifiers</w:t>
       </w:r>
-      <w:bookmarkEnd w:id="53"/>
+      <w:bookmarkEnd w:id="60"/>
     </w:p>
     <w:tbl>
       <w:tblPr>
@@ -20874,11 +21036,11 @@
       <w:pPr>
         <w:pStyle w:val="Heading3"/>
       </w:pPr>
-      <w:bookmarkStart w:id="54" w:name="X3c195f35add181f24126d1dac89a38fd1df1287"/>
+      <w:bookmarkStart w:id="61" w:name="X3c195f35add181f24126d1dac89a38fd1df1287"/>
       <w:r>
         <w:t xml:space="preserve">5. Value labels of key source variables (verified)</w:t>
       </w:r>
-      <w:bookmarkEnd w:id="54"/>
+      <w:bookmarkEnd w:id="61"/>
     </w:p>
     <w:p>
       <w:pPr>
@@ -21805,11 +21967,11 @@
       <w:pPr>
         <w:pStyle w:val="Heading3"/>
       </w:pPr>
-      <w:bookmarkStart w:id="55" w:name="harmonization-decisions-caveats-malawi"/>
+      <w:bookmarkStart w:id="62" w:name="harmonization-decisions-caveats-malawi"/>
       <w:r>
         <w:t xml:space="preserve">6. Harmonization decisions &amp; caveats (Malawi)</w:t>
       </w:r>
-      <w:bookmarkEnd w:id="55"/>
+      <w:bookmarkEnd w:id="62"/>
     </w:p>
     <w:p>
       <w:pPr>
@@ -22233,11 +22395,11 @@
       <w:pPr>
         <w:pStyle w:val="Heading2"/>
       </w:pPr>
-      <w:bookmarkStart w:id="56" w:name="X3efb4428047162bb7c872e735728bee0a77b27e"/>
+      <w:bookmarkStart w:id="63" w:name="X3efb4428047162bb7c872e735728bee0a77b27e"/>
       <w:r>
         <w:t xml:space="preserve">MALI — Enquete Agricole de Conjoncture Integree (EACI)</w:t>
       </w:r>
-      <w:bookmarkEnd w:id="56"/>
+      <w:bookmarkEnd w:id="63"/>
     </w:p>
     <w:p>
       <w:pPr>
@@ -22346,11 +22508,11 @@
       <w:pPr>
         <w:pStyle w:val="Heading3"/>
       </w:pPr>
-      <w:bookmarkStart w:id="57" w:name="survey-wave-key-2"/>
+      <w:bookmarkStart w:id="64" w:name="survey-wave-key-2"/>
       <w:r>
         <w:t xml:space="preserve">1. Survey &amp; wave key</w:t>
       </w:r>
-      <w:bookmarkEnd w:id="57"/>
+      <w:bookmarkEnd w:id="64"/>
     </w:p>
     <w:tbl>
       <w:tblPr>
@@ -22714,11 +22876,11 @@
       <w:pPr>
         <w:pStyle w:val="Heading3"/>
       </w:pPr>
-      <w:bookmarkStart w:id="58" w:name="tenure-indicators-2"/>
+      <w:bookmarkStart w:id="65" w:name="tenure-indicators-2"/>
       <w:r>
         <w:t xml:space="preserve">2. Tenure indicators</w:t>
       </w:r>
-      <w:bookmarkEnd w:id="58"/>
+      <w:bookmarkEnd w:id="65"/>
     </w:p>
     <w:tbl>
       <w:tblPr>
@@ -23229,7 +23391,7 @@
       <w:pPr>
         <w:pStyle w:val="Heading3"/>
       </w:pPr>
-      <w:bookmarkStart w:id="59" w:name="parcel-area-parcel_area_ha-2"/>
+      <w:bookmarkStart w:id="66" w:name="parcel-area-parcel_area_ha-2"/>
       <w:r>
         <w:t xml:space="preserve">3. Parcel area (</w:t>
       </w:r>
@@ -23242,7 +23404,7 @@
       <w:r>
         <w:t xml:space="preserve">)</w:t>
       </w:r>
-      <w:bookmarkEnd w:id="59"/>
+      <w:bookmarkEnd w:id="66"/>
     </w:p>
     <w:p>
       <w:pPr>
@@ -23343,11 +23505,11 @@
       <w:pPr>
         <w:pStyle w:val="Heading3"/>
       </w:pPr>
-      <w:bookmarkStart w:id="60" w:name="design-variables-identifiers-2"/>
+      <w:bookmarkStart w:id="67" w:name="design-variables-identifiers-2"/>
       <w:r>
         <w:t xml:space="preserve">4. Design variables &amp; identifiers</w:t>
       </w:r>
-      <w:bookmarkEnd w:id="60"/>
+      <w:bookmarkEnd w:id="67"/>
     </w:p>
     <w:tbl>
       <w:tblPr>
@@ -23877,11 +24039,11 @@
       <w:pPr>
         <w:pStyle w:val="Heading3"/>
       </w:pPr>
-      <w:bookmarkStart w:id="61" w:name="Xd7b0f06d6741a457572b51c32edd9b036aaa263"/>
+      <w:bookmarkStart w:id="68" w:name="Xd7b0f06d6741a457572b51c32edd9b036aaa263"/>
       <w:r>
         <w:t xml:space="preserve">5. Value labels of key source variables (verified)</w:t>
       </w:r>
-      <w:bookmarkEnd w:id="61"/>
+      <w:bookmarkEnd w:id="68"/>
     </w:p>
     <w:p>
       <w:pPr>
@@ -24139,11 +24301,11 @@
       <w:pPr>
         <w:pStyle w:val="Heading3"/>
       </w:pPr>
-      <w:bookmarkStart w:id="62" w:name="harmonization-decisions-caveats-mali"/>
+      <w:bookmarkStart w:id="69" w:name="harmonization-decisions-caveats-mali"/>
       <w:r>
         <w:t xml:space="preserve">6. Harmonization decisions &amp; caveats (Mali)</w:t>
       </w:r>
-      <w:bookmarkEnd w:id="62"/>
+      <w:bookmarkEnd w:id="69"/>
     </w:p>
     <w:p>
       <w:pPr>
@@ -24651,11 +24813,11 @@
       <w:pPr>
         <w:pStyle w:val="Heading2"/>
       </w:pPr>
-      <w:bookmarkStart w:id="63" w:name="X14eb90961d7c4eda69428154c7d8401e18ed92a"/>
+      <w:bookmarkStart w:id="70" w:name="X14eb90961d7c4eda69428154c7d8401e18ed92a"/>
       <w:r>
         <w:t xml:space="preserve">NIGER — Enquete Nationale sur les Conditions de Vie (ECVMA)</w:t>
       </w:r>
-      <w:bookmarkEnd w:id="63"/>
+      <w:bookmarkEnd w:id="70"/>
     </w:p>
     <w:p>
       <w:pPr>
@@ -24758,11 +24920,11 @@
       <w:pPr>
         <w:pStyle w:val="Heading3"/>
       </w:pPr>
-      <w:bookmarkStart w:id="64" w:name="survey-wave-key-3"/>
+      <w:bookmarkStart w:id="71" w:name="survey-wave-key-3"/>
       <w:r>
         <w:t xml:space="preserve">1. Survey &amp; wave key</w:t>
       </w:r>
-      <w:bookmarkEnd w:id="64"/>
+      <w:bookmarkEnd w:id="71"/>
     </w:p>
     <w:tbl>
       <w:tblPr>
@@ -25150,11 +25312,11 @@
       <w:pPr>
         <w:pStyle w:val="Heading3"/>
       </w:pPr>
-      <w:bookmarkStart w:id="65" w:name="tenure-indicators-3"/>
+      <w:bookmarkStart w:id="72" w:name="tenure-indicators-3"/>
       <w:r>
         <w:t xml:space="preserve">2. Tenure indicators</w:t>
       </w:r>
-      <w:bookmarkEnd w:id="65"/>
+      <w:bookmarkEnd w:id="72"/>
     </w:p>
     <w:tbl>
       <w:tblPr>
@@ -25770,7 +25932,7 @@
       <w:pPr>
         <w:pStyle w:val="Heading3"/>
       </w:pPr>
-      <w:bookmarkStart w:id="66" w:name="parcel-area-parcel_area_ha-3"/>
+      <w:bookmarkStart w:id="73" w:name="parcel-area-parcel_area_ha-3"/>
       <w:r>
         <w:t xml:space="preserve">3. Parcel area (</w:t>
       </w:r>
@@ -25783,7 +25945,7 @@
       <w:r>
         <w:t xml:space="preserve">)</w:t>
       </w:r>
-      <w:bookmarkEnd w:id="66"/>
+      <w:bookmarkEnd w:id="73"/>
     </w:p>
     <w:p>
       <w:pPr>
@@ -25851,11 +26013,11 @@
       <w:pPr>
         <w:pStyle w:val="Heading3"/>
       </w:pPr>
-      <w:bookmarkStart w:id="67" w:name="design-variables-identifiers-3"/>
+      <w:bookmarkStart w:id="74" w:name="design-variables-identifiers-3"/>
       <w:r>
         <w:t xml:space="preserve">4. Design variables &amp; identifiers</w:t>
       </w:r>
-      <w:bookmarkEnd w:id="67"/>
+      <w:bookmarkEnd w:id="74"/>
     </w:p>
     <w:tbl>
       <w:tblPr>
@@ -26455,11 +26617,11 @@
       <w:pPr>
         <w:pStyle w:val="Heading3"/>
       </w:pPr>
-      <w:bookmarkStart w:id="68" w:name="X646e8461e11ea76f2f34efa79915905fa78ad77"/>
+      <w:bookmarkStart w:id="75" w:name="X646e8461e11ea76f2f34efa79915905fa78ad77"/>
       <w:r>
         <w:t xml:space="preserve">5. Value labels of key source variables (verified)</w:t>
       </w:r>
-      <w:bookmarkEnd w:id="68"/>
+      <w:bookmarkEnd w:id="75"/>
     </w:p>
     <w:p>
       <w:pPr>
@@ -26767,11 +26929,11 @@
       <w:pPr>
         <w:pStyle w:val="Heading3"/>
       </w:pPr>
-      <w:bookmarkStart w:id="69" w:name="harmonization-decisions-caveats-niger"/>
+      <w:bookmarkStart w:id="76" w:name="harmonization-decisions-caveats-niger"/>
       <w:r>
         <w:t xml:space="preserve">6. Harmonization decisions &amp; caveats (Niger)</w:t>
       </w:r>
-      <w:bookmarkEnd w:id="69"/>
+      <w:bookmarkEnd w:id="76"/>
     </w:p>
     <w:p>
       <w:pPr>
@@ -27102,11 +27264,11 @@
       <w:pPr>
         <w:pStyle w:val="Heading2"/>
       </w:pPr>
-      <w:bookmarkStart w:id="70" w:name="X4370d6f7e22f04e7f2986bdcf7fe062ac53545f"/>
+      <w:bookmarkStart w:id="77" w:name="X4370d6f7e22f04e7f2986bdcf7fe062ac53545f"/>
       <w:r>
         <w:t xml:space="preserve">NIGERIA — General Household Survey-Panel (GHS)</w:t>
       </w:r>
-      <w:bookmarkEnd w:id="70"/>
+      <w:bookmarkEnd w:id="77"/>
     </w:p>
     <w:p>
       <w:pPr>
@@ -27212,11 +27374,11 @@
       <w:pPr>
         <w:pStyle w:val="Heading3"/>
       </w:pPr>
-      <w:bookmarkStart w:id="71" w:name="survey-wave-key-4"/>
+      <w:bookmarkStart w:id="78" w:name="survey-wave-key-4"/>
       <w:r>
         <w:t xml:space="preserve">1. Survey &amp; wave key</w:t>
       </w:r>
-      <w:bookmarkEnd w:id="71"/>
+      <w:bookmarkEnd w:id="78"/>
     </w:p>
     <w:tbl>
       <w:tblPr>
@@ -27680,11 +27842,11 @@
       <w:pPr>
         <w:pStyle w:val="Heading3"/>
       </w:pPr>
-      <w:bookmarkStart w:id="72" w:name="tenure-indicators-4"/>
+      <w:bookmarkStart w:id="79" w:name="tenure-indicators-4"/>
       <w:r>
         <w:t xml:space="preserve">2. Tenure indicators</w:t>
       </w:r>
-      <w:bookmarkEnd w:id="72"/>
+      <w:bookmarkEnd w:id="79"/>
     </w:p>
     <w:tbl>
       <w:tblPr>
@@ -28415,7 +28577,7 @@
       <w:pPr>
         <w:pStyle w:val="Heading3"/>
       </w:pPr>
-      <w:bookmarkStart w:id="73" w:name="parcel-area-parcel_area_ha-4"/>
+      <w:bookmarkStart w:id="80" w:name="parcel-area-parcel_area_ha-4"/>
       <w:r>
         <w:t xml:space="preserve">3. Parcel area (</w:t>
       </w:r>
@@ -28428,7 +28590,7 @@
       <w:r>
         <w:t xml:space="preserve">)</w:t>
       </w:r>
-      <w:bookmarkEnd w:id="73"/>
+      <w:bookmarkEnd w:id="80"/>
     </w:p>
     <w:p>
       <w:pPr>
@@ -28682,11 +28844,11 @@
       <w:pPr>
         <w:pStyle w:val="Heading3"/>
       </w:pPr>
-      <w:bookmarkStart w:id="74" w:name="design-variables-identifiers-4"/>
+      <w:bookmarkStart w:id="81" w:name="design-variables-identifiers-4"/>
       <w:r>
         <w:t xml:space="preserve">4. Design variables &amp; identifiers</w:t>
       </w:r>
-      <w:bookmarkEnd w:id="74"/>
+      <w:bookmarkEnd w:id="81"/>
     </w:p>
     <w:tbl>
       <w:tblPr>
@@ -29161,11 +29323,11 @@
       <w:pPr>
         <w:pStyle w:val="Heading3"/>
       </w:pPr>
-      <w:bookmarkStart w:id="75" w:name="Xb4d582268a3ea5115cbf391ae4ab1d6685f948d"/>
+      <w:bookmarkStart w:id="82" w:name="Xb4d582268a3ea5115cbf391ae4ab1d6685f948d"/>
       <w:r>
         <w:t xml:space="preserve">5. Value labels of key source variables (verified for GHS10; consistent instrument)</w:t>
       </w:r>
-      <w:bookmarkEnd w:id="75"/>
+      <w:bookmarkEnd w:id="82"/>
     </w:p>
     <w:p>
       <w:pPr>
@@ -29411,11 +29573,11 @@
       <w:pPr>
         <w:pStyle w:val="Heading3"/>
       </w:pPr>
-      <w:bookmarkStart w:id="76" w:name="harmonization-decisions-caveats-nigeria"/>
+      <w:bookmarkStart w:id="83" w:name="harmonization-decisions-caveats-nigeria"/>
       <w:r>
         <w:t xml:space="preserve">6. Harmonization decisions &amp; caveats (Nigeria)</w:t>
       </w:r>
-      <w:bookmarkEnd w:id="76"/>
+      <w:bookmarkEnd w:id="83"/>
     </w:p>
     <w:p>
       <w:pPr>
@@ -29725,11 +29887,11 @@
       <w:pPr>
         <w:pStyle w:val="Heading2"/>
       </w:pPr>
-      <w:bookmarkStart w:id="77" w:name="tanzania-national-panel-survey-nps"/>
+      <w:bookmarkStart w:id="84" w:name="tanzania-national-panel-survey-nps"/>
       <w:r>
         <w:t xml:space="preserve">TANZANIA — National Panel Survey (NPS)</w:t>
       </w:r>
-      <w:bookmarkEnd w:id="77"/>
+      <w:bookmarkEnd w:id="84"/>
     </w:p>
     <w:p>
       <w:pPr>
@@ -29904,11 +30066,11 @@
       <w:pPr>
         <w:pStyle w:val="Heading3"/>
       </w:pPr>
-      <w:bookmarkStart w:id="78" w:name="survey-wave-key-5"/>
+      <w:bookmarkStart w:id="85" w:name="survey-wave-key-5"/>
       <w:r>
         <w:t xml:space="preserve">1. Survey &amp; wave key</w:t>
       </w:r>
-      <w:bookmarkEnd w:id="78"/>
+      <w:bookmarkEnd w:id="85"/>
     </w:p>
     <w:tbl>
       <w:tblPr>
@@ -30536,11 +30698,11 @@
       <w:pPr>
         <w:pStyle w:val="Heading3"/>
       </w:pPr>
-      <w:bookmarkStart w:id="79" w:name="tenure-indicators-5"/>
+      <w:bookmarkStart w:id="86" w:name="tenure-indicators-5"/>
       <w:r>
         <w:t xml:space="preserve">2. Tenure indicators</w:t>
       </w:r>
-      <w:bookmarkEnd w:id="79"/>
+      <w:bookmarkEnd w:id="86"/>
     </w:p>
     <w:tbl>
       <w:tblPr>
@@ -31234,7 +31396,7 @@
       <w:pPr>
         <w:pStyle w:val="Heading3"/>
       </w:pPr>
-      <w:bookmarkStart w:id="80" w:name="parcel-area-parcel_area_ha-5"/>
+      <w:bookmarkStart w:id="87" w:name="parcel-area-parcel_area_ha-5"/>
       <w:r>
         <w:t xml:space="preserve">3. Parcel area (</w:t>
       </w:r>
@@ -31247,7 +31409,7 @@
       <w:r>
         <w:t xml:space="preserve">)</w:t>
       </w:r>
-      <w:bookmarkEnd w:id="80"/>
+      <w:bookmarkEnd w:id="87"/>
     </w:p>
     <w:p>
       <w:pPr>
@@ -31339,11 +31501,11 @@
       <w:pPr>
         <w:pStyle w:val="Heading3"/>
       </w:pPr>
-      <w:bookmarkStart w:id="81" w:name="design-variables-identifiers-5"/>
+      <w:bookmarkStart w:id="88" w:name="design-variables-identifiers-5"/>
       <w:r>
         <w:t xml:space="preserve">4. Design variables &amp; identifiers</w:t>
       </w:r>
-      <w:bookmarkEnd w:id="81"/>
+      <w:bookmarkEnd w:id="88"/>
     </w:p>
     <w:tbl>
       <w:tblPr>
@@ -31710,11 +31872,11 @@
       <w:pPr>
         <w:pStyle w:val="Heading3"/>
       </w:pPr>
-      <w:bookmarkStart w:id="82" w:name="X8b517451fc0444510e3f71dace152c3da4f1fbf"/>
+      <w:bookmarkStart w:id="89" w:name="X8b517451fc0444510e3f71dace152c3da4f1fbf"/>
       <w:r>
         <w:t xml:space="preserve">5. Value labels of key source variables (verified)</w:t>
       </w:r>
-      <w:bookmarkEnd w:id="82"/>
+      <w:bookmarkEnd w:id="89"/>
     </w:p>
     <w:p>
       <w:pPr>
@@ -31975,11 +32137,11 @@
       <w:pPr>
         <w:pStyle w:val="Heading3"/>
       </w:pPr>
-      <w:bookmarkStart w:id="83" w:name="harmonization-decisions-caveats-tanzania"/>
+      <w:bookmarkStart w:id="90" w:name="harmonization-decisions-caveats-tanzania"/>
       <w:r>
         <w:t xml:space="preserve">6. Harmonization decisions &amp; caveats (Tanzania)</w:t>
       </w:r>
-      <w:bookmarkEnd w:id="83"/>
+      <w:bookmarkEnd w:id="90"/>
     </w:p>
     <w:p>
       <w:pPr>
@@ -32262,11 +32424,11 @@
       <w:pPr>
         <w:pStyle w:val="Heading2"/>
       </w:pPr>
-      <w:bookmarkStart w:id="84" w:name="uganda-national-panel-survey-unps"/>
+      <w:bookmarkStart w:id="91" w:name="uganda-national-panel-survey-unps"/>
       <w:r>
         <w:t xml:space="preserve">UGANDA — National Panel Survey (UNPS)</w:t>
       </w:r>
-      <w:bookmarkEnd w:id="84"/>
+      <w:bookmarkEnd w:id="91"/>
     </w:p>
     <w:p>
       <w:pPr>
@@ -32822,11 +32984,11 @@
       <w:pPr>
         <w:pStyle w:val="Heading3"/>
       </w:pPr>
-      <w:bookmarkStart w:id="85" w:name="survey-wave-key-6"/>
+      <w:bookmarkStart w:id="92" w:name="survey-wave-key-6"/>
       <w:r>
         <w:t xml:space="preserve">1. Survey &amp; wave key</w:t>
       </w:r>
-      <w:bookmarkEnd w:id="85"/>
+      <w:bookmarkEnd w:id="92"/>
     </w:p>
     <w:tbl>
       <w:tblPr>
@@ -33589,11 +33751,11 @@
       <w:pPr>
         <w:pStyle w:val="Heading3"/>
       </w:pPr>
-      <w:bookmarkStart w:id="86" w:name="tenure-indicators-6"/>
+      <w:bookmarkStart w:id="93" w:name="tenure-indicators-6"/>
       <w:r>
         <w:t xml:space="preserve">2. Tenure indicators</w:t>
       </w:r>
-      <w:bookmarkEnd w:id="86"/>
+      <w:bookmarkEnd w:id="93"/>
     </w:p>
     <w:tbl>
       <w:tblPr>
@@ -34253,7 +34415,7 @@
       <w:pPr>
         <w:pStyle w:val="Heading3"/>
       </w:pPr>
-      <w:bookmarkStart w:id="87" w:name="parcel-area-parcel_area_ha-6"/>
+      <w:bookmarkStart w:id="94" w:name="parcel-area-parcel_area_ha-6"/>
       <w:r>
         <w:t xml:space="preserve">3. Parcel area (</w:t>
       </w:r>
@@ -34266,7 +34428,7 @@
       <w:r>
         <w:t xml:space="preserve">)</w:t>
       </w:r>
-      <w:bookmarkEnd w:id="87"/>
+      <w:bookmarkEnd w:id="94"/>
     </w:p>
     <w:p>
       <w:pPr>
@@ -34409,11 +34571,11 @@
       <w:pPr>
         <w:pStyle w:val="Heading3"/>
       </w:pPr>
-      <w:bookmarkStart w:id="88" w:name="design-variables-identifiers-6"/>
+      <w:bookmarkStart w:id="95" w:name="design-variables-identifiers-6"/>
       <w:r>
         <w:t xml:space="preserve">4. Design variables &amp; identifiers</w:t>
       </w:r>
-      <w:bookmarkEnd w:id="88"/>
+      <w:bookmarkEnd w:id="95"/>
     </w:p>
     <w:tbl>
       <w:tblPr>
@@ -34788,11 +34950,11 @@
       <w:pPr>
         <w:pStyle w:val="Heading3"/>
       </w:pPr>
-      <w:bookmarkStart w:id="89" w:name="X41b3da375b96f03c8be77259d3c225da7481aa7"/>
+      <w:bookmarkStart w:id="96" w:name="X41b3da375b96f03c8be77259d3c225da7481aa7"/>
       <w:r>
         <w:t xml:space="preserve">5. Value labels of key source variables (verified against the raw rosters)</w:t>
       </w:r>
-      <w:bookmarkEnd w:id="89"/>
+      <w:bookmarkEnd w:id="96"/>
     </w:p>
     <w:p>
       <w:pPr>
@@ -35043,11 +35205,11 @@
       <w:pPr>
         <w:pStyle w:val="Heading3"/>
       </w:pPr>
-      <w:bookmarkStart w:id="90" w:name="harmonization-decisions-caveats-uganda"/>
+      <w:bookmarkStart w:id="97" w:name="harmonization-decisions-caveats-uganda"/>
       <w:r>
         <w:t xml:space="preserve">6. Harmonization decisions &amp; caveats (Uganda)</w:t>
       </w:r>
-      <w:bookmarkEnd w:id="90"/>
+      <w:bookmarkEnd w:id="97"/>
     </w:p>
     <w:p>
       <w:pPr>
@@ -35651,7 +35813,7 @@
       <w:pPr>
         <w:pStyle w:val="Heading2"/>
       </w:pPr>
-      <w:bookmarkStart w:id="91" w:name="X0b2950cf25400957611bc3f965c1c43185957b6"/>
+      <w:bookmarkStart w:id="98" w:name="X0b2950cf25400957611bc3f965c1c43185957b6"/>
       <w:r>
         <w:t xml:space="preserve">ZAMBIA — Rural Agricultural Livelihoods Survey (RALS)</w:t>
       </w:r>
@@ -35664,7 +35826,7 @@
         </w:rPr>
         <w:t xml:space="preserve">(non-LSMS-ISA)</w:t>
       </w:r>
-      <w:bookmarkEnd w:id="91"/>
+      <w:bookmarkEnd w:id="98"/>
     </w:p>
     <w:p>
       <w:pPr>
@@ -35851,11 +36013,11 @@
       <w:pPr>
         <w:pStyle w:val="Heading3"/>
       </w:pPr>
-      <w:bookmarkStart w:id="92" w:name="survey-wave-key-7"/>
+      <w:bookmarkStart w:id="99" w:name="survey-wave-key-7"/>
       <w:r>
         <w:t xml:space="preserve">1. Survey &amp; wave key</w:t>
       </w:r>
-      <w:bookmarkEnd w:id="92"/>
+      <w:bookmarkEnd w:id="99"/>
     </w:p>
     <w:tbl>
       <w:tblPr>
@@ -36396,11 +36558,11 @@
       <w:pPr>
         <w:pStyle w:val="Heading3"/>
       </w:pPr>
-      <w:bookmarkStart w:id="93" w:name="tenure-indicators-7"/>
+      <w:bookmarkStart w:id="100" w:name="tenure-indicators-7"/>
       <w:r>
         <w:t xml:space="preserve">2. Tenure indicators</w:t>
       </w:r>
-      <w:bookmarkEnd w:id="93"/>
+      <w:bookmarkEnd w:id="100"/>
     </w:p>
     <w:tbl>
       <w:tblPr>
@@ -36772,7 +36934,7 @@
       <w:pPr>
         <w:pStyle w:val="Heading3"/>
       </w:pPr>
-      <w:bookmarkStart w:id="94" w:name="parcel-area-parcel_area_ha-7"/>
+      <w:bookmarkStart w:id="101" w:name="parcel-area-parcel_area_ha-7"/>
       <w:r>
         <w:t xml:space="preserve">3. Parcel area (</w:t>
       </w:r>
@@ -36785,7 +36947,7 @@
       <w:r>
         <w:t xml:space="preserve">)</w:t>
       </w:r>
-      <w:bookmarkEnd w:id="94"/>
+      <w:bookmarkEnd w:id="101"/>
     </w:p>
     <w:p>
       <w:pPr>
@@ -36868,11 +37030,11 @@
       <w:pPr>
         <w:pStyle w:val="Heading3"/>
       </w:pPr>
-      <w:bookmarkStart w:id="95" w:name="design-variables-identifiers-7"/>
+      <w:bookmarkStart w:id="102" w:name="design-variables-identifiers-7"/>
       <w:r>
         <w:t xml:space="preserve">4. Design variables &amp; identifiers</w:t>
       </w:r>
-      <w:bookmarkEnd w:id="95"/>
+      <w:bookmarkEnd w:id="102"/>
     </w:p>
     <w:tbl>
       <w:tblPr>
@@ -37226,7 +37388,7 @@
       <w:pPr>
         <w:pStyle w:val="Heading3"/>
       </w:pPr>
-      <w:bookmarkStart w:id="96" w:name="X5ba80d23c7ef9fd2e661850521d15998b8e8ba0"/>
+      <w:bookmarkStart w:id="103" w:name="X5ba80d23c7ef9fd2e661850521d15998b8e8ba0"/>
       <w:r>
         <w:t xml:space="preserve">5.</w:t>
       </w:r>
@@ -37245,7 +37407,7 @@
       <w:r>
         <w:t xml:space="preserve">tenure status - per-wave title map (the categories expand)</w:t>
       </w:r>
-      <w:bookmarkEnd w:id="96"/>
+      <w:bookmarkEnd w:id="103"/>
     </w:p>
     <w:p>
       <w:pPr>
@@ -37608,11 +37770,11 @@
       <w:pPr>
         <w:pStyle w:val="Heading3"/>
       </w:pPr>
-      <w:bookmarkStart w:id="97" w:name="harmonization-decisions-caveats-zambia"/>
+      <w:bookmarkStart w:id="104" w:name="harmonization-decisions-caveats-zambia"/>
       <w:r>
         <w:t xml:space="preserve">6. Harmonization decisions &amp; caveats (Zambia)</w:t>
       </w:r>
-      <w:bookmarkEnd w:id="97"/>
+      <w:bookmarkEnd w:id="104"/>
     </w:p>
     <w:p>
       <w:pPr>

</xml_diff>

<commit_message>
Section 7 source table: add catalog links for Tanzania NPS+ASC, Mali, Niger, Nigeria (Y1-4), Malawi IHPS panel; Nigeria 2023 + Zambia remain pending
</commit_message>
<xml_diff>
--- a/Report/consolidated_report.docx
+++ b/Report/consolidated_report.docx
@@ -10600,6 +10600,582 @@
               <w:pStyle w:val="Compact"/>
               <w:jc w:val="left"/>
             </w:pPr>
+            <w:hyperlink r:id="rId41">
+              <w:r>
+                <w:rPr>
+                  <w:rStyle w:val="Hyperlink"/>
+                </w:rPr>
+                <w:t xml:space="preserve">IHPS long-term panel</w:t>
+              </w:r>
+            </w:hyperlink>
+          </w:p>
+        </w:tc>
+      </w:tr>
+      <w:tr>
+        <w:tc>
+          <w:p/>
+        </w:tc>
+        <w:tc>
+          <w:p>
+            <w:pPr>
+              <w:pStyle w:val="Compact"/>
+              <w:jc w:val="left"/>
+            </w:pPr>
+            <w:r>
+              <w:t xml:space="preserve">2013</w:t>
+            </w:r>
+          </w:p>
+        </w:tc>
+        <w:tc>
+          <w:p>
+            <w:pPr>
+              <w:pStyle w:val="Compact"/>
+              <w:jc w:val="left"/>
+            </w:pPr>
+            <w:r>
+              <w:rPr>
+                <w:rStyle w:val="VerbatimChar"/>
+              </w:rPr>
+              <w:t xml:space="preserve">ag_mod_d_13.dta</w:t>
+            </w:r>
+          </w:p>
+        </w:tc>
+        <w:tc>
+          <w:p>
+            <w:pPr>
+              <w:pStyle w:val="Compact"/>
+              <w:jc w:val="left"/>
+            </w:pPr>
+            <w:hyperlink r:id="rId41">
+              <w:r>
+                <w:rPr>
+                  <w:rStyle w:val="Hyperlink"/>
+                </w:rPr>
+                <w:t xml:space="preserve">IHPS long-term panel</w:t>
+              </w:r>
+            </w:hyperlink>
+          </w:p>
+        </w:tc>
+      </w:tr>
+      <w:tr>
+        <w:tc>
+          <w:p/>
+        </w:tc>
+        <w:tc>
+          <w:p>
+            <w:pPr>
+              <w:pStyle w:val="Compact"/>
+              <w:jc w:val="left"/>
+            </w:pPr>
+            <w:r>
+              <w:t xml:space="preserve">2016</w:t>
+            </w:r>
+          </w:p>
+        </w:tc>
+        <w:tc>
+          <w:p>
+            <w:pPr>
+              <w:pStyle w:val="Compact"/>
+              <w:jc w:val="left"/>
+            </w:pPr>
+            <w:r>
+              <w:rPr>
+                <w:rStyle w:val="VerbatimChar"/>
+              </w:rPr>
+              <w:t xml:space="preserve">ag_mod_b2_16.dta</w:t>
+            </w:r>
+          </w:p>
+        </w:tc>
+        <w:tc>
+          <w:p>
+            <w:pPr>
+              <w:pStyle w:val="Compact"/>
+              <w:jc w:val="left"/>
+            </w:pPr>
+            <w:hyperlink r:id="rId41">
+              <w:r>
+                <w:rPr>
+                  <w:rStyle w:val="Hyperlink"/>
+                </w:rPr>
+                <w:t xml:space="preserve">IHPS long-term panel</w:t>
+              </w:r>
+            </w:hyperlink>
+          </w:p>
+        </w:tc>
+      </w:tr>
+      <w:tr>
+        <w:tc>
+          <w:p/>
+        </w:tc>
+        <w:tc>
+          <w:p>
+            <w:pPr>
+              <w:pStyle w:val="Compact"/>
+              <w:jc w:val="left"/>
+            </w:pPr>
+            <w:r>
+              <w:t xml:space="preserve">2019</w:t>
+            </w:r>
+          </w:p>
+        </w:tc>
+        <w:tc>
+          <w:p>
+            <w:pPr>
+              <w:pStyle w:val="Compact"/>
+              <w:jc w:val="left"/>
+            </w:pPr>
+            <w:r>
+              <w:rPr>
+                <w:rStyle w:val="VerbatimChar"/>
+              </w:rPr>
+              <w:t xml:space="preserve">ag_mod_b2_19.dta</w:t>
+            </w:r>
+          </w:p>
+        </w:tc>
+        <w:tc>
+          <w:p>
+            <w:pPr>
+              <w:pStyle w:val="Compact"/>
+              <w:jc w:val="left"/>
+            </w:pPr>
+            <w:hyperlink r:id="rId41">
+              <w:r>
+                <w:rPr>
+                  <w:rStyle w:val="Hyperlink"/>
+                </w:rPr>
+                <w:t xml:space="preserve">IHPS long-term panel</w:t>
+              </w:r>
+            </w:hyperlink>
+          </w:p>
+        </w:tc>
+      </w:tr>
+      <w:tr>
+        <w:tc>
+          <w:p>
+            <w:pPr>
+              <w:pStyle w:val="Compact"/>
+              <w:jc w:val="left"/>
+            </w:pPr>
+            <w:r>
+              <w:t xml:space="preserve">Mali</w:t>
+            </w:r>
+          </w:p>
+        </w:tc>
+        <w:tc>
+          <w:p>
+            <w:pPr>
+              <w:pStyle w:val="Compact"/>
+              <w:jc w:val="left"/>
+            </w:pPr>
+            <w:r>
+              <w:t xml:space="preserve">2014</w:t>
+            </w:r>
+          </w:p>
+        </w:tc>
+        <w:tc>
+          <w:p>
+            <w:pPr>
+              <w:pStyle w:val="Compact"/>
+              <w:jc w:val="left"/>
+            </w:pPr>
+            <w:r>
+              <w:rPr>
+                <w:rStyle w:val="VerbatimChar"/>
+              </w:rPr>
+              <w:t xml:space="preserve">EACIEXPLOI_p1.dta</w:t>
+            </w:r>
+          </w:p>
+        </w:tc>
+        <w:tc>
+          <w:p>
+            <w:pPr>
+              <w:pStyle w:val="Compact"/>
+              <w:jc w:val="left"/>
+            </w:pPr>
+            <w:hyperlink r:id="rId42">
+              <w:r>
+                <w:rPr>
+                  <w:rStyle w:val="Hyperlink"/>
+                </w:rPr>
+                <w:t xml:space="preserve">EACI 2014</w:t>
+              </w:r>
+            </w:hyperlink>
+          </w:p>
+        </w:tc>
+      </w:tr>
+      <w:tr>
+        <w:tc>
+          <w:p/>
+        </w:tc>
+        <w:tc>
+          <w:p>
+            <w:pPr>
+              <w:pStyle w:val="Compact"/>
+              <w:jc w:val="left"/>
+            </w:pPr>
+            <w:r>
+              <w:t xml:space="preserve">2017</w:t>
+            </w:r>
+          </w:p>
+        </w:tc>
+        <w:tc>
+          <w:p>
+            <w:pPr>
+              <w:pStyle w:val="Compact"/>
+              <w:jc w:val="left"/>
+            </w:pPr>
+            <w:r>
+              <w:rPr>
+                <w:rStyle w:val="VerbatimChar"/>
+              </w:rPr>
+              <w:t xml:space="preserve">eaci17_s11bp1.dta</w:t>
+            </w:r>
+          </w:p>
+        </w:tc>
+        <w:tc>
+          <w:p>
+            <w:pPr>
+              <w:pStyle w:val="Compact"/>
+              <w:jc w:val="left"/>
+            </w:pPr>
+            <w:hyperlink r:id="rId43">
+              <w:r>
+                <w:rPr>
+                  <w:rStyle w:val="Hyperlink"/>
+                </w:rPr>
+                <w:t xml:space="preserve">EACI 2017</w:t>
+              </w:r>
+            </w:hyperlink>
+          </w:p>
+        </w:tc>
+      </w:tr>
+      <w:tr>
+        <w:tc>
+          <w:p>
+            <w:pPr>
+              <w:pStyle w:val="Compact"/>
+              <w:jc w:val="left"/>
+            </w:pPr>
+            <w:r>
+              <w:t xml:space="preserve">Niger</w:t>
+            </w:r>
+          </w:p>
+        </w:tc>
+        <w:tc>
+          <w:p>
+            <w:pPr>
+              <w:pStyle w:val="Compact"/>
+              <w:jc w:val="left"/>
+            </w:pPr>
+            <w:r>
+              <w:t xml:space="preserve">2011</w:t>
+            </w:r>
+          </w:p>
+        </w:tc>
+        <w:tc>
+          <w:p>
+            <w:pPr>
+              <w:pStyle w:val="Compact"/>
+              <w:jc w:val="left"/>
+            </w:pPr>
+            <w:r>
+              <w:rPr>
+                <w:rStyle w:val="VerbatimChar"/>
+              </w:rPr>
+              <w:t xml:space="preserve">ecvmaas1_p1.dta</w:t>
+            </w:r>
+          </w:p>
+        </w:tc>
+        <w:tc>
+          <w:p>
+            <w:pPr>
+              <w:pStyle w:val="Compact"/>
+              <w:jc w:val="left"/>
+            </w:pPr>
+            <w:hyperlink r:id="rId44">
+              <w:r>
+                <w:rPr>
+                  <w:rStyle w:val="Hyperlink"/>
+                </w:rPr>
+                <w:t xml:space="preserve">ECVMA 2011</w:t>
+              </w:r>
+            </w:hyperlink>
+          </w:p>
+        </w:tc>
+      </w:tr>
+      <w:tr>
+        <w:tc>
+          <w:p/>
+        </w:tc>
+        <w:tc>
+          <w:p>
+            <w:pPr>
+              <w:pStyle w:val="Compact"/>
+              <w:jc w:val="left"/>
+            </w:pPr>
+            <w:r>
+              <w:t xml:space="preserve">2014</w:t>
+            </w:r>
+          </w:p>
+        </w:tc>
+        <w:tc>
+          <w:p>
+            <w:pPr>
+              <w:pStyle w:val="Compact"/>
+              <w:jc w:val="left"/>
+            </w:pPr>
+            <w:r>
+              <w:rPr>
+                <w:rStyle w:val="VerbatimChar"/>
+              </w:rPr>
+              <w:t xml:space="preserve">ECVMA2_AS1P1.dta</w:t>
+            </w:r>
+          </w:p>
+        </w:tc>
+        <w:tc>
+          <w:p>
+            <w:pPr>
+              <w:pStyle w:val="Compact"/>
+              <w:jc w:val="left"/>
+            </w:pPr>
+            <w:hyperlink r:id="rId45">
+              <w:r>
+                <w:rPr>
+                  <w:rStyle w:val="Hyperlink"/>
+                </w:rPr>
+                <w:t xml:space="preserve">ECVMA 2014</w:t>
+              </w:r>
+            </w:hyperlink>
+          </w:p>
+        </w:tc>
+      </w:tr>
+      <w:tr>
+        <w:tc>
+          <w:p>
+            <w:pPr>
+              <w:pStyle w:val="Compact"/>
+              <w:jc w:val="left"/>
+            </w:pPr>
+            <w:r>
+              <w:t xml:space="preserve">Nigeria</w:t>
+            </w:r>
+          </w:p>
+        </w:tc>
+        <w:tc>
+          <w:p>
+            <w:pPr>
+              <w:pStyle w:val="Compact"/>
+              <w:jc w:val="left"/>
+            </w:pPr>
+            <w:r>
+              <w:t xml:space="preserve">2011</w:t>
+            </w:r>
+          </w:p>
+        </w:tc>
+        <w:tc>
+          <w:p>
+            <w:pPr>
+              <w:pStyle w:val="Compact"/>
+              <w:jc w:val="left"/>
+            </w:pPr>
+            <w:r>
+              <w:rPr>
+                <w:rStyle w:val="VerbatimChar"/>
+              </w:rPr>
+              <w:t xml:space="preserve">sect11b_plantingw1.dta</w:t>
+            </w:r>
+          </w:p>
+        </w:tc>
+        <w:tc>
+          <w:p>
+            <w:pPr>
+              <w:pStyle w:val="Compact"/>
+              <w:jc w:val="left"/>
+            </w:pPr>
+            <w:hyperlink r:id="rId46">
+              <w:r>
+                <w:rPr>
+                  <w:rStyle w:val="Hyperlink"/>
+                </w:rPr>
+                <w:t xml:space="preserve">GHS 2010/11</w:t>
+              </w:r>
+            </w:hyperlink>
+          </w:p>
+        </w:tc>
+      </w:tr>
+      <w:tr>
+        <w:tc>
+          <w:p/>
+        </w:tc>
+        <w:tc>
+          <w:p>
+            <w:pPr>
+              <w:pStyle w:val="Compact"/>
+              <w:jc w:val="left"/>
+            </w:pPr>
+            <w:r>
+              <w:t xml:space="preserve">2013</w:t>
+            </w:r>
+          </w:p>
+        </w:tc>
+        <w:tc>
+          <w:p>
+            <w:pPr>
+              <w:pStyle w:val="Compact"/>
+              <w:jc w:val="left"/>
+            </w:pPr>
+            <w:r>
+              <w:rPr>
+                <w:rStyle w:val="VerbatimChar"/>
+              </w:rPr>
+              <w:t xml:space="preserve">sect11b1_plantingw2.dta</w:t>
+            </w:r>
+          </w:p>
+        </w:tc>
+        <w:tc>
+          <w:p>
+            <w:pPr>
+              <w:pStyle w:val="Compact"/>
+              <w:jc w:val="left"/>
+            </w:pPr>
+            <w:hyperlink r:id="rId47">
+              <w:r>
+                <w:rPr>
+                  <w:rStyle w:val="Hyperlink"/>
+                </w:rPr>
+                <w:t xml:space="preserve">GHS 2012/13</w:t>
+              </w:r>
+            </w:hyperlink>
+          </w:p>
+        </w:tc>
+      </w:tr>
+      <w:tr>
+        <w:tc>
+          <w:p/>
+        </w:tc>
+        <w:tc>
+          <w:p>
+            <w:pPr>
+              <w:pStyle w:val="Compact"/>
+              <w:jc w:val="left"/>
+            </w:pPr>
+            <w:r>
+              <w:t xml:space="preserve">2016</w:t>
+            </w:r>
+          </w:p>
+        </w:tc>
+        <w:tc>
+          <w:p>
+            <w:pPr>
+              <w:pStyle w:val="Compact"/>
+              <w:jc w:val="left"/>
+            </w:pPr>
+            <w:r>
+              <w:rPr>
+                <w:rStyle w:val="VerbatimChar"/>
+              </w:rPr>
+              <w:t xml:space="preserve">sect11b1_plantingw3.dta</w:t>
+            </w:r>
+          </w:p>
+        </w:tc>
+        <w:tc>
+          <w:p>
+            <w:pPr>
+              <w:pStyle w:val="Compact"/>
+              <w:jc w:val="left"/>
+            </w:pPr>
+            <w:hyperlink r:id="rId48">
+              <w:r>
+                <w:rPr>
+                  <w:rStyle w:val="Hyperlink"/>
+                </w:rPr>
+                <w:t xml:space="preserve">GHS 2015/16</w:t>
+              </w:r>
+            </w:hyperlink>
+          </w:p>
+        </w:tc>
+      </w:tr>
+      <w:tr>
+        <w:tc>
+          <w:p/>
+        </w:tc>
+        <w:tc>
+          <w:p>
+            <w:pPr>
+              <w:pStyle w:val="Compact"/>
+              <w:jc w:val="left"/>
+            </w:pPr>
+            <w:r>
+              <w:t xml:space="preserve">2019</w:t>
+            </w:r>
+          </w:p>
+        </w:tc>
+        <w:tc>
+          <w:p>
+            <w:pPr>
+              <w:pStyle w:val="Compact"/>
+              <w:jc w:val="left"/>
+            </w:pPr>
+            <w:r>
+              <w:rPr>
+                <w:rStyle w:val="VerbatimChar"/>
+              </w:rPr>
+              <w:t xml:space="preserve">sect11b1_plantingw4.dta</w:t>
+            </w:r>
+          </w:p>
+        </w:tc>
+        <w:tc>
+          <w:p>
+            <w:pPr>
+              <w:pStyle w:val="Compact"/>
+              <w:jc w:val="left"/>
+            </w:pPr>
+            <w:hyperlink r:id="rId49">
+              <w:r>
+                <w:rPr>
+                  <w:rStyle w:val="Hyperlink"/>
+                </w:rPr>
+                <w:t xml:space="preserve">GHS 2018/19</w:t>
+              </w:r>
+            </w:hyperlink>
+          </w:p>
+        </w:tc>
+      </w:tr>
+      <w:tr>
+        <w:tc>
+          <w:p/>
+        </w:tc>
+        <w:tc>
+          <w:p>
+            <w:pPr>
+              <w:pStyle w:val="Compact"/>
+              <w:jc w:val="left"/>
+            </w:pPr>
+            <w:r>
+              <w:t xml:space="preserve">2023</w:t>
+            </w:r>
+          </w:p>
+        </w:tc>
+        <w:tc>
+          <w:p>
+            <w:pPr>
+              <w:pStyle w:val="Compact"/>
+              <w:jc w:val="left"/>
+            </w:pPr>
+            <w:r>
+              <w:rPr>
+                <w:rStyle w:val="VerbatimChar"/>
+              </w:rPr>
+              <w:t xml:space="preserve">sect11b1_plantingw5.dta</w:t>
+            </w:r>
+          </w:p>
+        </w:tc>
+        <w:tc>
+          <w:p>
+            <w:pPr>
+              <w:pStyle w:val="Compact"/>
+              <w:jc w:val="left"/>
+            </w:pPr>
             <w:r>
               <w:rPr>
                 <w:i/>
@@ -10611,6 +11187,60 @@
       </w:tr>
       <w:tr>
         <w:tc>
+          <w:p>
+            <w:pPr>
+              <w:pStyle w:val="Compact"/>
+              <w:jc w:val="left"/>
+            </w:pPr>
+            <w:r>
+              <w:t xml:space="preserve">Tanzania</w:t>
+            </w:r>
+          </w:p>
+        </w:tc>
+        <w:tc>
+          <w:p>
+            <w:pPr>
+              <w:pStyle w:val="Compact"/>
+              <w:jc w:val="left"/>
+            </w:pPr>
+            <w:r>
+              <w:t xml:space="preserve">2009</w:t>
+            </w:r>
+          </w:p>
+        </w:tc>
+        <w:tc>
+          <w:p>
+            <w:pPr>
+              <w:pStyle w:val="Compact"/>
+              <w:jc w:val="left"/>
+            </w:pPr>
+            <w:r>
+              <w:rPr>
+                <w:rStyle w:val="VerbatimChar"/>
+              </w:rPr>
+              <w:t xml:space="preserve">SEC_3A.dta</w:t>
+            </w:r>
+          </w:p>
+        </w:tc>
+        <w:tc>
+          <w:p>
+            <w:pPr>
+              <w:pStyle w:val="Compact"/>
+              <w:jc w:val="left"/>
+            </w:pPr>
+            <w:hyperlink r:id="rId50">
+              <w:r>
+                <w:rPr>
+                  <w:rStyle w:val="Hyperlink"/>
+                </w:rPr>
+                <w:t xml:space="preserve">NPS 2008/09</w:t>
+              </w:r>
+            </w:hyperlink>
+          </w:p>
+        </w:tc>
+      </w:tr>
+      <w:tr>
+        <w:tc>
           <w:p/>
         </w:tc>
         <w:tc>
@@ -10620,6 +11250,52 @@
               <w:jc w:val="left"/>
             </w:pPr>
             <w:r>
+              <w:t xml:space="preserve">2011</w:t>
+            </w:r>
+          </w:p>
+        </w:tc>
+        <w:tc>
+          <w:p>
+            <w:pPr>
+              <w:pStyle w:val="Compact"/>
+              <w:jc w:val="left"/>
+            </w:pPr>
+            <w:r>
+              <w:rPr>
+                <w:rStyle w:val="VerbatimChar"/>
+              </w:rPr>
+              <w:t xml:space="preserve">AG_SEC3A.dta</w:t>
+            </w:r>
+          </w:p>
+        </w:tc>
+        <w:tc>
+          <w:p>
+            <w:pPr>
+              <w:pStyle w:val="Compact"/>
+              <w:jc w:val="left"/>
+            </w:pPr>
+            <w:hyperlink r:id="rId51">
+              <w:r>
+                <w:rPr>
+                  <w:rStyle w:val="Hyperlink"/>
+                </w:rPr>
+                <w:t xml:space="preserve">NPS 2010/11</w:t>
+              </w:r>
+            </w:hyperlink>
+          </w:p>
+        </w:tc>
+      </w:tr>
+      <w:tr>
+        <w:tc>
+          <w:p/>
+        </w:tc>
+        <w:tc>
+          <w:p>
+            <w:pPr>
+              <w:pStyle w:val="Compact"/>
+              <w:jc w:val="left"/>
+            </w:pPr>
+            <w:r>
               <w:t xml:space="preserve">2013</w:t>
             </w:r>
           </w:p>
@@ -10634,22 +11310,24 @@
               <w:rPr>
                 <w:rStyle w:val="VerbatimChar"/>
               </w:rPr>
-              <w:t xml:space="preserve">ag_mod_d_13.dta</w:t>
-            </w:r>
-          </w:p>
-        </w:tc>
-        <w:tc>
-          <w:p>
-            <w:pPr>
-              <w:pStyle w:val="Compact"/>
-              <w:jc w:val="left"/>
-            </w:pPr>
-            <w:r>
-              <w:rPr>
-                <w:i/>
-              </w:rPr>
-              <w:t xml:space="preserve">(pending)</w:t>
-            </w:r>
+              <w:t xml:space="preserve">AG_SEC_3A.dta</w:t>
+            </w:r>
+          </w:p>
+        </w:tc>
+        <w:tc>
+          <w:p>
+            <w:pPr>
+              <w:pStyle w:val="Compact"/>
+              <w:jc w:val="left"/>
+            </w:pPr>
+            <w:hyperlink r:id="rId52">
+              <w:r>
+                <w:rPr>
+                  <w:rStyle w:val="Hyperlink"/>
+                </w:rPr>
+                <w:t xml:space="preserve">NPS 2012/13</w:t>
+              </w:r>
+            </w:hyperlink>
           </w:p>
         </w:tc>
       </w:tr>
@@ -10664,36 +11342,44 @@
               <w:jc w:val="left"/>
             </w:pPr>
             <w:r>
-              <w:t xml:space="preserve">2016</w:t>
-            </w:r>
-          </w:p>
-        </w:tc>
-        <w:tc>
-          <w:p>
-            <w:pPr>
-              <w:pStyle w:val="Compact"/>
-              <w:jc w:val="left"/>
-            </w:pPr>
-            <w:r>
-              <w:rPr>
-                <w:rStyle w:val="VerbatimChar"/>
-              </w:rPr>
-              <w:t xml:space="preserve">ag_mod_b2_16.dta</w:t>
-            </w:r>
-          </w:p>
-        </w:tc>
-        <w:tc>
-          <w:p>
-            <w:pPr>
-              <w:pStyle w:val="Compact"/>
-              <w:jc w:val="left"/>
-            </w:pPr>
-            <w:r>
-              <w:rPr>
-                <w:i/>
-              </w:rPr>
-              <w:t xml:space="preserve">(pending)</w:t>
-            </w:r>
+              <w:t xml:space="preserve">2015</w:t>
+            </w:r>
+          </w:p>
+        </w:tc>
+        <w:tc>
+          <w:p>
+            <w:pPr>
+              <w:pStyle w:val="Compact"/>
+              <w:jc w:val="left"/>
+            </w:pPr>
+            <w:r>
+              <w:rPr>
+                <w:rStyle w:val="VerbatimChar"/>
+              </w:rPr>
+              <w:t xml:space="preserve">AG_SEC_3A.dta</w:t>
+            </w:r>
+            <w:r>
+              <w:t xml:space="preserve"> </w:t>
+            </w:r>
+            <w:r>
+              <w:t xml:space="preserve">(extended + refresh)</w:t>
+            </w:r>
+          </w:p>
+        </w:tc>
+        <w:tc>
+          <w:p>
+            <w:pPr>
+              <w:pStyle w:val="Compact"/>
+              <w:jc w:val="left"/>
+            </w:pPr>
+            <w:hyperlink r:id="rId53">
+              <w:r>
+                <w:rPr>
+                  <w:rStyle w:val="Hyperlink"/>
+                </w:rPr>
+                <w:t xml:space="preserve">NPS 2014/15</w:t>
+              </w:r>
+            </w:hyperlink>
           </w:p>
         </w:tc>
       </w:tr>
@@ -10722,454 +11408,42 @@
               <w:rPr>
                 <w:rStyle w:val="VerbatimChar"/>
               </w:rPr>
-              <w:t xml:space="preserve">ag_mod_b2_19.dta</w:t>
-            </w:r>
-          </w:p>
-        </w:tc>
-        <w:tc>
-          <w:p>
-            <w:pPr>
-              <w:pStyle w:val="Compact"/>
-              <w:jc w:val="left"/>
-            </w:pPr>
-            <w:r>
-              <w:rPr>
-                <w:i/>
-              </w:rPr>
-              <w:t xml:space="preserve">(pending)</w:t>
-            </w:r>
-          </w:p>
-        </w:tc>
-      </w:tr>
-      <w:tr>
-        <w:tc>
-          <w:p>
-            <w:pPr>
-              <w:pStyle w:val="Compact"/>
-              <w:jc w:val="left"/>
-            </w:pPr>
-            <w:r>
-              <w:t xml:space="preserve">Mali</w:t>
-            </w:r>
-          </w:p>
-        </w:tc>
-        <w:tc>
-          <w:p>
-            <w:pPr>
-              <w:pStyle w:val="Compact"/>
-              <w:jc w:val="left"/>
-            </w:pPr>
-            <w:r>
-              <w:t xml:space="preserve">2014</w:t>
-            </w:r>
-          </w:p>
-        </w:tc>
-        <w:tc>
-          <w:p>
-            <w:pPr>
-              <w:pStyle w:val="Compact"/>
-              <w:jc w:val="left"/>
-            </w:pPr>
-            <w:r>
-              <w:rPr>
-                <w:rStyle w:val="VerbatimChar"/>
-              </w:rPr>
-              <w:t xml:space="preserve">EACIEXPLOI_p1.dta</w:t>
-            </w:r>
-          </w:p>
-        </w:tc>
-        <w:tc>
-          <w:p>
-            <w:pPr>
-              <w:pStyle w:val="Compact"/>
-              <w:jc w:val="left"/>
-            </w:pPr>
-            <w:r>
-              <w:rPr>
-                <w:i/>
-              </w:rPr>
-              <w:t xml:space="preserve">(pending)</w:t>
-            </w:r>
-          </w:p>
-        </w:tc>
-      </w:tr>
-      <w:tr>
-        <w:tc>
-          <w:p/>
-        </w:tc>
-        <w:tc>
-          <w:p>
-            <w:pPr>
-              <w:pStyle w:val="Compact"/>
-              <w:jc w:val="left"/>
-            </w:pPr>
-            <w:r>
-              <w:t xml:space="preserve">2017</w:t>
-            </w:r>
-          </w:p>
-        </w:tc>
-        <w:tc>
-          <w:p>
-            <w:pPr>
-              <w:pStyle w:val="Compact"/>
-              <w:jc w:val="left"/>
-            </w:pPr>
-            <w:r>
-              <w:rPr>
-                <w:rStyle w:val="VerbatimChar"/>
-              </w:rPr>
-              <w:t xml:space="preserve">eaci17_s11bp1.dta</w:t>
-            </w:r>
-          </w:p>
-        </w:tc>
-        <w:tc>
-          <w:p>
-            <w:pPr>
-              <w:pStyle w:val="Compact"/>
-              <w:jc w:val="left"/>
-            </w:pPr>
-            <w:r>
-              <w:rPr>
-                <w:i/>
-              </w:rPr>
-              <w:t xml:space="preserve">(pending)</w:t>
-            </w:r>
-          </w:p>
-        </w:tc>
-      </w:tr>
-      <w:tr>
-        <w:tc>
-          <w:p>
-            <w:pPr>
-              <w:pStyle w:val="Compact"/>
-              <w:jc w:val="left"/>
-            </w:pPr>
-            <w:r>
-              <w:t xml:space="preserve">Niger</w:t>
-            </w:r>
-          </w:p>
-        </w:tc>
-        <w:tc>
-          <w:p>
-            <w:pPr>
-              <w:pStyle w:val="Compact"/>
-              <w:jc w:val="left"/>
-            </w:pPr>
-            <w:r>
-              <w:t xml:space="preserve">2011</w:t>
-            </w:r>
-          </w:p>
-        </w:tc>
-        <w:tc>
-          <w:p>
-            <w:pPr>
-              <w:pStyle w:val="Compact"/>
-              <w:jc w:val="left"/>
-            </w:pPr>
-            <w:r>
-              <w:rPr>
-                <w:rStyle w:val="VerbatimChar"/>
-              </w:rPr>
-              <w:t xml:space="preserve">ecvmaas1_p1.dta</w:t>
-            </w:r>
-          </w:p>
-        </w:tc>
-        <w:tc>
-          <w:p>
-            <w:pPr>
-              <w:pStyle w:val="Compact"/>
-              <w:jc w:val="left"/>
-            </w:pPr>
-            <w:r>
-              <w:rPr>
-                <w:i/>
-              </w:rPr>
-              <w:t xml:space="preserve">(pending)</w:t>
-            </w:r>
-          </w:p>
-        </w:tc>
-      </w:tr>
-      <w:tr>
-        <w:tc>
-          <w:p/>
-        </w:tc>
-        <w:tc>
-          <w:p>
-            <w:pPr>
-              <w:pStyle w:val="Compact"/>
-              <w:jc w:val="left"/>
-            </w:pPr>
-            <w:r>
-              <w:t xml:space="preserve">2014</w:t>
-            </w:r>
-          </w:p>
-        </w:tc>
-        <w:tc>
-          <w:p>
-            <w:pPr>
-              <w:pStyle w:val="Compact"/>
-              <w:jc w:val="left"/>
-            </w:pPr>
-            <w:r>
-              <w:rPr>
-                <w:rStyle w:val="VerbatimChar"/>
-              </w:rPr>
-              <w:t xml:space="preserve">ECVMA2_AS1P1.dta</w:t>
-            </w:r>
-          </w:p>
-        </w:tc>
-        <w:tc>
-          <w:p>
-            <w:pPr>
-              <w:pStyle w:val="Compact"/>
-              <w:jc w:val="left"/>
-            </w:pPr>
-            <w:r>
-              <w:rPr>
-                <w:i/>
-              </w:rPr>
-              <w:t xml:space="preserve">(pending)</w:t>
-            </w:r>
-          </w:p>
-        </w:tc>
-      </w:tr>
-      <w:tr>
-        <w:tc>
-          <w:p>
-            <w:pPr>
-              <w:pStyle w:val="Compact"/>
-              <w:jc w:val="left"/>
-            </w:pPr>
-            <w:r>
-              <w:t xml:space="preserve">Nigeria</w:t>
-            </w:r>
-          </w:p>
-        </w:tc>
-        <w:tc>
-          <w:p>
-            <w:pPr>
-              <w:pStyle w:val="Compact"/>
-              <w:jc w:val="left"/>
-            </w:pPr>
-            <w:r>
-              <w:t xml:space="preserve">2011</w:t>
-            </w:r>
-          </w:p>
-        </w:tc>
-        <w:tc>
-          <w:p>
-            <w:pPr>
-              <w:pStyle w:val="Compact"/>
-              <w:jc w:val="left"/>
-            </w:pPr>
-            <w:r>
-              <w:rPr>
-                <w:rStyle w:val="VerbatimChar"/>
-              </w:rPr>
-              <w:t xml:space="preserve">sect11b_plantingw1.dta</w:t>
-            </w:r>
-          </w:p>
-        </w:tc>
-        <w:tc>
-          <w:p>
-            <w:pPr>
-              <w:pStyle w:val="Compact"/>
-              <w:jc w:val="left"/>
-            </w:pPr>
-            <w:r>
-              <w:rPr>
-                <w:i/>
-              </w:rPr>
-              <w:t xml:space="preserve">(pending)</w:t>
-            </w:r>
-          </w:p>
-        </w:tc>
-      </w:tr>
-      <w:tr>
-        <w:tc>
-          <w:p/>
-        </w:tc>
-        <w:tc>
-          <w:p>
-            <w:pPr>
-              <w:pStyle w:val="Compact"/>
-              <w:jc w:val="left"/>
-            </w:pPr>
-            <w:r>
-              <w:t xml:space="preserve">2013</w:t>
-            </w:r>
-          </w:p>
-        </w:tc>
-        <w:tc>
-          <w:p>
-            <w:pPr>
-              <w:pStyle w:val="Compact"/>
-              <w:jc w:val="left"/>
-            </w:pPr>
-            <w:r>
-              <w:rPr>
-                <w:rStyle w:val="VerbatimChar"/>
-              </w:rPr>
-              <w:t xml:space="preserve">sect11b1_plantingw2.dta</w:t>
-            </w:r>
-          </w:p>
-        </w:tc>
-        <w:tc>
-          <w:p>
-            <w:pPr>
-              <w:pStyle w:val="Compact"/>
-              <w:jc w:val="left"/>
-            </w:pPr>
-            <w:r>
-              <w:rPr>
-                <w:i/>
-              </w:rPr>
-              <w:t xml:space="preserve">(pending)</w:t>
-            </w:r>
-          </w:p>
-        </w:tc>
-      </w:tr>
-      <w:tr>
-        <w:tc>
-          <w:p/>
-        </w:tc>
-        <w:tc>
-          <w:p>
-            <w:pPr>
-              <w:pStyle w:val="Compact"/>
-              <w:jc w:val="left"/>
-            </w:pPr>
-            <w:r>
-              <w:t xml:space="preserve">2016</w:t>
-            </w:r>
-          </w:p>
-        </w:tc>
-        <w:tc>
-          <w:p>
-            <w:pPr>
-              <w:pStyle w:val="Compact"/>
-              <w:jc w:val="left"/>
-            </w:pPr>
-            <w:r>
-              <w:rPr>
-                <w:rStyle w:val="VerbatimChar"/>
-              </w:rPr>
-              <w:t xml:space="preserve">sect11b1_plantingw3.dta</w:t>
-            </w:r>
-          </w:p>
-        </w:tc>
-        <w:tc>
-          <w:p>
-            <w:pPr>
-              <w:pStyle w:val="Compact"/>
-              <w:jc w:val="left"/>
-            </w:pPr>
-            <w:r>
-              <w:rPr>
-                <w:i/>
-              </w:rPr>
-              <w:t xml:space="preserve">(pending)</w:t>
-            </w:r>
-          </w:p>
-        </w:tc>
-      </w:tr>
-      <w:tr>
-        <w:tc>
-          <w:p/>
-        </w:tc>
-        <w:tc>
-          <w:p>
-            <w:pPr>
-              <w:pStyle w:val="Compact"/>
-              <w:jc w:val="left"/>
-            </w:pPr>
-            <w:r>
-              <w:t xml:space="preserve">2019</w:t>
-            </w:r>
-          </w:p>
-        </w:tc>
-        <w:tc>
-          <w:p>
-            <w:pPr>
-              <w:pStyle w:val="Compact"/>
-              <w:jc w:val="left"/>
-            </w:pPr>
-            <w:r>
-              <w:rPr>
-                <w:rStyle w:val="VerbatimChar"/>
-              </w:rPr>
-              <w:t xml:space="preserve">sect11b1_plantingw4.dta</w:t>
-            </w:r>
-          </w:p>
-        </w:tc>
-        <w:tc>
-          <w:p>
-            <w:pPr>
-              <w:pStyle w:val="Compact"/>
-              <w:jc w:val="left"/>
-            </w:pPr>
-            <w:r>
-              <w:rPr>
-                <w:i/>
-              </w:rPr>
-              <w:t xml:space="preserve">(pending)</w:t>
-            </w:r>
-          </w:p>
-        </w:tc>
-      </w:tr>
-      <w:tr>
-        <w:tc>
-          <w:p/>
-        </w:tc>
-        <w:tc>
-          <w:p>
-            <w:pPr>
-              <w:pStyle w:val="Compact"/>
-              <w:jc w:val="left"/>
-            </w:pPr>
-            <w:r>
-              <w:t xml:space="preserve">2023</w:t>
-            </w:r>
-          </w:p>
-        </w:tc>
-        <w:tc>
-          <w:p>
-            <w:pPr>
-              <w:pStyle w:val="Compact"/>
-              <w:jc w:val="left"/>
-            </w:pPr>
-            <w:r>
-              <w:rPr>
-                <w:rStyle w:val="VerbatimChar"/>
-              </w:rPr>
-              <w:t xml:space="preserve">sect11b1_plantingw5.dta</w:t>
-            </w:r>
-          </w:p>
-        </w:tc>
-        <w:tc>
-          <w:p>
-            <w:pPr>
-              <w:pStyle w:val="Compact"/>
-              <w:jc w:val="left"/>
-            </w:pPr>
-            <w:r>
-              <w:rPr>
-                <w:i/>
-              </w:rPr>
-              <w:t xml:space="preserve">(pending)</w:t>
-            </w:r>
-          </w:p>
-        </w:tc>
-      </w:tr>
-      <w:tr>
-        <w:tc>
-          <w:p>
-            <w:pPr>
-              <w:pStyle w:val="Compact"/>
-              <w:jc w:val="left"/>
-            </w:pPr>
-            <w:r>
-              <w:t xml:space="preserve">Tanzania</w:t>
+              <w:t xml:space="preserve">AG_SEC_3A.dta</w:t>
+            </w:r>
+            <w:r>
+              <w:t xml:space="preserve"> </w:t>
+            </w:r>
+            <w:r>
+              <w:t xml:space="preserve">(extended + refresh)</w:t>
+            </w:r>
+          </w:p>
+        </w:tc>
+        <w:tc>
+          <w:p>
+            <w:pPr>
+              <w:pStyle w:val="Compact"/>
+              <w:jc w:val="left"/>
+            </w:pPr>
+            <w:hyperlink r:id="rId54">
+              <w:r>
+                <w:rPr>
+                  <w:rStyle w:val="Hyperlink"/>
+                </w:rPr>
+                <w:t xml:space="preserve">NPS 2019/20 SDD</w:t>
+              </w:r>
+            </w:hyperlink>
+          </w:p>
+        </w:tc>
+      </w:tr>
+      <w:tr>
+        <w:tc>
+          <w:p>
+            <w:pPr>
+              <w:pStyle w:val="Compact"/>
+              <w:jc w:val="left"/>
+            </w:pPr>
+            <w:r>
+              <w:t xml:space="preserve">Uganda</w:t>
             </w:r>
           </w:p>
         </w:tc>
@@ -11194,246 +11468,6 @@
               <w:rPr>
                 <w:rStyle w:val="VerbatimChar"/>
               </w:rPr>
-              <w:t xml:space="preserve">SEC_3A.dta</w:t>
-            </w:r>
-          </w:p>
-        </w:tc>
-        <w:tc>
-          <w:p>
-            <w:pPr>
-              <w:pStyle w:val="Compact"/>
-              <w:jc w:val="left"/>
-            </w:pPr>
-            <w:r>
-              <w:rPr>
-                <w:i/>
-              </w:rPr>
-              <w:t xml:space="preserve">(pending)</w:t>
-            </w:r>
-          </w:p>
-        </w:tc>
-      </w:tr>
-      <w:tr>
-        <w:tc>
-          <w:p/>
-        </w:tc>
-        <w:tc>
-          <w:p>
-            <w:pPr>
-              <w:pStyle w:val="Compact"/>
-              <w:jc w:val="left"/>
-            </w:pPr>
-            <w:r>
-              <w:t xml:space="preserve">2011</w:t>
-            </w:r>
-          </w:p>
-        </w:tc>
-        <w:tc>
-          <w:p>
-            <w:pPr>
-              <w:pStyle w:val="Compact"/>
-              <w:jc w:val="left"/>
-            </w:pPr>
-            <w:r>
-              <w:rPr>
-                <w:rStyle w:val="VerbatimChar"/>
-              </w:rPr>
-              <w:t xml:space="preserve">AG_SEC3A.dta</w:t>
-            </w:r>
-          </w:p>
-        </w:tc>
-        <w:tc>
-          <w:p>
-            <w:pPr>
-              <w:pStyle w:val="Compact"/>
-              <w:jc w:val="left"/>
-            </w:pPr>
-            <w:r>
-              <w:rPr>
-                <w:i/>
-              </w:rPr>
-              <w:t xml:space="preserve">(pending)</w:t>
-            </w:r>
-          </w:p>
-        </w:tc>
-      </w:tr>
-      <w:tr>
-        <w:tc>
-          <w:p/>
-        </w:tc>
-        <w:tc>
-          <w:p>
-            <w:pPr>
-              <w:pStyle w:val="Compact"/>
-              <w:jc w:val="left"/>
-            </w:pPr>
-            <w:r>
-              <w:t xml:space="preserve">2013</w:t>
-            </w:r>
-          </w:p>
-        </w:tc>
-        <w:tc>
-          <w:p>
-            <w:pPr>
-              <w:pStyle w:val="Compact"/>
-              <w:jc w:val="left"/>
-            </w:pPr>
-            <w:r>
-              <w:rPr>
-                <w:rStyle w:val="VerbatimChar"/>
-              </w:rPr>
-              <w:t xml:space="preserve">AG_SEC_3A.dta</w:t>
-            </w:r>
-          </w:p>
-        </w:tc>
-        <w:tc>
-          <w:p>
-            <w:pPr>
-              <w:pStyle w:val="Compact"/>
-              <w:jc w:val="left"/>
-            </w:pPr>
-            <w:r>
-              <w:rPr>
-                <w:i/>
-              </w:rPr>
-              <w:t xml:space="preserve">(pending)</w:t>
-            </w:r>
-          </w:p>
-        </w:tc>
-      </w:tr>
-      <w:tr>
-        <w:tc>
-          <w:p/>
-        </w:tc>
-        <w:tc>
-          <w:p>
-            <w:pPr>
-              <w:pStyle w:val="Compact"/>
-              <w:jc w:val="left"/>
-            </w:pPr>
-            <w:r>
-              <w:t xml:space="preserve">2015</w:t>
-            </w:r>
-          </w:p>
-        </w:tc>
-        <w:tc>
-          <w:p>
-            <w:pPr>
-              <w:pStyle w:val="Compact"/>
-              <w:jc w:val="left"/>
-            </w:pPr>
-            <w:r>
-              <w:rPr>
-                <w:rStyle w:val="VerbatimChar"/>
-              </w:rPr>
-              <w:t xml:space="preserve">AG_SEC_3A.dta</w:t>
-            </w:r>
-            <w:r>
-              <w:t xml:space="preserve"> </w:t>
-            </w:r>
-            <w:r>
-              <w:t xml:space="preserve">(extended + refresh)</w:t>
-            </w:r>
-          </w:p>
-        </w:tc>
-        <w:tc>
-          <w:p>
-            <w:pPr>
-              <w:pStyle w:val="Compact"/>
-              <w:jc w:val="left"/>
-            </w:pPr>
-            <w:r>
-              <w:rPr>
-                <w:i/>
-              </w:rPr>
-              <w:t xml:space="preserve">(pending)</w:t>
-            </w:r>
-          </w:p>
-        </w:tc>
-      </w:tr>
-      <w:tr>
-        <w:tc>
-          <w:p/>
-        </w:tc>
-        <w:tc>
-          <w:p>
-            <w:pPr>
-              <w:pStyle w:val="Compact"/>
-              <w:jc w:val="left"/>
-            </w:pPr>
-            <w:r>
-              <w:t xml:space="preserve">2019</w:t>
-            </w:r>
-          </w:p>
-        </w:tc>
-        <w:tc>
-          <w:p>
-            <w:pPr>
-              <w:pStyle w:val="Compact"/>
-              <w:jc w:val="left"/>
-            </w:pPr>
-            <w:r>
-              <w:rPr>
-                <w:rStyle w:val="VerbatimChar"/>
-              </w:rPr>
-              <w:t xml:space="preserve">AG_SEC_3A.dta</w:t>
-            </w:r>
-            <w:r>
-              <w:t xml:space="preserve"> </w:t>
-            </w:r>
-            <w:r>
-              <w:t xml:space="preserve">(extended + refresh)</w:t>
-            </w:r>
-          </w:p>
-        </w:tc>
-        <w:tc>
-          <w:p>
-            <w:pPr>
-              <w:pStyle w:val="Compact"/>
-              <w:jc w:val="left"/>
-            </w:pPr>
-            <w:r>
-              <w:rPr>
-                <w:i/>
-              </w:rPr>
-              <w:t xml:space="preserve">(pending)</w:t>
-            </w:r>
-          </w:p>
-        </w:tc>
-      </w:tr>
-      <w:tr>
-        <w:tc>
-          <w:p>
-            <w:pPr>
-              <w:pStyle w:val="Compact"/>
-              <w:jc w:val="left"/>
-            </w:pPr>
-            <w:r>
-              <w:t xml:space="preserve">Uganda</w:t>
-            </w:r>
-          </w:p>
-        </w:tc>
-        <w:tc>
-          <w:p>
-            <w:pPr>
-              <w:pStyle w:val="Compact"/>
-              <w:jc w:val="left"/>
-            </w:pPr>
-            <w:r>
-              <w:t xml:space="preserve">2009</w:t>
-            </w:r>
-          </w:p>
-        </w:tc>
-        <w:tc>
-          <w:p>
-            <w:pPr>
-              <w:pStyle w:val="Compact"/>
-              <w:jc w:val="left"/>
-            </w:pPr>
-            <w:r>
-              <w:rPr>
-                <w:rStyle w:val="VerbatimChar"/>
-              </w:rPr>
               <w:t xml:space="preserve">2009_AGSEC2A.dta</w:t>
             </w:r>
           </w:p>
@@ -11444,7 +11478,7 @@
               <w:pStyle w:val="Compact"/>
               <w:jc w:val="left"/>
             </w:pPr>
-            <w:hyperlink r:id="rId41">
+            <w:hyperlink r:id="rId55">
               <w:r>
                 <w:rPr>
                   <w:rStyle w:val="Hyperlink"/>
@@ -11490,7 +11524,7 @@
               <w:pStyle w:val="Compact"/>
               <w:jc w:val="left"/>
             </w:pPr>
-            <w:hyperlink r:id="rId42">
+            <w:hyperlink r:id="rId56">
               <w:r>
                 <w:rPr>
                   <w:rStyle w:val="Hyperlink"/>
@@ -11536,7 +11570,7 @@
               <w:pStyle w:val="Compact"/>
               <w:jc w:val="left"/>
             </w:pPr>
-            <w:hyperlink r:id="rId43">
+            <w:hyperlink r:id="rId57">
               <w:r>
                 <w:rPr>
                   <w:rStyle w:val="Hyperlink"/>
@@ -11582,7 +11616,7 @@
               <w:pStyle w:val="Compact"/>
               <w:jc w:val="left"/>
             </w:pPr>
-            <w:hyperlink r:id="rId44">
+            <w:hyperlink r:id="rId58">
               <w:r>
                 <w:rPr>
                   <w:rStyle w:val="Hyperlink"/>
@@ -11628,7 +11662,7 @@
               <w:pStyle w:val="Compact"/>
               <w:jc w:val="left"/>
             </w:pPr>
-            <w:hyperlink r:id="rId45">
+            <w:hyperlink r:id="rId59">
               <w:r>
                 <w:rPr>
                   <w:rStyle w:val="Hyperlink"/>
@@ -11674,7 +11708,7 @@
               <w:pStyle w:val="Compact"/>
               <w:jc w:val="left"/>
             </w:pPr>
-            <w:hyperlink r:id="rId46">
+            <w:hyperlink r:id="rId60">
               <w:r>
                 <w:rPr>
                   <w:rStyle w:val="Hyperlink"/>
@@ -11720,7 +11754,7 @@
               <w:pStyle w:val="Compact"/>
               <w:jc w:val="left"/>
             </w:pPr>
-            <w:hyperlink r:id="rId47">
+            <w:hyperlink r:id="rId61">
               <w:r>
                 <w:rPr>
                   <w:rStyle w:val="Hyperlink"/>
@@ -11920,12 +11954,14 @@
               <w:pStyle w:val="Compact"/>
               <w:jc w:val="left"/>
             </w:pPr>
-            <w:r>
-              <w:rPr>
-                <w:i/>
-              </w:rPr>
-              <w:t xml:space="preserve">(NBS Tanzania; pending)</w:t>
-            </w:r>
+            <w:hyperlink r:id="rId62">
+              <w:r>
+                <w:rPr>
+                  <w:rStyle w:val="Hyperlink"/>
+                </w:rPr>
+                <w:t xml:space="preserve">ASC 2008/09 (NBS)</w:t>
+              </w:r>
+            </w:hyperlink>
           </w:p>
         </w:tc>
       </w:tr>
@@ -11964,12 +12000,14 @@
               <w:pStyle w:val="Compact"/>
               <w:jc w:val="left"/>
             </w:pPr>
-            <w:r>
-              <w:rPr>
-                <w:i/>
-              </w:rPr>
-              <w:t xml:space="preserve">(NBS Tanzania; pending)</w:t>
-            </w:r>
+            <w:hyperlink r:id="rId63">
+              <w:r>
+                <w:rPr>
+                  <w:rStyle w:val="Hyperlink"/>
+                </w:rPr>
+                <w:t xml:space="preserve">ASC 2019/20 (NBS)</w:t>
+              </w:r>
+            </w:hyperlink>
           </w:p>
         </w:tc>
       </w:tr>
@@ -11978,11 +12016,11 @@
       <w:pPr>
         <w:pStyle w:val="Heading1"/>
       </w:pPr>
-      <w:bookmarkStart w:id="48" w:name="Xa67191bf5e36bc64804d7ea38af21a2ea39cd14"/>
+      <w:bookmarkStart w:id="64" w:name="Xa67191bf5e36bc64804d7ea38af21a2ea39cd14"/>
       <w:r>
         <w:t xml:space="preserve">Appendix A. Per-country variable provenance</w:t>
       </w:r>
-      <w:bookmarkEnd w:id="48"/>
+      <w:bookmarkEnd w:id="64"/>
     </w:p>
     <w:p>
       <w:pPr>
@@ -12002,21 +12040,21 @@
       <w:pPr>
         <w:pStyle w:val="Heading2"/>
       </w:pPr>
-      <w:bookmarkStart w:id="49" w:name="X00728ba8d2160b74857f05f98b30c703885711f"/>
+      <w:bookmarkStart w:id="65" w:name="X00728ba8d2160b74857f05f98b30c703885711f"/>
       <w:r>
         <w:t xml:space="preserve">ETHIOPIA — Ethiopia Socioeconomic Survey (ESS)</w:t>
       </w:r>
-      <w:bookmarkEnd w:id="49"/>
+      <w:bookmarkEnd w:id="65"/>
     </w:p>
     <w:p>
       <w:pPr>
         <w:pStyle w:val="Heading3"/>
       </w:pPr>
-      <w:bookmarkStart w:id="50" w:name="survey-wave-key"/>
+      <w:bookmarkStart w:id="66" w:name="survey-wave-key"/>
       <w:r>
         <w:t xml:space="preserve">1. Survey &amp; wave key</w:t>
       </w:r>
-      <w:bookmarkEnd w:id="50"/>
+      <w:bookmarkEnd w:id="66"/>
     </w:p>
     <w:tbl>
       <w:tblPr>
@@ -12658,11 +12696,11 @@
       <w:pPr>
         <w:pStyle w:val="Heading3"/>
       </w:pPr>
-      <w:bookmarkStart w:id="51" w:name="tenure-indicators"/>
+      <w:bookmarkStart w:id="67" w:name="tenure-indicators"/>
       <w:r>
         <w:t xml:space="preserve">2. Tenure indicators</w:t>
       </w:r>
-      <w:bookmarkEnd w:id="51"/>
+      <w:bookmarkEnd w:id="67"/>
     </w:p>
     <w:p>
       <w:pPr>
@@ -14379,7 +14417,7 @@
       <w:pPr>
         <w:pStyle w:val="Heading3"/>
       </w:pPr>
-      <w:bookmarkStart w:id="52" w:name="parcel-area-parcel_area_ha"/>
+      <w:bookmarkStart w:id="68" w:name="parcel-area-parcel_area_ha"/>
       <w:r>
         <w:t xml:space="preserve">3. Parcel area (</w:t>
       </w:r>
@@ -14392,7 +14430,7 @@
       <w:r>
         <w:t xml:space="preserve">)</w:t>
       </w:r>
-      <w:bookmarkEnd w:id="52"/>
+      <w:bookmarkEnd w:id="68"/>
     </w:p>
     <w:p>
       <w:pPr>
@@ -15149,11 +15187,11 @@
       <w:pPr>
         <w:pStyle w:val="Heading3"/>
       </w:pPr>
-      <w:bookmarkStart w:id="53" w:name="design-variables-identifiers"/>
+      <w:bookmarkStart w:id="69" w:name="design-variables-identifiers"/>
       <w:r>
         <w:t xml:space="preserve">4. Design variables &amp; identifiers</w:t>
       </w:r>
-      <w:bookmarkEnd w:id="53"/>
+      <w:bookmarkEnd w:id="69"/>
     </w:p>
     <w:tbl>
       <w:tblPr>
@@ -16472,11 +16510,11 @@
       <w:pPr>
         <w:pStyle w:val="Heading3"/>
       </w:pPr>
-      <w:bookmarkStart w:id="54" w:name="Xd42d4af8211bb53ced3c89549c738c863b0b1f0"/>
+      <w:bookmarkStart w:id="70" w:name="Xd42d4af8211bb53ced3c89549c738c863b0b1f0"/>
       <w:r>
         <w:t xml:space="preserve">5. Value labels of key source variables (verified against the raw rosters)</w:t>
       </w:r>
-      <w:bookmarkEnd w:id="54"/>
+      <w:bookmarkEnd w:id="70"/>
     </w:p>
     <w:p>
       <w:pPr>
@@ -17611,11 +17649,11 @@
       <w:pPr>
         <w:pStyle w:val="Heading3"/>
       </w:pPr>
-      <w:bookmarkStart w:id="55" w:name="harmonization-decisions-caveats-ethiopia"/>
+      <w:bookmarkStart w:id="71" w:name="harmonization-decisions-caveats-ethiopia"/>
       <w:r>
         <w:t xml:space="preserve">6. Harmonization decisions &amp; caveats (Ethiopia)</w:t>
       </w:r>
-      <w:bookmarkEnd w:id="55"/>
+      <w:bookmarkEnd w:id="71"/>
     </w:p>
     <w:p>
       <w:pPr>
@@ -18223,11 +18261,11 @@
       <w:pPr>
         <w:pStyle w:val="Heading2"/>
       </w:pPr>
-      <w:bookmarkStart w:id="56" w:name="X58e7c7fc58aa400ad0a6aeef83d98534c48a47f"/>
+      <w:bookmarkStart w:id="72" w:name="X58e7c7fc58aa400ad0a6aeef83d98534c48a47f"/>
       <w:r>
         <w:t xml:space="preserve">MALAWI — Integrated Household Panel Survey (IHPS)</w:t>
       </w:r>
-      <w:bookmarkEnd w:id="56"/>
+      <w:bookmarkEnd w:id="72"/>
     </w:p>
     <w:p>
       <w:pPr>
@@ -18378,11 +18416,11 @@
       <w:pPr>
         <w:pStyle w:val="Heading3"/>
       </w:pPr>
-      <w:bookmarkStart w:id="57" w:name="survey-wave-key-1"/>
+      <w:bookmarkStart w:id="73" w:name="survey-wave-key-1"/>
       <w:r>
         <w:t xml:space="preserve">1. Survey &amp; wave key</w:t>
       </w:r>
-      <w:bookmarkEnd w:id="57"/>
+      <w:bookmarkEnd w:id="73"/>
     </w:p>
     <w:tbl>
       <w:tblPr>
@@ -18912,11 +18950,11 @@
       <w:pPr>
         <w:pStyle w:val="Heading3"/>
       </w:pPr>
-      <w:bookmarkStart w:id="58" w:name="tenure-indicators-1"/>
+      <w:bookmarkStart w:id="74" w:name="tenure-indicators-1"/>
       <w:r>
         <w:t xml:space="preserve">2. Tenure indicators</w:t>
       </w:r>
-      <w:bookmarkEnd w:id="58"/>
+      <w:bookmarkEnd w:id="74"/>
     </w:p>
     <w:tbl>
       <w:tblPr>
@@ -20076,7 +20114,7 @@
       <w:pPr>
         <w:pStyle w:val="Heading3"/>
       </w:pPr>
-      <w:bookmarkStart w:id="59" w:name="parcel-area-parcel_area_ha-1"/>
+      <w:bookmarkStart w:id="75" w:name="parcel-area-parcel_area_ha-1"/>
       <w:r>
         <w:t xml:space="preserve">3. Parcel area (</w:t>
       </w:r>
@@ -20089,7 +20127,7 @@
       <w:r>
         <w:t xml:space="preserve">)</w:t>
       </w:r>
-      <w:bookmarkEnd w:id="59"/>
+      <w:bookmarkEnd w:id="75"/>
     </w:p>
     <w:p>
       <w:pPr>
@@ -20208,11 +20246,11 @@
       <w:pPr>
         <w:pStyle w:val="Heading3"/>
       </w:pPr>
-      <w:bookmarkStart w:id="60" w:name="design-variables-identifiers-1"/>
+      <w:bookmarkStart w:id="76" w:name="design-variables-identifiers-1"/>
       <w:r>
         <w:t xml:space="preserve">4. Design variables &amp; identifiers</w:t>
       </w:r>
-      <w:bookmarkEnd w:id="60"/>
+      <w:bookmarkEnd w:id="76"/>
     </w:p>
     <w:tbl>
       <w:tblPr>
@@ -21036,11 +21074,11 @@
       <w:pPr>
         <w:pStyle w:val="Heading3"/>
       </w:pPr>
-      <w:bookmarkStart w:id="61" w:name="X3c195f35add181f24126d1dac89a38fd1df1287"/>
+      <w:bookmarkStart w:id="77" w:name="X3c195f35add181f24126d1dac89a38fd1df1287"/>
       <w:r>
         <w:t xml:space="preserve">5. Value labels of key source variables (verified)</w:t>
       </w:r>
-      <w:bookmarkEnd w:id="61"/>
+      <w:bookmarkEnd w:id="77"/>
     </w:p>
     <w:p>
       <w:pPr>
@@ -21967,11 +22005,11 @@
       <w:pPr>
         <w:pStyle w:val="Heading3"/>
       </w:pPr>
-      <w:bookmarkStart w:id="62" w:name="harmonization-decisions-caveats-malawi"/>
+      <w:bookmarkStart w:id="78" w:name="harmonization-decisions-caveats-malawi"/>
       <w:r>
         <w:t xml:space="preserve">6. Harmonization decisions &amp; caveats (Malawi)</w:t>
       </w:r>
-      <w:bookmarkEnd w:id="62"/>
+      <w:bookmarkEnd w:id="78"/>
     </w:p>
     <w:p>
       <w:pPr>
@@ -22395,11 +22433,11 @@
       <w:pPr>
         <w:pStyle w:val="Heading2"/>
       </w:pPr>
-      <w:bookmarkStart w:id="63" w:name="X3efb4428047162bb7c872e735728bee0a77b27e"/>
+      <w:bookmarkStart w:id="79" w:name="X3efb4428047162bb7c872e735728bee0a77b27e"/>
       <w:r>
         <w:t xml:space="preserve">MALI — Enquete Agricole de Conjoncture Integree (EACI)</w:t>
       </w:r>
-      <w:bookmarkEnd w:id="63"/>
+      <w:bookmarkEnd w:id="79"/>
     </w:p>
     <w:p>
       <w:pPr>
@@ -22508,11 +22546,11 @@
       <w:pPr>
         <w:pStyle w:val="Heading3"/>
       </w:pPr>
-      <w:bookmarkStart w:id="64" w:name="survey-wave-key-2"/>
+      <w:bookmarkStart w:id="80" w:name="survey-wave-key-2"/>
       <w:r>
         <w:t xml:space="preserve">1. Survey &amp; wave key</w:t>
       </w:r>
-      <w:bookmarkEnd w:id="64"/>
+      <w:bookmarkEnd w:id="80"/>
     </w:p>
     <w:tbl>
       <w:tblPr>
@@ -22876,11 +22914,11 @@
       <w:pPr>
         <w:pStyle w:val="Heading3"/>
       </w:pPr>
-      <w:bookmarkStart w:id="65" w:name="tenure-indicators-2"/>
+      <w:bookmarkStart w:id="81" w:name="tenure-indicators-2"/>
       <w:r>
         <w:t xml:space="preserve">2. Tenure indicators</w:t>
       </w:r>
-      <w:bookmarkEnd w:id="65"/>
+      <w:bookmarkEnd w:id="81"/>
     </w:p>
     <w:tbl>
       <w:tblPr>
@@ -23391,7 +23429,7 @@
       <w:pPr>
         <w:pStyle w:val="Heading3"/>
       </w:pPr>
-      <w:bookmarkStart w:id="66" w:name="parcel-area-parcel_area_ha-2"/>
+      <w:bookmarkStart w:id="82" w:name="parcel-area-parcel_area_ha-2"/>
       <w:r>
         <w:t xml:space="preserve">3. Parcel area (</w:t>
       </w:r>
@@ -23404,7 +23442,7 @@
       <w:r>
         <w:t xml:space="preserve">)</w:t>
       </w:r>
-      <w:bookmarkEnd w:id="66"/>
+      <w:bookmarkEnd w:id="82"/>
     </w:p>
     <w:p>
       <w:pPr>
@@ -23505,11 +23543,11 @@
       <w:pPr>
         <w:pStyle w:val="Heading3"/>
       </w:pPr>
-      <w:bookmarkStart w:id="67" w:name="design-variables-identifiers-2"/>
+      <w:bookmarkStart w:id="83" w:name="design-variables-identifiers-2"/>
       <w:r>
         <w:t xml:space="preserve">4. Design variables &amp; identifiers</w:t>
       </w:r>
-      <w:bookmarkEnd w:id="67"/>
+      <w:bookmarkEnd w:id="83"/>
     </w:p>
     <w:tbl>
       <w:tblPr>
@@ -24039,11 +24077,11 @@
       <w:pPr>
         <w:pStyle w:val="Heading3"/>
       </w:pPr>
-      <w:bookmarkStart w:id="68" w:name="Xd7b0f06d6741a457572b51c32edd9b036aaa263"/>
+      <w:bookmarkStart w:id="84" w:name="Xd7b0f06d6741a457572b51c32edd9b036aaa263"/>
       <w:r>
         <w:t xml:space="preserve">5. Value labels of key source variables (verified)</w:t>
       </w:r>
-      <w:bookmarkEnd w:id="68"/>
+      <w:bookmarkEnd w:id="84"/>
     </w:p>
     <w:p>
       <w:pPr>
@@ -24301,11 +24339,11 @@
       <w:pPr>
         <w:pStyle w:val="Heading3"/>
       </w:pPr>
-      <w:bookmarkStart w:id="69" w:name="harmonization-decisions-caveats-mali"/>
+      <w:bookmarkStart w:id="85" w:name="harmonization-decisions-caveats-mali"/>
       <w:r>
         <w:t xml:space="preserve">6. Harmonization decisions &amp; caveats (Mali)</w:t>
       </w:r>
-      <w:bookmarkEnd w:id="69"/>
+      <w:bookmarkEnd w:id="85"/>
     </w:p>
     <w:p>
       <w:pPr>
@@ -24813,11 +24851,11 @@
       <w:pPr>
         <w:pStyle w:val="Heading2"/>
       </w:pPr>
-      <w:bookmarkStart w:id="70" w:name="X14eb90961d7c4eda69428154c7d8401e18ed92a"/>
+      <w:bookmarkStart w:id="86" w:name="X14eb90961d7c4eda69428154c7d8401e18ed92a"/>
       <w:r>
         <w:t xml:space="preserve">NIGER — Enquete Nationale sur les Conditions de Vie (ECVMA)</w:t>
       </w:r>
-      <w:bookmarkEnd w:id="70"/>
+      <w:bookmarkEnd w:id="86"/>
     </w:p>
     <w:p>
       <w:pPr>
@@ -24920,11 +24958,11 @@
       <w:pPr>
         <w:pStyle w:val="Heading3"/>
       </w:pPr>
-      <w:bookmarkStart w:id="71" w:name="survey-wave-key-3"/>
+      <w:bookmarkStart w:id="87" w:name="survey-wave-key-3"/>
       <w:r>
         <w:t xml:space="preserve">1. Survey &amp; wave key</w:t>
       </w:r>
-      <w:bookmarkEnd w:id="71"/>
+      <w:bookmarkEnd w:id="87"/>
     </w:p>
     <w:tbl>
       <w:tblPr>
@@ -25312,11 +25350,11 @@
       <w:pPr>
         <w:pStyle w:val="Heading3"/>
       </w:pPr>
-      <w:bookmarkStart w:id="72" w:name="tenure-indicators-3"/>
+      <w:bookmarkStart w:id="88" w:name="tenure-indicators-3"/>
       <w:r>
         <w:t xml:space="preserve">2. Tenure indicators</w:t>
       </w:r>
-      <w:bookmarkEnd w:id="72"/>
+      <w:bookmarkEnd w:id="88"/>
     </w:p>
     <w:tbl>
       <w:tblPr>
@@ -25932,7 +25970,7 @@
       <w:pPr>
         <w:pStyle w:val="Heading3"/>
       </w:pPr>
-      <w:bookmarkStart w:id="73" w:name="parcel-area-parcel_area_ha-3"/>
+      <w:bookmarkStart w:id="89" w:name="parcel-area-parcel_area_ha-3"/>
       <w:r>
         <w:t xml:space="preserve">3. Parcel area (</w:t>
       </w:r>
@@ -25945,7 +25983,7 @@
       <w:r>
         <w:t xml:space="preserve">)</w:t>
       </w:r>
-      <w:bookmarkEnd w:id="73"/>
+      <w:bookmarkEnd w:id="89"/>
     </w:p>
     <w:p>
       <w:pPr>
@@ -26013,11 +26051,11 @@
       <w:pPr>
         <w:pStyle w:val="Heading3"/>
       </w:pPr>
-      <w:bookmarkStart w:id="74" w:name="design-variables-identifiers-3"/>
+      <w:bookmarkStart w:id="90" w:name="design-variables-identifiers-3"/>
       <w:r>
         <w:t xml:space="preserve">4. Design variables &amp; identifiers</w:t>
       </w:r>
-      <w:bookmarkEnd w:id="74"/>
+      <w:bookmarkEnd w:id="90"/>
     </w:p>
     <w:tbl>
       <w:tblPr>
@@ -26617,11 +26655,11 @@
       <w:pPr>
         <w:pStyle w:val="Heading3"/>
       </w:pPr>
-      <w:bookmarkStart w:id="75" w:name="X646e8461e11ea76f2f34efa79915905fa78ad77"/>
+      <w:bookmarkStart w:id="91" w:name="X646e8461e11ea76f2f34efa79915905fa78ad77"/>
       <w:r>
         <w:t xml:space="preserve">5. Value labels of key source variables (verified)</w:t>
       </w:r>
-      <w:bookmarkEnd w:id="75"/>
+      <w:bookmarkEnd w:id="91"/>
     </w:p>
     <w:p>
       <w:pPr>
@@ -26929,11 +26967,11 @@
       <w:pPr>
         <w:pStyle w:val="Heading3"/>
       </w:pPr>
-      <w:bookmarkStart w:id="76" w:name="harmonization-decisions-caveats-niger"/>
+      <w:bookmarkStart w:id="92" w:name="harmonization-decisions-caveats-niger"/>
       <w:r>
         <w:t xml:space="preserve">6. Harmonization decisions &amp; caveats (Niger)</w:t>
       </w:r>
-      <w:bookmarkEnd w:id="76"/>
+      <w:bookmarkEnd w:id="92"/>
     </w:p>
     <w:p>
       <w:pPr>
@@ -27264,11 +27302,11 @@
       <w:pPr>
         <w:pStyle w:val="Heading2"/>
       </w:pPr>
-      <w:bookmarkStart w:id="77" w:name="X4370d6f7e22f04e7f2986bdcf7fe062ac53545f"/>
+      <w:bookmarkStart w:id="93" w:name="X4370d6f7e22f04e7f2986bdcf7fe062ac53545f"/>
       <w:r>
         <w:t xml:space="preserve">NIGERIA — General Household Survey-Panel (GHS)</w:t>
       </w:r>
-      <w:bookmarkEnd w:id="77"/>
+      <w:bookmarkEnd w:id="93"/>
     </w:p>
     <w:p>
       <w:pPr>
@@ -27374,11 +27412,11 @@
       <w:pPr>
         <w:pStyle w:val="Heading3"/>
       </w:pPr>
-      <w:bookmarkStart w:id="78" w:name="survey-wave-key-4"/>
+      <w:bookmarkStart w:id="94" w:name="survey-wave-key-4"/>
       <w:r>
         <w:t xml:space="preserve">1. Survey &amp; wave key</w:t>
       </w:r>
-      <w:bookmarkEnd w:id="78"/>
+      <w:bookmarkEnd w:id="94"/>
     </w:p>
     <w:tbl>
       <w:tblPr>
@@ -27842,11 +27880,11 @@
       <w:pPr>
         <w:pStyle w:val="Heading3"/>
       </w:pPr>
-      <w:bookmarkStart w:id="79" w:name="tenure-indicators-4"/>
+      <w:bookmarkStart w:id="95" w:name="tenure-indicators-4"/>
       <w:r>
         <w:t xml:space="preserve">2. Tenure indicators</w:t>
       </w:r>
-      <w:bookmarkEnd w:id="79"/>
+      <w:bookmarkEnd w:id="95"/>
     </w:p>
     <w:tbl>
       <w:tblPr>
@@ -28577,7 +28615,7 @@
       <w:pPr>
         <w:pStyle w:val="Heading3"/>
       </w:pPr>
-      <w:bookmarkStart w:id="80" w:name="parcel-area-parcel_area_ha-4"/>
+      <w:bookmarkStart w:id="96" w:name="parcel-area-parcel_area_ha-4"/>
       <w:r>
         <w:t xml:space="preserve">3. Parcel area (</w:t>
       </w:r>
@@ -28590,7 +28628,7 @@
       <w:r>
         <w:t xml:space="preserve">)</w:t>
       </w:r>
-      <w:bookmarkEnd w:id="80"/>
+      <w:bookmarkEnd w:id="96"/>
     </w:p>
     <w:p>
       <w:pPr>
@@ -28844,11 +28882,11 @@
       <w:pPr>
         <w:pStyle w:val="Heading3"/>
       </w:pPr>
-      <w:bookmarkStart w:id="81" w:name="design-variables-identifiers-4"/>
+      <w:bookmarkStart w:id="97" w:name="design-variables-identifiers-4"/>
       <w:r>
         <w:t xml:space="preserve">4. Design variables &amp; identifiers</w:t>
       </w:r>
-      <w:bookmarkEnd w:id="81"/>
+      <w:bookmarkEnd w:id="97"/>
     </w:p>
     <w:tbl>
       <w:tblPr>
@@ -29323,11 +29361,11 @@
       <w:pPr>
         <w:pStyle w:val="Heading3"/>
       </w:pPr>
-      <w:bookmarkStart w:id="82" w:name="Xb4d582268a3ea5115cbf391ae4ab1d6685f948d"/>
+      <w:bookmarkStart w:id="98" w:name="Xb4d582268a3ea5115cbf391ae4ab1d6685f948d"/>
       <w:r>
         <w:t xml:space="preserve">5. Value labels of key source variables (verified for GHS10; consistent instrument)</w:t>
       </w:r>
-      <w:bookmarkEnd w:id="82"/>
+      <w:bookmarkEnd w:id="98"/>
     </w:p>
     <w:p>
       <w:pPr>
@@ -29573,11 +29611,11 @@
       <w:pPr>
         <w:pStyle w:val="Heading3"/>
       </w:pPr>
-      <w:bookmarkStart w:id="83" w:name="harmonization-decisions-caveats-nigeria"/>
+      <w:bookmarkStart w:id="99" w:name="harmonization-decisions-caveats-nigeria"/>
       <w:r>
         <w:t xml:space="preserve">6. Harmonization decisions &amp; caveats (Nigeria)</w:t>
       </w:r>
-      <w:bookmarkEnd w:id="83"/>
+      <w:bookmarkEnd w:id="99"/>
     </w:p>
     <w:p>
       <w:pPr>
@@ -29887,11 +29925,11 @@
       <w:pPr>
         <w:pStyle w:val="Heading2"/>
       </w:pPr>
-      <w:bookmarkStart w:id="84" w:name="tanzania-national-panel-survey-nps"/>
+      <w:bookmarkStart w:id="100" w:name="tanzania-national-panel-survey-nps"/>
       <w:r>
         <w:t xml:space="preserve">TANZANIA — National Panel Survey (NPS)</w:t>
       </w:r>
-      <w:bookmarkEnd w:id="84"/>
+      <w:bookmarkEnd w:id="100"/>
     </w:p>
     <w:p>
       <w:pPr>
@@ -30066,11 +30104,11 @@
       <w:pPr>
         <w:pStyle w:val="Heading3"/>
       </w:pPr>
-      <w:bookmarkStart w:id="85" w:name="survey-wave-key-5"/>
+      <w:bookmarkStart w:id="101" w:name="survey-wave-key-5"/>
       <w:r>
         <w:t xml:space="preserve">1. Survey &amp; wave key</w:t>
       </w:r>
-      <w:bookmarkEnd w:id="85"/>
+      <w:bookmarkEnd w:id="101"/>
     </w:p>
     <w:tbl>
       <w:tblPr>
@@ -30698,11 +30736,11 @@
       <w:pPr>
         <w:pStyle w:val="Heading3"/>
       </w:pPr>
-      <w:bookmarkStart w:id="86" w:name="tenure-indicators-5"/>
+      <w:bookmarkStart w:id="102" w:name="tenure-indicators-5"/>
       <w:r>
         <w:t xml:space="preserve">2. Tenure indicators</w:t>
       </w:r>
-      <w:bookmarkEnd w:id="86"/>
+      <w:bookmarkEnd w:id="102"/>
     </w:p>
     <w:tbl>
       <w:tblPr>
@@ -31396,7 +31434,7 @@
       <w:pPr>
         <w:pStyle w:val="Heading3"/>
       </w:pPr>
-      <w:bookmarkStart w:id="87" w:name="parcel-area-parcel_area_ha-5"/>
+      <w:bookmarkStart w:id="103" w:name="parcel-area-parcel_area_ha-5"/>
       <w:r>
         <w:t xml:space="preserve">3. Parcel area (</w:t>
       </w:r>
@@ -31409,7 +31447,7 @@
       <w:r>
         <w:t xml:space="preserve">)</w:t>
       </w:r>
-      <w:bookmarkEnd w:id="87"/>
+      <w:bookmarkEnd w:id="103"/>
     </w:p>
     <w:p>
       <w:pPr>
@@ -31501,11 +31539,11 @@
       <w:pPr>
         <w:pStyle w:val="Heading3"/>
       </w:pPr>
-      <w:bookmarkStart w:id="88" w:name="design-variables-identifiers-5"/>
+      <w:bookmarkStart w:id="104" w:name="design-variables-identifiers-5"/>
       <w:r>
         <w:t xml:space="preserve">4. Design variables &amp; identifiers</w:t>
       </w:r>
-      <w:bookmarkEnd w:id="88"/>
+      <w:bookmarkEnd w:id="104"/>
     </w:p>
     <w:tbl>
       <w:tblPr>
@@ -31872,11 +31910,11 @@
       <w:pPr>
         <w:pStyle w:val="Heading3"/>
       </w:pPr>
-      <w:bookmarkStart w:id="89" w:name="X8b517451fc0444510e3f71dace152c3da4f1fbf"/>
+      <w:bookmarkStart w:id="105" w:name="X8b517451fc0444510e3f71dace152c3da4f1fbf"/>
       <w:r>
         <w:t xml:space="preserve">5. Value labels of key source variables (verified)</w:t>
       </w:r>
-      <w:bookmarkEnd w:id="89"/>
+      <w:bookmarkEnd w:id="105"/>
     </w:p>
     <w:p>
       <w:pPr>
@@ -32137,11 +32175,11 @@
       <w:pPr>
         <w:pStyle w:val="Heading3"/>
       </w:pPr>
-      <w:bookmarkStart w:id="90" w:name="harmonization-decisions-caveats-tanzania"/>
+      <w:bookmarkStart w:id="106" w:name="harmonization-decisions-caveats-tanzania"/>
       <w:r>
         <w:t xml:space="preserve">6. Harmonization decisions &amp; caveats (Tanzania)</w:t>
       </w:r>
-      <w:bookmarkEnd w:id="90"/>
+      <w:bookmarkEnd w:id="106"/>
     </w:p>
     <w:p>
       <w:pPr>
@@ -32424,11 +32462,11 @@
       <w:pPr>
         <w:pStyle w:val="Heading2"/>
       </w:pPr>
-      <w:bookmarkStart w:id="91" w:name="uganda-national-panel-survey-unps"/>
+      <w:bookmarkStart w:id="107" w:name="uganda-national-panel-survey-unps"/>
       <w:r>
         <w:t xml:space="preserve">UGANDA — National Panel Survey (UNPS)</w:t>
       </w:r>
-      <w:bookmarkEnd w:id="91"/>
+      <w:bookmarkEnd w:id="107"/>
     </w:p>
     <w:p>
       <w:pPr>
@@ -32984,11 +33022,11 @@
       <w:pPr>
         <w:pStyle w:val="Heading3"/>
       </w:pPr>
-      <w:bookmarkStart w:id="92" w:name="survey-wave-key-6"/>
+      <w:bookmarkStart w:id="108" w:name="survey-wave-key-6"/>
       <w:r>
         <w:t xml:space="preserve">1. Survey &amp; wave key</w:t>
       </w:r>
-      <w:bookmarkEnd w:id="92"/>
+      <w:bookmarkEnd w:id="108"/>
     </w:p>
     <w:tbl>
       <w:tblPr>
@@ -33751,11 +33789,11 @@
       <w:pPr>
         <w:pStyle w:val="Heading3"/>
       </w:pPr>
-      <w:bookmarkStart w:id="93" w:name="tenure-indicators-6"/>
+      <w:bookmarkStart w:id="109" w:name="tenure-indicators-6"/>
       <w:r>
         <w:t xml:space="preserve">2. Tenure indicators</w:t>
       </w:r>
-      <w:bookmarkEnd w:id="93"/>
+      <w:bookmarkEnd w:id="109"/>
     </w:p>
     <w:tbl>
       <w:tblPr>
@@ -34415,7 +34453,7 @@
       <w:pPr>
         <w:pStyle w:val="Heading3"/>
       </w:pPr>
-      <w:bookmarkStart w:id="94" w:name="parcel-area-parcel_area_ha-6"/>
+      <w:bookmarkStart w:id="110" w:name="parcel-area-parcel_area_ha-6"/>
       <w:r>
         <w:t xml:space="preserve">3. Parcel area (</w:t>
       </w:r>
@@ -34428,7 +34466,7 @@
       <w:r>
         <w:t xml:space="preserve">)</w:t>
       </w:r>
-      <w:bookmarkEnd w:id="94"/>
+      <w:bookmarkEnd w:id="110"/>
     </w:p>
     <w:p>
       <w:pPr>
@@ -34571,11 +34609,11 @@
       <w:pPr>
         <w:pStyle w:val="Heading3"/>
       </w:pPr>
-      <w:bookmarkStart w:id="95" w:name="design-variables-identifiers-6"/>
+      <w:bookmarkStart w:id="111" w:name="design-variables-identifiers-6"/>
       <w:r>
         <w:t xml:space="preserve">4. Design variables &amp; identifiers</w:t>
       </w:r>
-      <w:bookmarkEnd w:id="95"/>
+      <w:bookmarkEnd w:id="111"/>
     </w:p>
     <w:tbl>
       <w:tblPr>
@@ -34950,11 +34988,11 @@
       <w:pPr>
         <w:pStyle w:val="Heading3"/>
       </w:pPr>
-      <w:bookmarkStart w:id="96" w:name="X41b3da375b96f03c8be77259d3c225da7481aa7"/>
+      <w:bookmarkStart w:id="112" w:name="X41b3da375b96f03c8be77259d3c225da7481aa7"/>
       <w:r>
         <w:t xml:space="preserve">5. Value labels of key source variables (verified against the raw rosters)</w:t>
       </w:r>
-      <w:bookmarkEnd w:id="96"/>
+      <w:bookmarkEnd w:id="112"/>
     </w:p>
     <w:p>
       <w:pPr>
@@ -35205,11 +35243,11 @@
       <w:pPr>
         <w:pStyle w:val="Heading3"/>
       </w:pPr>
-      <w:bookmarkStart w:id="97" w:name="harmonization-decisions-caveats-uganda"/>
+      <w:bookmarkStart w:id="113" w:name="harmonization-decisions-caveats-uganda"/>
       <w:r>
         <w:t xml:space="preserve">6. Harmonization decisions &amp; caveats (Uganda)</w:t>
       </w:r>
-      <w:bookmarkEnd w:id="97"/>
+      <w:bookmarkEnd w:id="113"/>
     </w:p>
     <w:p>
       <w:pPr>
@@ -35813,7 +35851,7 @@
       <w:pPr>
         <w:pStyle w:val="Heading2"/>
       </w:pPr>
-      <w:bookmarkStart w:id="98" w:name="X0b2950cf25400957611bc3f965c1c43185957b6"/>
+      <w:bookmarkStart w:id="114" w:name="X0b2950cf25400957611bc3f965c1c43185957b6"/>
       <w:r>
         <w:t xml:space="preserve">ZAMBIA — Rural Agricultural Livelihoods Survey (RALS)</w:t>
       </w:r>
@@ -35826,7 +35864,7 @@
         </w:rPr>
         <w:t xml:space="preserve">(non-LSMS-ISA)</w:t>
       </w:r>
-      <w:bookmarkEnd w:id="98"/>
+      <w:bookmarkEnd w:id="114"/>
     </w:p>
     <w:p>
       <w:pPr>
@@ -36013,11 +36051,11 @@
       <w:pPr>
         <w:pStyle w:val="Heading3"/>
       </w:pPr>
-      <w:bookmarkStart w:id="99" w:name="survey-wave-key-7"/>
+      <w:bookmarkStart w:id="115" w:name="survey-wave-key-7"/>
       <w:r>
         <w:t xml:space="preserve">1. Survey &amp; wave key</w:t>
       </w:r>
-      <w:bookmarkEnd w:id="99"/>
+      <w:bookmarkEnd w:id="115"/>
     </w:p>
     <w:tbl>
       <w:tblPr>
@@ -36558,11 +36596,11 @@
       <w:pPr>
         <w:pStyle w:val="Heading3"/>
       </w:pPr>
-      <w:bookmarkStart w:id="100" w:name="tenure-indicators-7"/>
+      <w:bookmarkStart w:id="116" w:name="tenure-indicators-7"/>
       <w:r>
         <w:t xml:space="preserve">2. Tenure indicators</w:t>
       </w:r>
-      <w:bookmarkEnd w:id="100"/>
+      <w:bookmarkEnd w:id="116"/>
     </w:p>
     <w:tbl>
       <w:tblPr>
@@ -36934,7 +36972,7 @@
       <w:pPr>
         <w:pStyle w:val="Heading3"/>
       </w:pPr>
-      <w:bookmarkStart w:id="101" w:name="parcel-area-parcel_area_ha-7"/>
+      <w:bookmarkStart w:id="117" w:name="parcel-area-parcel_area_ha-7"/>
       <w:r>
         <w:t xml:space="preserve">3. Parcel area (</w:t>
       </w:r>
@@ -36947,7 +36985,7 @@
       <w:r>
         <w:t xml:space="preserve">)</w:t>
       </w:r>
-      <w:bookmarkEnd w:id="101"/>
+      <w:bookmarkEnd w:id="117"/>
     </w:p>
     <w:p>
       <w:pPr>
@@ -37030,11 +37068,11 @@
       <w:pPr>
         <w:pStyle w:val="Heading3"/>
       </w:pPr>
-      <w:bookmarkStart w:id="102" w:name="design-variables-identifiers-7"/>
+      <w:bookmarkStart w:id="118" w:name="design-variables-identifiers-7"/>
       <w:r>
         <w:t xml:space="preserve">4. Design variables &amp; identifiers</w:t>
       </w:r>
-      <w:bookmarkEnd w:id="102"/>
+      <w:bookmarkEnd w:id="118"/>
     </w:p>
     <w:tbl>
       <w:tblPr>
@@ -37388,7 +37426,7 @@
       <w:pPr>
         <w:pStyle w:val="Heading3"/>
       </w:pPr>
-      <w:bookmarkStart w:id="103" w:name="X5ba80d23c7ef9fd2e661850521d15998b8e8ba0"/>
+      <w:bookmarkStart w:id="119" w:name="X5ba80d23c7ef9fd2e661850521d15998b8e8ba0"/>
       <w:r>
         <w:t xml:space="preserve">5.</w:t>
       </w:r>
@@ -37407,7 +37445,7 @@
       <w:r>
         <w:t xml:space="preserve">tenure status - per-wave title map (the categories expand)</w:t>
       </w:r>
-      <w:bookmarkEnd w:id="103"/>
+      <w:bookmarkEnd w:id="119"/>
     </w:p>
     <w:p>
       <w:pPr>
@@ -37770,11 +37808,11 @@
       <w:pPr>
         <w:pStyle w:val="Heading3"/>
       </w:pPr>
-      <w:bookmarkStart w:id="104" w:name="harmonization-decisions-caveats-zambia"/>
+      <w:bookmarkStart w:id="120" w:name="harmonization-decisions-caveats-zambia"/>
       <w:r>
         <w:t xml:space="preserve">6. Harmonization decisions &amp; caveats (Zambia)</w:t>
       </w:r>
-      <w:bookmarkEnd w:id="104"/>
+      <w:bookmarkEnd w:id="120"/>
     </w:p>
     <w:p>
       <w:pPr>

</xml_diff>